<commit_message>
Finished and checked Lab2Handout
</commit_message>
<xml_diff>
--- a/SC2107/LabHandout/SC2107-Lab2-Handoutv4M.docx
+++ b/SC2107/LabHandout/SC2107-Lab2-Handoutv4M.docx
@@ -99,7 +99,29 @@
           <w:u w:val="single"/>
           <w:lang w:val="en-US"/>
         </w:rPr>
-        <w:t>to be submitted to NTULearn before next lab</w:t>
+        <w:t xml:space="preserve">to be submitted to </w:t>
+      </w:r>
+      <w:proofErr w:type="spellStart"/>
+      <w:r>
+        <w:rPr>
+          <w:rFonts w:ascii="Arial" w:hAnsi="Arial" w:cs="Arial"/>
+          <w:sz w:val="20"/>
+          <w:szCs w:val="20"/>
+          <w:u w:val="single"/>
+          <w:lang w:val="en-US"/>
+        </w:rPr>
+        <w:t>NTULearn</w:t>
+      </w:r>
+      <w:proofErr w:type="spellEnd"/>
+      <w:r>
+        <w:rPr>
+          <w:rFonts w:ascii="Arial" w:hAnsi="Arial" w:cs="Arial"/>
+          <w:sz w:val="20"/>
+          <w:szCs w:val="20"/>
+          <w:u w:val="single"/>
+          <w:lang w:val="en-US"/>
+        </w:rPr>
+        <w:t xml:space="preserve"> before next lab</w:t>
       </w:r>
       <w:r>
         <w:rPr>
@@ -237,7 +259,17 @@
           <w:szCs w:val="20"/>
           <w:lang w:val="en-US"/>
         </w:rPr>
-        <w:t xml:space="preserve">  Date: </w:t>
+        <w:t xml:space="preserve">  Date</w:t>
+      </w:r>
+      <w:proofErr w:type="gramStart"/>
+      <w:r>
+        <w:rPr>
+          <w:rFonts w:ascii="Arial" w:hAnsi="Arial" w:cs="Arial"/>
+          <w:sz w:val="20"/>
+          <w:szCs w:val="20"/>
+          <w:lang w:val="en-US"/>
+        </w:rPr>
+        <w:t xml:space="preserve">: </w:t>
       </w:r>
       <w:r>
         <w:rPr>
@@ -257,8 +289,9 @@
           <w:u w:val="single"/>
           <w:lang w:val="en-US"/>
         </w:rPr>
-        <w:t>12/9/2025</w:t>
-      </w:r>
+        <w:t>12</w:t>
+      </w:r>
+      <w:proofErr w:type="gramEnd"/>
       <w:r>
         <w:rPr>
           <w:rFonts w:ascii="Arial" w:hAnsi="Arial" w:cs="Arial"/>
@@ -267,7 +300,7 @@
           <w:u w:val="single"/>
           <w:lang w:val="en-US"/>
         </w:rPr>
-        <w:tab/>
+        <w:t>/9/2025</w:t>
       </w:r>
     </w:p>
     <w:p>
@@ -425,7 +458,47 @@
           <w:szCs w:val="20"/>
           <w:lang w:val="en-US"/>
         </w:rPr>
-        <w:t>Section 6.2. Which parameter do you need to tweak in the Reflectance_Read() if the reflectance sensor reading is not accurate? Hint: check the 8 steps for Reflectance reading.</w:t>
+        <w:t xml:space="preserve">Section 6.2. Which parameter do you need to tweak in the </w:t>
+      </w:r>
+      <w:proofErr w:type="spellStart"/>
+      <w:r>
+        <w:rPr>
+          <w:rFonts w:ascii="Arial" w:hAnsi="Arial" w:cs="Arial"/>
+          <w:sz w:val="20"/>
+          <w:szCs w:val="20"/>
+          <w:lang w:val="en-US"/>
+        </w:rPr>
+        <w:t>Reflectance_</w:t>
+      </w:r>
+      <w:proofErr w:type="gramStart"/>
+      <w:r>
+        <w:rPr>
+          <w:rFonts w:ascii="Arial" w:hAnsi="Arial" w:cs="Arial"/>
+          <w:sz w:val="20"/>
+          <w:szCs w:val="20"/>
+          <w:lang w:val="en-US"/>
+        </w:rPr>
+        <w:t>Read</w:t>
+      </w:r>
+      <w:proofErr w:type="spellEnd"/>
+      <w:r>
+        <w:rPr>
+          <w:rFonts w:ascii="Arial" w:hAnsi="Arial" w:cs="Arial"/>
+          <w:sz w:val="20"/>
+          <w:szCs w:val="20"/>
+          <w:lang w:val="en-US"/>
+        </w:rPr>
+        <w:t>(</w:t>
+      </w:r>
+      <w:proofErr w:type="gramEnd"/>
+      <w:r>
+        <w:rPr>
+          <w:rFonts w:ascii="Arial" w:hAnsi="Arial" w:cs="Arial"/>
+          <w:sz w:val="20"/>
+          <w:szCs w:val="20"/>
+          <w:lang w:val="en-US"/>
+        </w:rPr>
+        <w:t>) if the reflectance sensor reading is not accurate? Hint: check the 8 steps for Reflectance reading.</w:t>
       </w:r>
     </w:p>
     <w:p>
@@ -450,7 +523,29 @@
           <w:szCs w:val="20"/>
           <w:lang w:val="en-US"/>
         </w:rPr>
-        <w:t>It’s the wait time between changing P7 to input and capturing the input data from P7. Depending on the wait time between them, it controls how much the capacitor can discharge before being recorded. The difference between a black and white surface might blur out if the wait time is too short or long.</w:t>
+        <w:t xml:space="preserve">It’s the </w:t>
+      </w:r>
+      <w:proofErr w:type="gramStart"/>
+      <w:r>
+        <w:rPr>
+          <w:rFonts w:ascii="Arial" w:hAnsi="Arial" w:cs="Arial"/>
+          <w:color w:val="FF0000"/>
+          <w:sz w:val="20"/>
+          <w:szCs w:val="20"/>
+          <w:lang w:val="en-US"/>
+        </w:rPr>
+        <w:t>wait</w:t>
+      </w:r>
+      <w:proofErr w:type="gramEnd"/>
+      <w:r>
+        <w:rPr>
+          <w:rFonts w:ascii="Arial" w:hAnsi="Arial" w:cs="Arial"/>
+          <w:color w:val="FF0000"/>
+          <w:sz w:val="20"/>
+          <w:szCs w:val="20"/>
+          <w:lang w:val="en-US"/>
+        </w:rPr>
+        <w:t xml:space="preserve"> time between changing P7 to input and capturing the input data from P7. Depending on the wait time between them, it controls how much the capacitor can discharge before being recorded. The difference between a black and white surface might blur out if the wait time is too short or long.</w:t>
       </w:r>
       <w:r>
         <w:rPr>
@@ -533,8 +628,19 @@
           <w:sz w:val="20"/>
           <w:szCs w:val="20"/>
         </w:rPr>
-        <w:t>P7-&gt;DIR &amp;= ~0x04;</w:t>
-      </w:r>
+        <w:t>P7-&gt;DIR &amp;= ~</w:t>
+      </w:r>
+      <w:proofErr w:type="gramStart"/>
+      <w:r>
+        <w:rPr>
+          <w:rFonts w:ascii="Arial" w:hAnsi="Arial" w:cs="Arial"/>
+          <w:color w:val="FF0000"/>
+          <w:sz w:val="20"/>
+          <w:szCs w:val="20"/>
+        </w:rPr>
+        <w:t>0x04;</w:t>
+      </w:r>
+      <w:proofErr w:type="gramEnd"/>
     </w:p>
     <w:p>
       <w:pPr>
@@ -556,8 +662,19 @@
           <w:sz w:val="20"/>
           <w:szCs w:val="20"/>
         </w:rPr>
-        <w:t>P7-&gt;SEL0 &amp;= ~0x04;</w:t>
-      </w:r>
+        <w:t>P7-&gt;SEL0 &amp;= ~</w:t>
+      </w:r>
+      <w:proofErr w:type="gramStart"/>
+      <w:r>
+        <w:rPr>
+          <w:rFonts w:ascii="Arial" w:hAnsi="Arial" w:cs="Arial"/>
+          <w:color w:val="FF0000"/>
+          <w:sz w:val="20"/>
+          <w:szCs w:val="20"/>
+        </w:rPr>
+        <w:t>0x04;</w:t>
+      </w:r>
+      <w:proofErr w:type="gramEnd"/>
     </w:p>
     <w:p>
       <w:pPr>
@@ -579,8 +696,19 @@
           <w:sz w:val="20"/>
           <w:szCs w:val="20"/>
         </w:rPr>
-        <w:t>P7-&gt; SEL1 &amp;= ~0x04;</w:t>
-      </w:r>
+        <w:t>P7-&gt; SEL1 &amp;= ~</w:t>
+      </w:r>
+      <w:proofErr w:type="gramStart"/>
+      <w:r>
+        <w:rPr>
+          <w:rFonts w:ascii="Arial" w:hAnsi="Arial" w:cs="Arial"/>
+          <w:color w:val="FF0000"/>
+          <w:sz w:val="20"/>
+          <w:szCs w:val="20"/>
+        </w:rPr>
+        <w:t>0x04;</w:t>
+      </w:r>
+      <w:proofErr w:type="gramEnd"/>
     </w:p>
     <w:p>
       <w:pPr>
@@ -603,8 +731,19 @@
           <w:sz w:val="20"/>
           <w:szCs w:val="20"/>
         </w:rPr>
-        <w:t>P7-&gt;REN &amp;= ~0x04;</w:t>
-      </w:r>
+        <w:t>P7-&gt;REN &amp;= ~</w:t>
+      </w:r>
+      <w:proofErr w:type="gramStart"/>
+      <w:r>
+        <w:rPr>
+          <w:rFonts w:ascii="Arial" w:hAnsi="Arial" w:cs="Arial"/>
+          <w:color w:val="FF0000"/>
+          <w:sz w:val="20"/>
+          <w:szCs w:val="20"/>
+        </w:rPr>
+        <w:t>0x04;</w:t>
+      </w:r>
+      <w:proofErr w:type="gramEnd"/>
     </w:p>
     <w:p>
       <w:pPr>
@@ -639,15 +778,27 @@
           <w:lang w:val="en-US"/>
         </w:rPr>
       </w:pPr>
-      <w:r>
-        <w:rPr>
-          <w:rFonts w:ascii="Arial" w:hAnsi="Arial" w:cs="Arial"/>
-          <w:sz w:val="20"/>
-          <w:szCs w:val="20"/>
-          <w:lang w:val="en-US"/>
-        </w:rPr>
-        <w:t xml:space="preserve">Secton 6.3. What is the value returned by the </w:t>
-      </w:r>
+      <w:proofErr w:type="spellStart"/>
+      <w:r>
+        <w:rPr>
+          <w:rFonts w:ascii="Arial" w:hAnsi="Arial" w:cs="Arial"/>
+          <w:sz w:val="20"/>
+          <w:szCs w:val="20"/>
+          <w:lang w:val="en-US"/>
+        </w:rPr>
+        <w:t>Secton</w:t>
+      </w:r>
+      <w:proofErr w:type="spellEnd"/>
+      <w:r>
+        <w:rPr>
+          <w:rFonts w:ascii="Arial" w:hAnsi="Arial" w:cs="Arial"/>
+          <w:sz w:val="20"/>
+          <w:szCs w:val="20"/>
+          <w:lang w:val="en-US"/>
+        </w:rPr>
+        <w:t xml:space="preserve"> 6.3. What is the value returned by the </w:t>
+      </w:r>
+      <w:proofErr w:type="spellStart"/>
       <w:r>
         <w:rPr>
           <w:rFonts w:ascii="Arial" w:eastAsia="Arial,Bold" w:hAnsi="Arial" w:cs="Arial"/>
@@ -655,7 +806,37 @@
           <w:szCs w:val="20"/>
           <w:lang w:eastAsia="en-SG"/>
         </w:rPr>
-        <w:t>Reflectance_Position()</w:t>
+        <w:t>Reflectance_</w:t>
+      </w:r>
+      <w:proofErr w:type="gramStart"/>
+      <w:r>
+        <w:rPr>
+          <w:rFonts w:ascii="Arial" w:eastAsia="Arial,Bold" w:hAnsi="Arial" w:cs="Arial"/>
+          <w:sz w:val="20"/>
+          <w:szCs w:val="20"/>
+          <w:lang w:eastAsia="en-SG"/>
+        </w:rPr>
+        <w:t>Position</w:t>
+      </w:r>
+      <w:proofErr w:type="spellEnd"/>
+      <w:r>
+        <w:rPr>
+          <w:rFonts w:ascii="Arial" w:eastAsia="Arial,Bold" w:hAnsi="Arial" w:cs="Arial"/>
+          <w:sz w:val="20"/>
+          <w:szCs w:val="20"/>
+          <w:lang w:eastAsia="en-SG"/>
+        </w:rPr>
+        <w:t>(</w:t>
+      </w:r>
+      <w:proofErr w:type="gramEnd"/>
+      <w:r>
+        <w:rPr>
+          <w:rFonts w:ascii="Arial" w:eastAsia="Arial,Bold" w:hAnsi="Arial" w:cs="Arial"/>
+          <w:sz w:val="20"/>
+          <w:szCs w:val="20"/>
+          <w:lang w:eastAsia="en-SG"/>
+        </w:rPr>
+        <w:t>)</w:t>
       </w:r>
       <w:r>
         <w:rPr>
@@ -726,7 +907,91 @@
           <w:szCs w:val="20"/>
           <w:lang w:val="en-US"/>
         </w:rPr>
-        <w:t xml:space="preserve">The value would be 0. As the Reflectance Position if all sensors detect black, would cancel each other out as the integers of W are signed and the value returned is also signed. Thus the corresponding sensors on each side have equal magnitude but opposite signs, which cancels each other out. </w:t>
+        <w:t xml:space="preserve">The value would be 0. </w:t>
+      </w:r>
+      <w:r>
+        <w:rPr>
+          <w:rFonts w:ascii="Arial" w:hAnsi="Arial" w:cs="Arial"/>
+          <w:color w:val="FF0000"/>
+          <w:sz w:val="20"/>
+          <w:szCs w:val="20"/>
+          <w:lang w:val="en-US"/>
+        </w:rPr>
+        <w:t>I</w:t>
+      </w:r>
+      <w:r>
+        <w:rPr>
+          <w:rFonts w:ascii="Arial" w:hAnsi="Arial" w:cs="Arial"/>
+          <w:color w:val="FF0000"/>
+          <w:sz w:val="20"/>
+          <w:szCs w:val="20"/>
+          <w:lang w:val="en-US"/>
+        </w:rPr>
+        <w:t xml:space="preserve">f all sensors detect black, would cancel each other out as the </w:t>
+      </w:r>
+      <w:r>
+        <w:rPr>
+          <w:rFonts w:ascii="Arial" w:hAnsi="Arial" w:cs="Arial"/>
+          <w:color w:val="FF0000"/>
+          <w:sz w:val="20"/>
+          <w:szCs w:val="20"/>
+          <w:lang w:val="en-US"/>
+        </w:rPr>
+        <w:t>elements</w:t>
+      </w:r>
+      <w:r>
+        <w:rPr>
+          <w:rFonts w:ascii="Arial" w:hAnsi="Arial" w:cs="Arial"/>
+          <w:color w:val="FF0000"/>
+          <w:sz w:val="20"/>
+          <w:szCs w:val="20"/>
+          <w:lang w:val="en-US"/>
+        </w:rPr>
+        <w:t xml:space="preserve"> of W are signed and the value returned is also signed. </w:t>
+      </w:r>
+      <w:proofErr w:type="gramStart"/>
+      <w:r>
+        <w:rPr>
+          <w:rFonts w:ascii="Arial" w:hAnsi="Arial" w:cs="Arial"/>
+          <w:color w:val="FF0000"/>
+          <w:sz w:val="20"/>
+          <w:szCs w:val="20"/>
+          <w:lang w:val="en-US"/>
+        </w:rPr>
+        <w:t>Thus</w:t>
+      </w:r>
+      <w:proofErr w:type="gramEnd"/>
+      <w:r>
+        <w:rPr>
+          <w:rFonts w:ascii="Arial" w:hAnsi="Arial" w:cs="Arial"/>
+          <w:color w:val="FF0000"/>
+          <w:sz w:val="20"/>
+          <w:szCs w:val="20"/>
+          <w:lang w:val="en-US"/>
+        </w:rPr>
+        <w:t xml:space="preserve"> the corresponding sensors on each side have equal magnitude but opposite signs, which </w:t>
+      </w:r>
+      <w:proofErr w:type="gramStart"/>
+      <w:r>
+        <w:rPr>
+          <w:rFonts w:ascii="Arial" w:hAnsi="Arial" w:cs="Arial"/>
+          <w:color w:val="FF0000"/>
+          <w:sz w:val="20"/>
+          <w:szCs w:val="20"/>
+          <w:lang w:val="en-US"/>
+        </w:rPr>
+        <w:t>cancels</w:t>
+      </w:r>
+      <w:proofErr w:type="gramEnd"/>
+      <w:r>
+        <w:rPr>
+          <w:rFonts w:ascii="Arial" w:hAnsi="Arial" w:cs="Arial"/>
+          <w:color w:val="FF0000"/>
+          <w:sz w:val="20"/>
+          <w:szCs w:val="20"/>
+          <w:lang w:val="en-US"/>
+        </w:rPr>
+        <w:t xml:space="preserve"> each other out. </w:t>
       </w:r>
     </w:p>
     <w:p>
@@ -813,6 +1078,7 @@
         </w:rPr>
         <w:t xml:space="preserve"> </w:t>
       </w:r>
+      <w:proofErr w:type="spellStart"/>
       <w:r>
         <w:rPr>
           <w:rFonts w:ascii="Arial" w:eastAsia="Arial,Bold" w:hAnsi="Arial" w:cs="Arial"/>
@@ -820,7 +1086,37 @@
           <w:szCs w:val="20"/>
           <w:lang w:eastAsia="en-SG"/>
         </w:rPr>
-        <w:t>Reflectance_Position()</w:t>
+        <w:t>Reflectance_</w:t>
+      </w:r>
+      <w:proofErr w:type="gramStart"/>
+      <w:r>
+        <w:rPr>
+          <w:rFonts w:ascii="Arial" w:eastAsia="Arial,Bold" w:hAnsi="Arial" w:cs="Arial"/>
+          <w:sz w:val="20"/>
+          <w:szCs w:val="20"/>
+          <w:lang w:eastAsia="en-SG"/>
+        </w:rPr>
+        <w:t>Position</w:t>
+      </w:r>
+      <w:proofErr w:type="spellEnd"/>
+      <w:r>
+        <w:rPr>
+          <w:rFonts w:ascii="Arial" w:eastAsia="Arial,Bold" w:hAnsi="Arial" w:cs="Arial"/>
+          <w:sz w:val="20"/>
+          <w:szCs w:val="20"/>
+          <w:lang w:eastAsia="en-SG"/>
+        </w:rPr>
+        <w:t>(</w:t>
+      </w:r>
+      <w:proofErr w:type="gramEnd"/>
+      <w:r>
+        <w:rPr>
+          <w:rFonts w:ascii="Arial" w:eastAsia="Arial,Bold" w:hAnsi="Arial" w:cs="Arial"/>
+          <w:sz w:val="20"/>
+          <w:szCs w:val="20"/>
+          <w:lang w:eastAsia="en-SG"/>
+        </w:rPr>
+        <w:t>)</w:t>
       </w:r>
       <w:r>
         <w:rPr>
@@ -854,7 +1150,29 @@
           <w:szCs w:val="20"/>
           <w:lang w:val="en-US"/>
         </w:rPr>
-        <w:t>Offset error come from the physical positioning or geometry of the sensor array where they are discrete spacing between detectors and line width mismatch between sensor width. Non ideal reflectivity timing as it is manually set. These cause the estimated distance to shift relative to true distance.</w:t>
+        <w:t xml:space="preserve">Offset </w:t>
+      </w:r>
+      <w:proofErr w:type="gramStart"/>
+      <w:r>
+        <w:rPr>
+          <w:rFonts w:ascii="Arial" w:hAnsi="Arial" w:cs="Arial"/>
+          <w:color w:val="FF0000"/>
+          <w:sz w:val="20"/>
+          <w:szCs w:val="20"/>
+          <w:lang w:val="en-US"/>
+        </w:rPr>
+        <w:t>error</w:t>
+      </w:r>
+      <w:proofErr w:type="gramEnd"/>
+      <w:r>
+        <w:rPr>
+          <w:rFonts w:ascii="Arial" w:hAnsi="Arial" w:cs="Arial"/>
+          <w:color w:val="FF0000"/>
+          <w:sz w:val="20"/>
+          <w:szCs w:val="20"/>
+          <w:lang w:val="en-US"/>
+        </w:rPr>
+        <w:t xml:space="preserve"> come from the physical positioning or geometry of the sensor array where they are discrete spacing between detectors and line width mismatch between sensor width. Non ideal reflectivity timing as it is manually set. These cause the estimated distance to shift relative to true distance.</w:t>
       </w:r>
     </w:p>
     <w:p>
@@ -1038,7 +1356,27 @@
           <w:sz w:val="20"/>
           <w:szCs w:val="20"/>
         </w:rPr>
-        <w:t>The motor inputs will be pulsing between center and left output from the sensors. The right wheel will toggle between slower or same as the left wheel as the FSM would constantly toggle between trying to turn right and not turning.</w:t>
+        <w:t xml:space="preserve">The motor inputs will be pulsing between </w:t>
+      </w:r>
+      <w:proofErr w:type="spellStart"/>
+      <w:r>
+        <w:rPr>
+          <w:rFonts w:ascii="Arial" w:hAnsi="Arial" w:cs="Arial"/>
+          <w:color w:val="FF0000"/>
+          <w:sz w:val="20"/>
+          <w:szCs w:val="20"/>
+        </w:rPr>
+        <w:t>center</w:t>
+      </w:r>
+      <w:proofErr w:type="spellEnd"/>
+      <w:r>
+        <w:rPr>
+          <w:rFonts w:ascii="Arial" w:hAnsi="Arial" w:cs="Arial"/>
+          <w:color w:val="FF0000"/>
+          <w:sz w:val="20"/>
+          <w:szCs w:val="20"/>
+        </w:rPr>
+        <w:t xml:space="preserve"> and left output from the sensors. The right wheel will toggle between slower or same as the left wheel as the FSM would constantly toggle between trying to turn right and not turning.</w:t>
       </w:r>
     </w:p>
     <w:p>
@@ -1232,6 +1570,7 @@
           <w:lang w:eastAsia="zh-CN"/>
         </w:rPr>
       </w:pPr>
+      <w:proofErr w:type="spellStart"/>
       <w:r>
         <w:rPr>
           <w:rFonts w:ascii="Consolas" w:eastAsia="Times New Roman" w:hAnsi="Consolas" w:cs="Times New Roman"/>
@@ -1242,6 +1581,7 @@
         </w:rPr>
         <w:t>State_t</w:t>
       </w:r>
+      <w:proofErr w:type="spellEnd"/>
       <w:r>
         <w:rPr>
           <w:rFonts w:ascii="Consolas" w:eastAsia="Times New Roman" w:hAnsi="Consolas" w:cs="Times New Roman"/>
@@ -1252,6 +1592,8 @@
         </w:rPr>
         <w:t xml:space="preserve"> </w:t>
       </w:r>
+      <w:proofErr w:type="spellStart"/>
+      <w:proofErr w:type="gramStart"/>
       <w:r>
         <w:rPr>
           <w:rFonts w:ascii="Consolas" w:eastAsia="Times New Roman" w:hAnsi="Consolas" w:cs="Times New Roman"/>
@@ -1262,6 +1604,7 @@
         </w:rPr>
         <w:t>fsm</w:t>
       </w:r>
+      <w:proofErr w:type="spellEnd"/>
       <w:r>
         <w:rPr>
           <w:rFonts w:ascii="Consolas" w:eastAsia="Times New Roman" w:hAnsi="Consolas" w:cs="Times New Roman"/>
@@ -1290,7 +1633,18 @@
           <w:szCs w:val="16"/>
           <w:lang w:eastAsia="zh-CN"/>
         </w:rPr>
-        <w:t>]={</w:t>
+        <w:t>]=</w:t>
+      </w:r>
+      <w:proofErr w:type="gramEnd"/>
+      <w:r>
+        <w:rPr>
+          <w:rFonts w:ascii="Consolas" w:eastAsia="Times New Roman" w:hAnsi="Consolas" w:cs="Times New Roman"/>
+          <w:color w:val="D4D4D4"/>
+          <w:sz w:val="16"/>
+          <w:szCs w:val="16"/>
+          <w:lang w:eastAsia="zh-CN"/>
+        </w:rPr>
+        <w:t>{</w:t>
       </w:r>
     </w:p>
     <w:p>
@@ -1328,7 +1682,18 @@
           <w:szCs w:val="16"/>
           <w:lang w:eastAsia="zh-CN"/>
         </w:rPr>
-        <w:t>0x03</w:t>
+        <w:t>0x</w:t>
+      </w:r>
+      <w:proofErr w:type="gramStart"/>
+      <w:r>
+        <w:rPr>
+          <w:rFonts w:ascii="Consolas" w:eastAsia="Times New Roman" w:hAnsi="Consolas" w:cs="Times New Roman"/>
+          <w:color w:val="B5CEA8"/>
+          <w:sz w:val="16"/>
+          <w:szCs w:val="16"/>
+          <w:lang w:eastAsia="zh-CN"/>
+        </w:rPr>
+        <w:t>03</w:t>
       </w:r>
       <w:r>
         <w:rPr>
@@ -1350,15 +1715,126 @@
         </w:rPr>
         <w:t>500</w:t>
       </w:r>
-      <w:r>
-        <w:rPr>
-          <w:rFonts w:ascii="Consolas" w:eastAsia="Times New Roman" w:hAnsi="Consolas" w:cs="Times New Roman"/>
-          <w:color w:val="D4D4D4"/>
-          <w:sz w:val="16"/>
-          <w:szCs w:val="16"/>
-          <w:lang w:eastAsia="zh-CN"/>
-        </w:rPr>
-        <w:t>, { Right1,         Left1,      Right1,     Center    }},</w:t>
+      <w:proofErr w:type="gramEnd"/>
+      <w:r>
+        <w:rPr>
+          <w:rFonts w:ascii="Consolas" w:eastAsia="Times New Roman" w:hAnsi="Consolas" w:cs="Times New Roman"/>
+          <w:color w:val="D4D4D4"/>
+          <w:sz w:val="16"/>
+          <w:szCs w:val="16"/>
+          <w:lang w:eastAsia="zh-CN"/>
+        </w:rPr>
+        <w:t xml:space="preserve">, </w:t>
+      </w:r>
+      <w:proofErr w:type="gramStart"/>
+      <w:r>
+        <w:rPr>
+          <w:rFonts w:ascii="Consolas" w:eastAsia="Times New Roman" w:hAnsi="Consolas" w:cs="Times New Roman"/>
+          <w:color w:val="D4D4D4"/>
+          <w:sz w:val="16"/>
+          <w:szCs w:val="16"/>
+          <w:lang w:eastAsia="zh-CN"/>
+        </w:rPr>
+        <w:t xml:space="preserve">{ Right1,   </w:t>
+      </w:r>
+      <w:proofErr w:type="gramEnd"/>
+      <w:r>
+        <w:rPr>
+          <w:rFonts w:ascii="Consolas" w:eastAsia="Times New Roman" w:hAnsi="Consolas" w:cs="Times New Roman"/>
+          <w:color w:val="D4D4D4"/>
+          <w:sz w:val="16"/>
+          <w:szCs w:val="16"/>
+          <w:lang w:eastAsia="zh-CN"/>
+        </w:rPr>
+        <w:t>      Left</w:t>
+      </w:r>
+      <w:proofErr w:type="gramStart"/>
+      <w:r>
+        <w:rPr>
+          <w:rFonts w:ascii="Consolas" w:eastAsia="Times New Roman" w:hAnsi="Consolas" w:cs="Times New Roman"/>
+          <w:color w:val="D4D4D4"/>
+          <w:sz w:val="16"/>
+          <w:szCs w:val="16"/>
+          <w:lang w:eastAsia="zh-CN"/>
+        </w:rPr>
+        <w:t xml:space="preserve">1,   </w:t>
+      </w:r>
+      <w:proofErr w:type="gramEnd"/>
+      <w:r>
+        <w:rPr>
+          <w:rFonts w:ascii="Consolas" w:eastAsia="Times New Roman" w:hAnsi="Consolas" w:cs="Times New Roman"/>
+          <w:color w:val="D4D4D4"/>
+          <w:sz w:val="16"/>
+          <w:szCs w:val="16"/>
+          <w:lang w:eastAsia="zh-CN"/>
+        </w:rPr>
+        <w:t>   Right</w:t>
+      </w:r>
+      <w:proofErr w:type="gramStart"/>
+      <w:r>
+        <w:rPr>
+          <w:rFonts w:ascii="Consolas" w:eastAsia="Times New Roman" w:hAnsi="Consolas" w:cs="Times New Roman"/>
+          <w:color w:val="D4D4D4"/>
+          <w:sz w:val="16"/>
+          <w:szCs w:val="16"/>
+          <w:lang w:eastAsia="zh-CN"/>
+        </w:rPr>
+        <w:t xml:space="preserve">1,   </w:t>
+      </w:r>
+      <w:proofErr w:type="gramEnd"/>
+      <w:r>
+        <w:rPr>
+          <w:rFonts w:ascii="Consolas" w:eastAsia="Times New Roman" w:hAnsi="Consolas" w:cs="Times New Roman"/>
+          <w:color w:val="D4D4D4"/>
+          <w:sz w:val="16"/>
+          <w:szCs w:val="16"/>
+          <w:lang w:eastAsia="zh-CN"/>
+        </w:rPr>
+        <w:t xml:space="preserve">  </w:t>
+      </w:r>
+      <w:proofErr w:type="spellStart"/>
+      <w:r>
+        <w:rPr>
+          <w:rFonts w:ascii="Consolas" w:eastAsia="Times New Roman" w:hAnsi="Consolas" w:cs="Times New Roman"/>
+          <w:color w:val="D4D4D4"/>
+          <w:sz w:val="16"/>
+          <w:szCs w:val="16"/>
+          <w:lang w:eastAsia="zh-CN"/>
+        </w:rPr>
+        <w:t>Center</w:t>
+      </w:r>
+      <w:proofErr w:type="spellEnd"/>
+      <w:r>
+        <w:rPr>
+          <w:rFonts w:ascii="Consolas" w:eastAsia="Times New Roman" w:hAnsi="Consolas" w:cs="Times New Roman"/>
+          <w:color w:val="D4D4D4"/>
+          <w:sz w:val="16"/>
+          <w:szCs w:val="16"/>
+          <w:lang w:eastAsia="zh-CN"/>
+        </w:rPr>
+        <w:t xml:space="preserve">  </w:t>
+      </w:r>
+      <w:proofErr w:type="gramStart"/>
+      <w:r>
+        <w:rPr>
+          <w:rFonts w:ascii="Consolas" w:eastAsia="Times New Roman" w:hAnsi="Consolas" w:cs="Times New Roman"/>
+          <w:color w:val="D4D4D4"/>
+          <w:sz w:val="16"/>
+          <w:szCs w:val="16"/>
+          <w:lang w:eastAsia="zh-CN"/>
+        </w:rPr>
+        <w:t xml:space="preserve">  }</w:t>
+      </w:r>
+      <w:proofErr w:type="gramEnd"/>
+      <w:r>
+        <w:rPr>
+          <w:rFonts w:ascii="Consolas" w:eastAsia="Times New Roman" w:hAnsi="Consolas" w:cs="Times New Roman"/>
+          <w:color w:val="D4D4D4"/>
+          <w:sz w:val="16"/>
+          <w:szCs w:val="16"/>
+          <w:lang w:eastAsia="zh-CN"/>
+        </w:rPr>
+        <w:t>},</w:t>
       </w:r>
       <w:r>
         <w:rPr>
@@ -1368,8 +1844,20 @@
           <w:szCs w:val="16"/>
           <w:lang w:eastAsia="zh-CN"/>
         </w:rPr>
-        <w:t xml:space="preserve">   // Center</w:t>
-      </w:r>
+        <w:t xml:space="preserve">   // </w:t>
+      </w:r>
+      <w:proofErr w:type="spellStart"/>
+      <w:r>
+        <w:rPr>
+          <w:rFonts w:ascii="Consolas" w:eastAsia="Times New Roman" w:hAnsi="Consolas" w:cs="Times New Roman"/>
+          <w:color w:val="6A9955"/>
+          <w:sz w:val="16"/>
+          <w:szCs w:val="16"/>
+          <w:lang w:eastAsia="zh-CN"/>
+        </w:rPr>
+        <w:t>Center</w:t>
+      </w:r>
+      <w:proofErr w:type="spellEnd"/>
     </w:p>
     <w:p>
       <w:pPr>
@@ -1406,7 +1894,18 @@
           <w:szCs w:val="16"/>
           <w:lang w:eastAsia="zh-CN"/>
         </w:rPr>
-        <w:t>0x02</w:t>
+        <w:t>0x</w:t>
+      </w:r>
+      <w:proofErr w:type="gramStart"/>
+      <w:r>
+        <w:rPr>
+          <w:rFonts w:ascii="Consolas" w:eastAsia="Times New Roman" w:hAnsi="Consolas" w:cs="Times New Roman"/>
+          <w:color w:val="B5CEA8"/>
+          <w:sz w:val="16"/>
+          <w:szCs w:val="16"/>
+          <w:lang w:eastAsia="zh-CN"/>
+        </w:rPr>
+        <w:t>02</w:t>
       </w:r>
       <w:r>
         <w:rPr>
@@ -1428,15 +1927,148 @@
         </w:rPr>
         <w:t>500</w:t>
       </w:r>
-      <w:r>
-        <w:rPr>
-          <w:rFonts w:ascii="Consolas" w:eastAsia="Times New Roman" w:hAnsi="Consolas" w:cs="Times New Roman"/>
-          <w:color w:val="D4D4D4"/>
-          <w:sz w:val="16"/>
-          <w:szCs w:val="16"/>
-          <w:lang w:eastAsia="zh-CN"/>
-        </w:rPr>
-        <w:t>, { Left_off1,      Left2,      Right1,     Center    }},</w:t>
+      <w:proofErr w:type="gramEnd"/>
+      <w:r>
+        <w:rPr>
+          <w:rFonts w:ascii="Consolas" w:eastAsia="Times New Roman" w:hAnsi="Consolas" w:cs="Times New Roman"/>
+          <w:color w:val="D4D4D4"/>
+          <w:sz w:val="16"/>
+          <w:szCs w:val="16"/>
+          <w:lang w:eastAsia="zh-CN"/>
+        </w:rPr>
+        <w:t xml:space="preserve">, </w:t>
+      </w:r>
+      <w:proofErr w:type="gramStart"/>
+      <w:r>
+        <w:rPr>
+          <w:rFonts w:ascii="Consolas" w:eastAsia="Times New Roman" w:hAnsi="Consolas" w:cs="Times New Roman"/>
+          <w:color w:val="D4D4D4"/>
+          <w:sz w:val="16"/>
+          <w:szCs w:val="16"/>
+          <w:lang w:eastAsia="zh-CN"/>
+        </w:rPr>
+        <w:t>{ Left</w:t>
+      </w:r>
+      <w:proofErr w:type="gramEnd"/>
+      <w:r>
+        <w:rPr>
+          <w:rFonts w:ascii="Consolas" w:eastAsia="Times New Roman" w:hAnsi="Consolas" w:cs="Times New Roman"/>
+          <w:color w:val="D4D4D4"/>
+          <w:sz w:val="16"/>
+          <w:szCs w:val="16"/>
+          <w:lang w:eastAsia="zh-CN"/>
+        </w:rPr>
+        <w:t>_off</w:t>
+      </w:r>
+      <w:proofErr w:type="gramStart"/>
+      <w:r>
+        <w:rPr>
+          <w:rFonts w:ascii="Consolas" w:eastAsia="Times New Roman" w:hAnsi="Consolas" w:cs="Times New Roman"/>
+          <w:color w:val="D4D4D4"/>
+          <w:sz w:val="16"/>
+          <w:szCs w:val="16"/>
+          <w:lang w:eastAsia="zh-CN"/>
+        </w:rPr>
+        <w:t xml:space="preserve">1,   </w:t>
+      </w:r>
+      <w:proofErr w:type="gramEnd"/>
+      <w:r>
+        <w:rPr>
+          <w:rFonts w:ascii="Consolas" w:eastAsia="Times New Roman" w:hAnsi="Consolas" w:cs="Times New Roman"/>
+          <w:color w:val="D4D4D4"/>
+          <w:sz w:val="16"/>
+          <w:szCs w:val="16"/>
+          <w:lang w:eastAsia="zh-CN"/>
+        </w:rPr>
+        <w:t>   Left</w:t>
+      </w:r>
+      <w:proofErr w:type="gramStart"/>
+      <w:r>
+        <w:rPr>
+          <w:rFonts w:ascii="Consolas" w:eastAsia="Times New Roman" w:hAnsi="Consolas" w:cs="Times New Roman"/>
+          <w:color w:val="D4D4D4"/>
+          <w:sz w:val="16"/>
+          <w:szCs w:val="16"/>
+          <w:lang w:eastAsia="zh-CN"/>
+        </w:rPr>
+        <w:t xml:space="preserve">2,   </w:t>
+      </w:r>
+      <w:proofErr w:type="gramEnd"/>
+      <w:r>
+        <w:rPr>
+          <w:rFonts w:ascii="Consolas" w:eastAsia="Times New Roman" w:hAnsi="Consolas" w:cs="Times New Roman"/>
+          <w:color w:val="D4D4D4"/>
+          <w:sz w:val="16"/>
+          <w:szCs w:val="16"/>
+          <w:lang w:eastAsia="zh-CN"/>
+        </w:rPr>
+        <w:t>   Right</w:t>
+      </w:r>
+      <w:proofErr w:type="gramStart"/>
+      <w:r>
+        <w:rPr>
+          <w:rFonts w:ascii="Consolas" w:eastAsia="Times New Roman" w:hAnsi="Consolas" w:cs="Times New Roman"/>
+          <w:color w:val="D4D4D4"/>
+          <w:sz w:val="16"/>
+          <w:szCs w:val="16"/>
+          <w:lang w:eastAsia="zh-CN"/>
+        </w:rPr>
+        <w:t xml:space="preserve">1,   </w:t>
+      </w:r>
+      <w:proofErr w:type="gramEnd"/>
+      <w:r>
+        <w:rPr>
+          <w:rFonts w:ascii="Consolas" w:eastAsia="Times New Roman" w:hAnsi="Consolas" w:cs="Times New Roman"/>
+          <w:color w:val="D4D4D4"/>
+          <w:sz w:val="16"/>
+          <w:szCs w:val="16"/>
+          <w:lang w:eastAsia="zh-CN"/>
+        </w:rPr>
+        <w:t xml:space="preserve">  </w:t>
+      </w:r>
+      <w:proofErr w:type="spellStart"/>
+      <w:r>
+        <w:rPr>
+          <w:rFonts w:ascii="Consolas" w:eastAsia="Times New Roman" w:hAnsi="Consolas" w:cs="Times New Roman"/>
+          <w:color w:val="D4D4D4"/>
+          <w:sz w:val="16"/>
+          <w:szCs w:val="16"/>
+          <w:lang w:eastAsia="zh-CN"/>
+        </w:rPr>
+        <w:t>Center</w:t>
+      </w:r>
+      <w:proofErr w:type="spellEnd"/>
+      <w:r>
+        <w:rPr>
+          <w:rFonts w:ascii="Consolas" w:eastAsia="Times New Roman" w:hAnsi="Consolas" w:cs="Times New Roman"/>
+          <w:color w:val="D4D4D4"/>
+          <w:sz w:val="16"/>
+          <w:szCs w:val="16"/>
+          <w:lang w:eastAsia="zh-CN"/>
+        </w:rPr>
+        <w:t xml:space="preserve">  </w:t>
+      </w:r>
+      <w:proofErr w:type="gramStart"/>
+      <w:r>
+        <w:rPr>
+          <w:rFonts w:ascii="Consolas" w:eastAsia="Times New Roman" w:hAnsi="Consolas" w:cs="Times New Roman"/>
+          <w:color w:val="D4D4D4"/>
+          <w:sz w:val="16"/>
+          <w:szCs w:val="16"/>
+          <w:lang w:eastAsia="zh-CN"/>
+        </w:rPr>
+        <w:t xml:space="preserve">  }</w:t>
+      </w:r>
+      <w:proofErr w:type="gramEnd"/>
+      <w:r>
+        <w:rPr>
+          <w:rFonts w:ascii="Consolas" w:eastAsia="Times New Roman" w:hAnsi="Consolas" w:cs="Times New Roman"/>
+          <w:color w:val="D4D4D4"/>
+          <w:sz w:val="16"/>
+          <w:szCs w:val="16"/>
+          <w:lang w:eastAsia="zh-CN"/>
+        </w:rPr>
+        <w:t>},</w:t>
       </w:r>
       <w:r>
         <w:rPr>
@@ -1484,7 +2116,18 @@
           <w:szCs w:val="16"/>
           <w:lang w:eastAsia="zh-CN"/>
         </w:rPr>
-        <w:t>0x03</w:t>
+        <w:t>0x</w:t>
+      </w:r>
+      <w:proofErr w:type="gramStart"/>
+      <w:r>
+        <w:rPr>
+          <w:rFonts w:ascii="Consolas" w:eastAsia="Times New Roman" w:hAnsi="Consolas" w:cs="Times New Roman"/>
+          <w:color w:val="B5CEA8"/>
+          <w:sz w:val="16"/>
+          <w:szCs w:val="16"/>
+          <w:lang w:eastAsia="zh-CN"/>
+        </w:rPr>
+        <w:t>03</w:t>
       </w:r>
       <w:r>
         <w:rPr>
@@ -1506,15 +2149,148 @@
         </w:rPr>
         <w:t>500</w:t>
       </w:r>
-      <w:r>
-        <w:rPr>
-          <w:rFonts w:ascii="Consolas" w:eastAsia="Times New Roman" w:hAnsi="Consolas" w:cs="Times New Roman"/>
-          <w:color w:val="D4D4D4"/>
-          <w:sz w:val="16"/>
-          <w:szCs w:val="16"/>
-          <w:lang w:eastAsia="zh-CN"/>
-        </w:rPr>
-        <w:t>, { Left_off1,      Left1,      Right1,     Center    }},</w:t>
+      <w:proofErr w:type="gramEnd"/>
+      <w:r>
+        <w:rPr>
+          <w:rFonts w:ascii="Consolas" w:eastAsia="Times New Roman" w:hAnsi="Consolas" w:cs="Times New Roman"/>
+          <w:color w:val="D4D4D4"/>
+          <w:sz w:val="16"/>
+          <w:szCs w:val="16"/>
+          <w:lang w:eastAsia="zh-CN"/>
+        </w:rPr>
+        <w:t xml:space="preserve">, </w:t>
+      </w:r>
+      <w:proofErr w:type="gramStart"/>
+      <w:r>
+        <w:rPr>
+          <w:rFonts w:ascii="Consolas" w:eastAsia="Times New Roman" w:hAnsi="Consolas" w:cs="Times New Roman"/>
+          <w:color w:val="D4D4D4"/>
+          <w:sz w:val="16"/>
+          <w:szCs w:val="16"/>
+          <w:lang w:eastAsia="zh-CN"/>
+        </w:rPr>
+        <w:t>{ Left</w:t>
+      </w:r>
+      <w:proofErr w:type="gramEnd"/>
+      <w:r>
+        <w:rPr>
+          <w:rFonts w:ascii="Consolas" w:eastAsia="Times New Roman" w:hAnsi="Consolas" w:cs="Times New Roman"/>
+          <w:color w:val="D4D4D4"/>
+          <w:sz w:val="16"/>
+          <w:szCs w:val="16"/>
+          <w:lang w:eastAsia="zh-CN"/>
+        </w:rPr>
+        <w:t>_off</w:t>
+      </w:r>
+      <w:proofErr w:type="gramStart"/>
+      <w:r>
+        <w:rPr>
+          <w:rFonts w:ascii="Consolas" w:eastAsia="Times New Roman" w:hAnsi="Consolas" w:cs="Times New Roman"/>
+          <w:color w:val="D4D4D4"/>
+          <w:sz w:val="16"/>
+          <w:szCs w:val="16"/>
+          <w:lang w:eastAsia="zh-CN"/>
+        </w:rPr>
+        <w:t xml:space="preserve">1,   </w:t>
+      </w:r>
+      <w:proofErr w:type="gramEnd"/>
+      <w:r>
+        <w:rPr>
+          <w:rFonts w:ascii="Consolas" w:eastAsia="Times New Roman" w:hAnsi="Consolas" w:cs="Times New Roman"/>
+          <w:color w:val="D4D4D4"/>
+          <w:sz w:val="16"/>
+          <w:szCs w:val="16"/>
+          <w:lang w:eastAsia="zh-CN"/>
+        </w:rPr>
+        <w:t>   Left</w:t>
+      </w:r>
+      <w:proofErr w:type="gramStart"/>
+      <w:r>
+        <w:rPr>
+          <w:rFonts w:ascii="Consolas" w:eastAsia="Times New Roman" w:hAnsi="Consolas" w:cs="Times New Roman"/>
+          <w:color w:val="D4D4D4"/>
+          <w:sz w:val="16"/>
+          <w:szCs w:val="16"/>
+          <w:lang w:eastAsia="zh-CN"/>
+        </w:rPr>
+        <w:t xml:space="preserve">1,   </w:t>
+      </w:r>
+      <w:proofErr w:type="gramEnd"/>
+      <w:r>
+        <w:rPr>
+          <w:rFonts w:ascii="Consolas" w:eastAsia="Times New Roman" w:hAnsi="Consolas" w:cs="Times New Roman"/>
+          <w:color w:val="D4D4D4"/>
+          <w:sz w:val="16"/>
+          <w:szCs w:val="16"/>
+          <w:lang w:eastAsia="zh-CN"/>
+        </w:rPr>
+        <w:t>   Right</w:t>
+      </w:r>
+      <w:proofErr w:type="gramStart"/>
+      <w:r>
+        <w:rPr>
+          <w:rFonts w:ascii="Consolas" w:eastAsia="Times New Roman" w:hAnsi="Consolas" w:cs="Times New Roman"/>
+          <w:color w:val="D4D4D4"/>
+          <w:sz w:val="16"/>
+          <w:szCs w:val="16"/>
+          <w:lang w:eastAsia="zh-CN"/>
+        </w:rPr>
+        <w:t xml:space="preserve">1,   </w:t>
+      </w:r>
+      <w:proofErr w:type="gramEnd"/>
+      <w:r>
+        <w:rPr>
+          <w:rFonts w:ascii="Consolas" w:eastAsia="Times New Roman" w:hAnsi="Consolas" w:cs="Times New Roman"/>
+          <w:color w:val="D4D4D4"/>
+          <w:sz w:val="16"/>
+          <w:szCs w:val="16"/>
+          <w:lang w:eastAsia="zh-CN"/>
+        </w:rPr>
+        <w:t xml:space="preserve">  </w:t>
+      </w:r>
+      <w:proofErr w:type="spellStart"/>
+      <w:r>
+        <w:rPr>
+          <w:rFonts w:ascii="Consolas" w:eastAsia="Times New Roman" w:hAnsi="Consolas" w:cs="Times New Roman"/>
+          <w:color w:val="D4D4D4"/>
+          <w:sz w:val="16"/>
+          <w:szCs w:val="16"/>
+          <w:lang w:eastAsia="zh-CN"/>
+        </w:rPr>
+        <w:t>Center</w:t>
+      </w:r>
+      <w:proofErr w:type="spellEnd"/>
+      <w:r>
+        <w:rPr>
+          <w:rFonts w:ascii="Consolas" w:eastAsia="Times New Roman" w:hAnsi="Consolas" w:cs="Times New Roman"/>
+          <w:color w:val="D4D4D4"/>
+          <w:sz w:val="16"/>
+          <w:szCs w:val="16"/>
+          <w:lang w:eastAsia="zh-CN"/>
+        </w:rPr>
+        <w:t xml:space="preserve">  </w:t>
+      </w:r>
+      <w:proofErr w:type="gramStart"/>
+      <w:r>
+        <w:rPr>
+          <w:rFonts w:ascii="Consolas" w:eastAsia="Times New Roman" w:hAnsi="Consolas" w:cs="Times New Roman"/>
+          <w:color w:val="D4D4D4"/>
+          <w:sz w:val="16"/>
+          <w:szCs w:val="16"/>
+          <w:lang w:eastAsia="zh-CN"/>
+        </w:rPr>
+        <w:t xml:space="preserve">  }</w:t>
+      </w:r>
+      <w:proofErr w:type="gramEnd"/>
+      <w:r>
+        <w:rPr>
+          <w:rFonts w:ascii="Consolas" w:eastAsia="Times New Roman" w:hAnsi="Consolas" w:cs="Times New Roman"/>
+          <w:color w:val="D4D4D4"/>
+          <w:sz w:val="16"/>
+          <w:szCs w:val="16"/>
+          <w:lang w:eastAsia="zh-CN"/>
+        </w:rPr>
+        <w:t>},</w:t>
       </w:r>
       <w:r>
         <w:rPr>
@@ -1592,7 +2368,139 @@
           <w:szCs w:val="16"/>
           <w:lang w:eastAsia="zh-CN"/>
         </w:rPr>
-        <w:t>, { Left_off2,      Left_off2,  Left_off2,  Left_off2 }},</w:t>
+        <w:t xml:space="preserve">, </w:t>
+      </w:r>
+      <w:proofErr w:type="gramStart"/>
+      <w:r>
+        <w:rPr>
+          <w:rFonts w:ascii="Consolas" w:eastAsia="Times New Roman" w:hAnsi="Consolas" w:cs="Times New Roman"/>
+          <w:color w:val="D4D4D4"/>
+          <w:sz w:val="16"/>
+          <w:szCs w:val="16"/>
+          <w:lang w:eastAsia="zh-CN"/>
+        </w:rPr>
+        <w:t>{ Left</w:t>
+      </w:r>
+      <w:proofErr w:type="gramEnd"/>
+      <w:r>
+        <w:rPr>
+          <w:rFonts w:ascii="Consolas" w:eastAsia="Times New Roman" w:hAnsi="Consolas" w:cs="Times New Roman"/>
+          <w:color w:val="D4D4D4"/>
+          <w:sz w:val="16"/>
+          <w:szCs w:val="16"/>
+          <w:lang w:eastAsia="zh-CN"/>
+        </w:rPr>
+        <w:t>_off</w:t>
+      </w:r>
+      <w:proofErr w:type="gramStart"/>
+      <w:r>
+        <w:rPr>
+          <w:rFonts w:ascii="Consolas" w:eastAsia="Times New Roman" w:hAnsi="Consolas" w:cs="Times New Roman"/>
+          <w:color w:val="D4D4D4"/>
+          <w:sz w:val="16"/>
+          <w:szCs w:val="16"/>
+          <w:lang w:eastAsia="zh-CN"/>
+        </w:rPr>
+        <w:t xml:space="preserve">2,   </w:t>
+      </w:r>
+      <w:proofErr w:type="gramEnd"/>
+      <w:r>
+        <w:rPr>
+          <w:rFonts w:ascii="Consolas" w:eastAsia="Times New Roman" w:hAnsi="Consolas" w:cs="Times New Roman"/>
+          <w:color w:val="D4D4D4"/>
+          <w:sz w:val="16"/>
+          <w:szCs w:val="16"/>
+          <w:lang w:eastAsia="zh-CN"/>
+        </w:rPr>
+        <w:t>   </w:t>
+      </w:r>
+      <w:proofErr w:type="gramStart"/>
+      <w:r>
+        <w:rPr>
+          <w:rFonts w:ascii="Consolas" w:eastAsia="Times New Roman" w:hAnsi="Consolas" w:cs="Times New Roman"/>
+          <w:color w:val="D4D4D4"/>
+          <w:sz w:val="16"/>
+          <w:szCs w:val="16"/>
+          <w:lang w:eastAsia="zh-CN"/>
+        </w:rPr>
+        <w:t>Left</w:t>
+      </w:r>
+      <w:proofErr w:type="gramEnd"/>
+      <w:r>
+        <w:rPr>
+          <w:rFonts w:ascii="Consolas" w:eastAsia="Times New Roman" w:hAnsi="Consolas" w:cs="Times New Roman"/>
+          <w:color w:val="D4D4D4"/>
+          <w:sz w:val="16"/>
+          <w:szCs w:val="16"/>
+          <w:lang w:eastAsia="zh-CN"/>
+        </w:rPr>
+        <w:t>_off</w:t>
+      </w:r>
+      <w:proofErr w:type="gramStart"/>
+      <w:r>
+        <w:rPr>
+          <w:rFonts w:ascii="Consolas" w:eastAsia="Times New Roman" w:hAnsi="Consolas" w:cs="Times New Roman"/>
+          <w:color w:val="D4D4D4"/>
+          <w:sz w:val="16"/>
+          <w:szCs w:val="16"/>
+          <w:lang w:eastAsia="zh-CN"/>
+        </w:rPr>
+        <w:t>2,  Left</w:t>
+      </w:r>
+      <w:proofErr w:type="gramEnd"/>
+      <w:r>
+        <w:rPr>
+          <w:rFonts w:ascii="Consolas" w:eastAsia="Times New Roman" w:hAnsi="Consolas" w:cs="Times New Roman"/>
+          <w:color w:val="D4D4D4"/>
+          <w:sz w:val="16"/>
+          <w:szCs w:val="16"/>
+          <w:lang w:eastAsia="zh-CN"/>
+        </w:rPr>
+        <w:t>_off</w:t>
+      </w:r>
+      <w:proofErr w:type="gramStart"/>
+      <w:r>
+        <w:rPr>
+          <w:rFonts w:ascii="Consolas" w:eastAsia="Times New Roman" w:hAnsi="Consolas" w:cs="Times New Roman"/>
+          <w:color w:val="D4D4D4"/>
+          <w:sz w:val="16"/>
+          <w:szCs w:val="16"/>
+          <w:lang w:eastAsia="zh-CN"/>
+        </w:rPr>
+        <w:t>2,  Left</w:t>
+      </w:r>
+      <w:proofErr w:type="gramEnd"/>
+      <w:r>
+        <w:rPr>
+          <w:rFonts w:ascii="Consolas" w:eastAsia="Times New Roman" w:hAnsi="Consolas" w:cs="Times New Roman"/>
+          <w:color w:val="D4D4D4"/>
+          <w:sz w:val="16"/>
+          <w:szCs w:val="16"/>
+          <w:lang w:eastAsia="zh-CN"/>
+        </w:rPr>
+        <w:t>_off</w:t>
+      </w:r>
+      <w:proofErr w:type="gramStart"/>
+      <w:r>
+        <w:rPr>
+          <w:rFonts w:ascii="Consolas" w:eastAsia="Times New Roman" w:hAnsi="Consolas" w:cs="Times New Roman"/>
+          <w:color w:val="D4D4D4"/>
+          <w:sz w:val="16"/>
+          <w:szCs w:val="16"/>
+          <w:lang w:eastAsia="zh-CN"/>
+        </w:rPr>
+        <w:t>2 }</w:t>
+      </w:r>
+      <w:proofErr w:type="gramEnd"/>
+      <w:r>
+        <w:rPr>
+          <w:rFonts w:ascii="Consolas" w:eastAsia="Times New Roman" w:hAnsi="Consolas" w:cs="Times New Roman"/>
+          <w:color w:val="D4D4D4"/>
+          <w:sz w:val="16"/>
+          <w:szCs w:val="16"/>
+          <w:lang w:eastAsia="zh-CN"/>
+        </w:rPr>
+        <w:t>},</w:t>
       </w:r>
       <w:r>
         <w:rPr>
@@ -1670,7 +2578,161 @@
           <w:szCs w:val="16"/>
           <w:lang w:eastAsia="zh-CN"/>
         </w:rPr>
-        <w:t>, { Left_stop,      Left1,      Right1,     Center    }},</w:t>
+        <w:t xml:space="preserve">, </w:t>
+      </w:r>
+      <w:proofErr w:type="gramStart"/>
+      <w:r>
+        <w:rPr>
+          <w:rFonts w:ascii="Consolas" w:eastAsia="Times New Roman" w:hAnsi="Consolas" w:cs="Times New Roman"/>
+          <w:color w:val="D4D4D4"/>
+          <w:sz w:val="16"/>
+          <w:szCs w:val="16"/>
+          <w:lang w:eastAsia="zh-CN"/>
+        </w:rPr>
+        <w:t xml:space="preserve">{ </w:t>
+      </w:r>
+      <w:proofErr w:type="spellStart"/>
+      <w:r>
+        <w:rPr>
+          <w:rFonts w:ascii="Consolas" w:eastAsia="Times New Roman" w:hAnsi="Consolas" w:cs="Times New Roman"/>
+          <w:color w:val="D4D4D4"/>
+          <w:sz w:val="16"/>
+          <w:szCs w:val="16"/>
+          <w:lang w:eastAsia="zh-CN"/>
+        </w:rPr>
+        <w:t>Left</w:t>
+      </w:r>
+      <w:proofErr w:type="gramEnd"/>
+      <w:r>
+        <w:rPr>
+          <w:rFonts w:ascii="Consolas" w:eastAsia="Times New Roman" w:hAnsi="Consolas" w:cs="Times New Roman"/>
+          <w:color w:val="D4D4D4"/>
+          <w:sz w:val="16"/>
+          <w:szCs w:val="16"/>
+          <w:lang w:eastAsia="zh-CN"/>
+        </w:rPr>
+        <w:t>_</w:t>
+      </w:r>
+      <w:proofErr w:type="gramStart"/>
+      <w:r>
+        <w:rPr>
+          <w:rFonts w:ascii="Consolas" w:eastAsia="Times New Roman" w:hAnsi="Consolas" w:cs="Times New Roman"/>
+          <w:color w:val="D4D4D4"/>
+          <w:sz w:val="16"/>
+          <w:szCs w:val="16"/>
+          <w:lang w:eastAsia="zh-CN"/>
+        </w:rPr>
+        <w:t>stop</w:t>
+      </w:r>
+      <w:proofErr w:type="spellEnd"/>
+      <w:r>
+        <w:rPr>
+          <w:rFonts w:ascii="Consolas" w:eastAsia="Times New Roman" w:hAnsi="Consolas" w:cs="Times New Roman"/>
+          <w:color w:val="D4D4D4"/>
+          <w:sz w:val="16"/>
+          <w:szCs w:val="16"/>
+          <w:lang w:eastAsia="zh-CN"/>
+        </w:rPr>
+        <w:t xml:space="preserve">,   </w:t>
+      </w:r>
+      <w:proofErr w:type="gramEnd"/>
+      <w:r>
+        <w:rPr>
+          <w:rFonts w:ascii="Consolas" w:eastAsia="Times New Roman" w:hAnsi="Consolas" w:cs="Times New Roman"/>
+          <w:color w:val="D4D4D4"/>
+          <w:sz w:val="16"/>
+          <w:szCs w:val="16"/>
+          <w:lang w:eastAsia="zh-CN"/>
+        </w:rPr>
+        <w:t>   Left</w:t>
+      </w:r>
+      <w:proofErr w:type="gramStart"/>
+      <w:r>
+        <w:rPr>
+          <w:rFonts w:ascii="Consolas" w:eastAsia="Times New Roman" w:hAnsi="Consolas" w:cs="Times New Roman"/>
+          <w:color w:val="D4D4D4"/>
+          <w:sz w:val="16"/>
+          <w:szCs w:val="16"/>
+          <w:lang w:eastAsia="zh-CN"/>
+        </w:rPr>
+        <w:t xml:space="preserve">1,   </w:t>
+      </w:r>
+      <w:proofErr w:type="gramEnd"/>
+      <w:r>
+        <w:rPr>
+          <w:rFonts w:ascii="Consolas" w:eastAsia="Times New Roman" w:hAnsi="Consolas" w:cs="Times New Roman"/>
+          <w:color w:val="D4D4D4"/>
+          <w:sz w:val="16"/>
+          <w:szCs w:val="16"/>
+          <w:lang w:eastAsia="zh-CN"/>
+        </w:rPr>
+        <w:t>   Right</w:t>
+      </w:r>
+      <w:proofErr w:type="gramStart"/>
+      <w:r>
+        <w:rPr>
+          <w:rFonts w:ascii="Consolas" w:eastAsia="Times New Roman" w:hAnsi="Consolas" w:cs="Times New Roman"/>
+          <w:color w:val="D4D4D4"/>
+          <w:sz w:val="16"/>
+          <w:szCs w:val="16"/>
+          <w:lang w:eastAsia="zh-CN"/>
+        </w:rPr>
+        <w:t xml:space="preserve">1,   </w:t>
+      </w:r>
+      <w:proofErr w:type="gramEnd"/>
+      <w:r>
+        <w:rPr>
+          <w:rFonts w:ascii="Consolas" w:eastAsia="Times New Roman" w:hAnsi="Consolas" w:cs="Times New Roman"/>
+          <w:color w:val="D4D4D4"/>
+          <w:sz w:val="16"/>
+          <w:szCs w:val="16"/>
+          <w:lang w:eastAsia="zh-CN"/>
+        </w:rPr>
+        <w:t xml:space="preserve">  </w:t>
+      </w:r>
+      <w:proofErr w:type="spellStart"/>
+      <w:r>
+        <w:rPr>
+          <w:rFonts w:ascii="Consolas" w:eastAsia="Times New Roman" w:hAnsi="Consolas" w:cs="Times New Roman"/>
+          <w:color w:val="D4D4D4"/>
+          <w:sz w:val="16"/>
+          <w:szCs w:val="16"/>
+          <w:lang w:eastAsia="zh-CN"/>
+        </w:rPr>
+        <w:t>Center</w:t>
+      </w:r>
+      <w:proofErr w:type="spellEnd"/>
+      <w:r>
+        <w:rPr>
+          <w:rFonts w:ascii="Consolas" w:eastAsia="Times New Roman" w:hAnsi="Consolas" w:cs="Times New Roman"/>
+          <w:color w:val="D4D4D4"/>
+          <w:sz w:val="16"/>
+          <w:szCs w:val="16"/>
+          <w:lang w:eastAsia="zh-CN"/>
+        </w:rPr>
+        <w:t xml:space="preserve">  </w:t>
+      </w:r>
+      <w:proofErr w:type="gramStart"/>
+      <w:r>
+        <w:rPr>
+          <w:rFonts w:ascii="Consolas" w:eastAsia="Times New Roman" w:hAnsi="Consolas" w:cs="Times New Roman"/>
+          <w:color w:val="D4D4D4"/>
+          <w:sz w:val="16"/>
+          <w:szCs w:val="16"/>
+          <w:lang w:eastAsia="zh-CN"/>
+        </w:rPr>
+        <w:t xml:space="preserve">  }</w:t>
+      </w:r>
+      <w:proofErr w:type="gramEnd"/>
+      <w:r>
+        <w:rPr>
+          <w:rFonts w:ascii="Consolas" w:eastAsia="Times New Roman" w:hAnsi="Consolas" w:cs="Times New Roman"/>
+          <w:color w:val="D4D4D4"/>
+          <w:sz w:val="16"/>
+          <w:szCs w:val="16"/>
+          <w:lang w:eastAsia="zh-CN"/>
+        </w:rPr>
+        <w:t>},</w:t>
       </w:r>
       <w:r>
         <w:rPr>
@@ -1718,7 +2780,18 @@
           <w:szCs w:val="16"/>
           <w:lang w:eastAsia="zh-CN"/>
         </w:rPr>
-        <w:t>0x00</w:t>
+        <w:t>0x</w:t>
+      </w:r>
+      <w:proofErr w:type="gramStart"/>
+      <w:r>
+        <w:rPr>
+          <w:rFonts w:ascii="Consolas" w:eastAsia="Times New Roman" w:hAnsi="Consolas" w:cs="Times New Roman"/>
+          <w:color w:val="B5CEA8"/>
+          <w:sz w:val="16"/>
+          <w:szCs w:val="16"/>
+          <w:lang w:eastAsia="zh-CN"/>
+        </w:rPr>
+        <w:t>00</w:t>
       </w:r>
       <w:r>
         <w:rPr>
@@ -1740,15 +2813,226 @@
         </w:rPr>
         <w:t>500</w:t>
       </w:r>
-      <w:r>
-        <w:rPr>
-          <w:rFonts w:ascii="Consolas" w:eastAsia="Times New Roman" w:hAnsi="Consolas" w:cs="Times New Roman"/>
-          <w:color w:val="D4D4D4"/>
-          <w:sz w:val="16"/>
-          <w:szCs w:val="16"/>
-          <w:lang w:eastAsia="zh-CN"/>
-        </w:rPr>
-        <w:t>, { Left_stop,      Left_stop,  Left_stop,  Left_stop }},</w:t>
+      <w:proofErr w:type="gramEnd"/>
+      <w:r>
+        <w:rPr>
+          <w:rFonts w:ascii="Consolas" w:eastAsia="Times New Roman" w:hAnsi="Consolas" w:cs="Times New Roman"/>
+          <w:color w:val="D4D4D4"/>
+          <w:sz w:val="16"/>
+          <w:szCs w:val="16"/>
+          <w:lang w:eastAsia="zh-CN"/>
+        </w:rPr>
+        <w:t xml:space="preserve">, </w:t>
+      </w:r>
+      <w:proofErr w:type="gramStart"/>
+      <w:r>
+        <w:rPr>
+          <w:rFonts w:ascii="Consolas" w:eastAsia="Times New Roman" w:hAnsi="Consolas" w:cs="Times New Roman"/>
+          <w:color w:val="D4D4D4"/>
+          <w:sz w:val="16"/>
+          <w:szCs w:val="16"/>
+          <w:lang w:eastAsia="zh-CN"/>
+        </w:rPr>
+        <w:t xml:space="preserve">{ </w:t>
+      </w:r>
+      <w:proofErr w:type="spellStart"/>
+      <w:r>
+        <w:rPr>
+          <w:rFonts w:ascii="Consolas" w:eastAsia="Times New Roman" w:hAnsi="Consolas" w:cs="Times New Roman"/>
+          <w:color w:val="D4D4D4"/>
+          <w:sz w:val="16"/>
+          <w:szCs w:val="16"/>
+          <w:lang w:eastAsia="zh-CN"/>
+        </w:rPr>
+        <w:t>Left</w:t>
+      </w:r>
+      <w:proofErr w:type="gramEnd"/>
+      <w:r>
+        <w:rPr>
+          <w:rFonts w:ascii="Consolas" w:eastAsia="Times New Roman" w:hAnsi="Consolas" w:cs="Times New Roman"/>
+          <w:color w:val="D4D4D4"/>
+          <w:sz w:val="16"/>
+          <w:szCs w:val="16"/>
+          <w:lang w:eastAsia="zh-CN"/>
+        </w:rPr>
+        <w:t>_</w:t>
+      </w:r>
+      <w:proofErr w:type="gramStart"/>
+      <w:r>
+        <w:rPr>
+          <w:rFonts w:ascii="Consolas" w:eastAsia="Times New Roman" w:hAnsi="Consolas" w:cs="Times New Roman"/>
+          <w:color w:val="D4D4D4"/>
+          <w:sz w:val="16"/>
+          <w:szCs w:val="16"/>
+          <w:lang w:eastAsia="zh-CN"/>
+        </w:rPr>
+        <w:t>stop</w:t>
+      </w:r>
+      <w:proofErr w:type="spellEnd"/>
+      <w:r>
+        <w:rPr>
+          <w:rFonts w:ascii="Consolas" w:eastAsia="Times New Roman" w:hAnsi="Consolas" w:cs="Times New Roman"/>
+          <w:color w:val="D4D4D4"/>
+          <w:sz w:val="16"/>
+          <w:szCs w:val="16"/>
+          <w:lang w:eastAsia="zh-CN"/>
+        </w:rPr>
+        <w:t xml:space="preserve">,   </w:t>
+      </w:r>
+      <w:proofErr w:type="gramEnd"/>
+      <w:r>
+        <w:rPr>
+          <w:rFonts w:ascii="Consolas" w:eastAsia="Times New Roman" w:hAnsi="Consolas" w:cs="Times New Roman"/>
+          <w:color w:val="D4D4D4"/>
+          <w:sz w:val="16"/>
+          <w:szCs w:val="16"/>
+          <w:lang w:eastAsia="zh-CN"/>
+        </w:rPr>
+        <w:t>   </w:t>
+      </w:r>
+      <w:proofErr w:type="spellStart"/>
+      <w:proofErr w:type="gramStart"/>
+      <w:r>
+        <w:rPr>
+          <w:rFonts w:ascii="Consolas" w:eastAsia="Times New Roman" w:hAnsi="Consolas" w:cs="Times New Roman"/>
+          <w:color w:val="D4D4D4"/>
+          <w:sz w:val="16"/>
+          <w:szCs w:val="16"/>
+          <w:lang w:eastAsia="zh-CN"/>
+        </w:rPr>
+        <w:t>Left</w:t>
+      </w:r>
+      <w:proofErr w:type="gramEnd"/>
+      <w:r>
+        <w:rPr>
+          <w:rFonts w:ascii="Consolas" w:eastAsia="Times New Roman" w:hAnsi="Consolas" w:cs="Times New Roman"/>
+          <w:color w:val="D4D4D4"/>
+          <w:sz w:val="16"/>
+          <w:szCs w:val="16"/>
+          <w:lang w:eastAsia="zh-CN"/>
+        </w:rPr>
+        <w:t>_</w:t>
+      </w:r>
+      <w:proofErr w:type="gramStart"/>
+      <w:r>
+        <w:rPr>
+          <w:rFonts w:ascii="Consolas" w:eastAsia="Times New Roman" w:hAnsi="Consolas" w:cs="Times New Roman"/>
+          <w:color w:val="D4D4D4"/>
+          <w:sz w:val="16"/>
+          <w:szCs w:val="16"/>
+          <w:lang w:eastAsia="zh-CN"/>
+        </w:rPr>
+        <w:t>stop</w:t>
+      </w:r>
+      <w:proofErr w:type="spellEnd"/>
+      <w:r>
+        <w:rPr>
+          <w:rFonts w:ascii="Consolas" w:eastAsia="Times New Roman" w:hAnsi="Consolas" w:cs="Times New Roman"/>
+          <w:color w:val="D4D4D4"/>
+          <w:sz w:val="16"/>
+          <w:szCs w:val="16"/>
+          <w:lang w:eastAsia="zh-CN"/>
+        </w:rPr>
+        <w:t>,  </w:t>
+      </w:r>
+      <w:proofErr w:type="spellStart"/>
+      <w:r>
+        <w:rPr>
+          <w:rFonts w:ascii="Consolas" w:eastAsia="Times New Roman" w:hAnsi="Consolas" w:cs="Times New Roman"/>
+          <w:color w:val="D4D4D4"/>
+          <w:sz w:val="16"/>
+          <w:szCs w:val="16"/>
+          <w:lang w:eastAsia="zh-CN"/>
+        </w:rPr>
+        <w:t>Left</w:t>
+      </w:r>
+      <w:proofErr w:type="gramEnd"/>
+      <w:r>
+        <w:rPr>
+          <w:rFonts w:ascii="Consolas" w:eastAsia="Times New Roman" w:hAnsi="Consolas" w:cs="Times New Roman"/>
+          <w:color w:val="D4D4D4"/>
+          <w:sz w:val="16"/>
+          <w:szCs w:val="16"/>
+          <w:lang w:eastAsia="zh-CN"/>
+        </w:rPr>
+        <w:t>_</w:t>
+      </w:r>
+      <w:proofErr w:type="gramStart"/>
+      <w:r>
+        <w:rPr>
+          <w:rFonts w:ascii="Consolas" w:eastAsia="Times New Roman" w:hAnsi="Consolas" w:cs="Times New Roman"/>
+          <w:color w:val="D4D4D4"/>
+          <w:sz w:val="16"/>
+          <w:szCs w:val="16"/>
+          <w:lang w:eastAsia="zh-CN"/>
+        </w:rPr>
+        <w:t>stop</w:t>
+      </w:r>
+      <w:proofErr w:type="spellEnd"/>
+      <w:r>
+        <w:rPr>
+          <w:rFonts w:ascii="Consolas" w:eastAsia="Times New Roman" w:hAnsi="Consolas" w:cs="Times New Roman"/>
+          <w:color w:val="D4D4D4"/>
+          <w:sz w:val="16"/>
+          <w:szCs w:val="16"/>
+          <w:lang w:eastAsia="zh-CN"/>
+        </w:rPr>
+        <w:t>,  </w:t>
+      </w:r>
+      <w:proofErr w:type="spellStart"/>
+      <w:r>
+        <w:rPr>
+          <w:rFonts w:ascii="Consolas" w:eastAsia="Times New Roman" w:hAnsi="Consolas" w:cs="Times New Roman"/>
+          <w:color w:val="D4D4D4"/>
+          <w:sz w:val="16"/>
+          <w:szCs w:val="16"/>
+          <w:lang w:eastAsia="zh-CN"/>
+        </w:rPr>
+        <w:t>Left</w:t>
+      </w:r>
+      <w:proofErr w:type="gramEnd"/>
+      <w:r>
+        <w:rPr>
+          <w:rFonts w:ascii="Consolas" w:eastAsia="Times New Roman" w:hAnsi="Consolas" w:cs="Times New Roman"/>
+          <w:color w:val="D4D4D4"/>
+          <w:sz w:val="16"/>
+          <w:szCs w:val="16"/>
+          <w:lang w:eastAsia="zh-CN"/>
+        </w:rPr>
+        <w:t>_</w:t>
+      </w:r>
+      <w:proofErr w:type="gramStart"/>
+      <w:r>
+        <w:rPr>
+          <w:rFonts w:ascii="Consolas" w:eastAsia="Times New Roman" w:hAnsi="Consolas" w:cs="Times New Roman"/>
+          <w:color w:val="D4D4D4"/>
+          <w:sz w:val="16"/>
+          <w:szCs w:val="16"/>
+          <w:lang w:eastAsia="zh-CN"/>
+        </w:rPr>
+        <w:t>stop</w:t>
+      </w:r>
+      <w:proofErr w:type="spellEnd"/>
+      <w:r>
+        <w:rPr>
+          <w:rFonts w:ascii="Consolas" w:eastAsia="Times New Roman" w:hAnsi="Consolas" w:cs="Times New Roman"/>
+          <w:color w:val="D4D4D4"/>
+          <w:sz w:val="16"/>
+          <w:szCs w:val="16"/>
+          <w:lang w:eastAsia="zh-CN"/>
+        </w:rPr>
+        <w:t xml:space="preserve"> }</w:t>
+      </w:r>
+      <w:proofErr w:type="gramEnd"/>
+      <w:r>
+        <w:rPr>
+          <w:rFonts w:ascii="Consolas" w:eastAsia="Times New Roman" w:hAnsi="Consolas" w:cs="Times New Roman"/>
+          <w:color w:val="D4D4D4"/>
+          <w:sz w:val="16"/>
+          <w:szCs w:val="16"/>
+          <w:lang w:eastAsia="zh-CN"/>
+        </w:rPr>
+        <w:t>},</w:t>
       </w:r>
       <w:r>
         <w:rPr>
@@ -1758,8 +3042,20 @@
           <w:szCs w:val="16"/>
           <w:lang w:eastAsia="zh-CN"/>
         </w:rPr>
-        <w:t xml:space="preserve">   // Left_stop</w:t>
-      </w:r>
+        <w:t xml:space="preserve">   // </w:t>
+      </w:r>
+      <w:proofErr w:type="spellStart"/>
+      <w:r>
+        <w:rPr>
+          <w:rFonts w:ascii="Consolas" w:eastAsia="Times New Roman" w:hAnsi="Consolas" w:cs="Times New Roman"/>
+          <w:color w:val="6A9955"/>
+          <w:sz w:val="16"/>
+          <w:szCs w:val="16"/>
+          <w:lang w:eastAsia="zh-CN"/>
+        </w:rPr>
+        <w:t>Left_stop</w:t>
+      </w:r>
+      <w:proofErr w:type="spellEnd"/>
     </w:p>
     <w:p>
       <w:pPr>
@@ -1796,7 +3092,18 @@
           <w:szCs w:val="16"/>
           <w:lang w:eastAsia="zh-CN"/>
         </w:rPr>
-        <w:t>0x01</w:t>
+        <w:t>0x</w:t>
+      </w:r>
+      <w:proofErr w:type="gramStart"/>
+      <w:r>
+        <w:rPr>
+          <w:rFonts w:ascii="Consolas" w:eastAsia="Times New Roman" w:hAnsi="Consolas" w:cs="Times New Roman"/>
+          <w:color w:val="B5CEA8"/>
+          <w:sz w:val="16"/>
+          <w:szCs w:val="16"/>
+          <w:lang w:eastAsia="zh-CN"/>
+        </w:rPr>
+        <w:t>01</w:t>
       </w:r>
       <w:r>
         <w:rPr>
@@ -1818,15 +3125,148 @@
         </w:rPr>
         <w:t>500</w:t>
       </w:r>
-      <w:r>
-        <w:rPr>
-          <w:rFonts w:ascii="Consolas" w:eastAsia="Times New Roman" w:hAnsi="Consolas" w:cs="Times New Roman"/>
-          <w:color w:val="D4D4D4"/>
-          <w:sz w:val="16"/>
-          <w:szCs w:val="16"/>
-          <w:lang w:eastAsia="zh-CN"/>
-        </w:rPr>
-        <w:t>, { Right_off1,     Left1,      Right2,     Center    }},</w:t>
+      <w:proofErr w:type="gramEnd"/>
+      <w:r>
+        <w:rPr>
+          <w:rFonts w:ascii="Consolas" w:eastAsia="Times New Roman" w:hAnsi="Consolas" w:cs="Times New Roman"/>
+          <w:color w:val="D4D4D4"/>
+          <w:sz w:val="16"/>
+          <w:szCs w:val="16"/>
+          <w:lang w:eastAsia="zh-CN"/>
+        </w:rPr>
+        <w:t xml:space="preserve">, </w:t>
+      </w:r>
+      <w:proofErr w:type="gramStart"/>
+      <w:r>
+        <w:rPr>
+          <w:rFonts w:ascii="Consolas" w:eastAsia="Times New Roman" w:hAnsi="Consolas" w:cs="Times New Roman"/>
+          <w:color w:val="D4D4D4"/>
+          <w:sz w:val="16"/>
+          <w:szCs w:val="16"/>
+          <w:lang w:eastAsia="zh-CN"/>
+        </w:rPr>
+        <w:t>{ Right</w:t>
+      </w:r>
+      <w:proofErr w:type="gramEnd"/>
+      <w:r>
+        <w:rPr>
+          <w:rFonts w:ascii="Consolas" w:eastAsia="Times New Roman" w:hAnsi="Consolas" w:cs="Times New Roman"/>
+          <w:color w:val="D4D4D4"/>
+          <w:sz w:val="16"/>
+          <w:szCs w:val="16"/>
+          <w:lang w:eastAsia="zh-CN"/>
+        </w:rPr>
+        <w:t>_off</w:t>
+      </w:r>
+      <w:proofErr w:type="gramStart"/>
+      <w:r>
+        <w:rPr>
+          <w:rFonts w:ascii="Consolas" w:eastAsia="Times New Roman" w:hAnsi="Consolas" w:cs="Times New Roman"/>
+          <w:color w:val="D4D4D4"/>
+          <w:sz w:val="16"/>
+          <w:szCs w:val="16"/>
+          <w:lang w:eastAsia="zh-CN"/>
+        </w:rPr>
+        <w:t xml:space="preserve">1,   </w:t>
+      </w:r>
+      <w:proofErr w:type="gramEnd"/>
+      <w:r>
+        <w:rPr>
+          <w:rFonts w:ascii="Consolas" w:eastAsia="Times New Roman" w:hAnsi="Consolas" w:cs="Times New Roman"/>
+          <w:color w:val="D4D4D4"/>
+          <w:sz w:val="16"/>
+          <w:szCs w:val="16"/>
+          <w:lang w:eastAsia="zh-CN"/>
+        </w:rPr>
+        <w:t>  Left</w:t>
+      </w:r>
+      <w:proofErr w:type="gramStart"/>
+      <w:r>
+        <w:rPr>
+          <w:rFonts w:ascii="Consolas" w:eastAsia="Times New Roman" w:hAnsi="Consolas" w:cs="Times New Roman"/>
+          <w:color w:val="D4D4D4"/>
+          <w:sz w:val="16"/>
+          <w:szCs w:val="16"/>
+          <w:lang w:eastAsia="zh-CN"/>
+        </w:rPr>
+        <w:t xml:space="preserve">1,   </w:t>
+      </w:r>
+      <w:proofErr w:type="gramEnd"/>
+      <w:r>
+        <w:rPr>
+          <w:rFonts w:ascii="Consolas" w:eastAsia="Times New Roman" w:hAnsi="Consolas" w:cs="Times New Roman"/>
+          <w:color w:val="D4D4D4"/>
+          <w:sz w:val="16"/>
+          <w:szCs w:val="16"/>
+          <w:lang w:eastAsia="zh-CN"/>
+        </w:rPr>
+        <w:t>   Right</w:t>
+      </w:r>
+      <w:proofErr w:type="gramStart"/>
+      <w:r>
+        <w:rPr>
+          <w:rFonts w:ascii="Consolas" w:eastAsia="Times New Roman" w:hAnsi="Consolas" w:cs="Times New Roman"/>
+          <w:color w:val="D4D4D4"/>
+          <w:sz w:val="16"/>
+          <w:szCs w:val="16"/>
+          <w:lang w:eastAsia="zh-CN"/>
+        </w:rPr>
+        <w:t xml:space="preserve">2,   </w:t>
+      </w:r>
+      <w:proofErr w:type="gramEnd"/>
+      <w:r>
+        <w:rPr>
+          <w:rFonts w:ascii="Consolas" w:eastAsia="Times New Roman" w:hAnsi="Consolas" w:cs="Times New Roman"/>
+          <w:color w:val="D4D4D4"/>
+          <w:sz w:val="16"/>
+          <w:szCs w:val="16"/>
+          <w:lang w:eastAsia="zh-CN"/>
+        </w:rPr>
+        <w:t xml:space="preserve">  </w:t>
+      </w:r>
+      <w:proofErr w:type="spellStart"/>
+      <w:r>
+        <w:rPr>
+          <w:rFonts w:ascii="Consolas" w:eastAsia="Times New Roman" w:hAnsi="Consolas" w:cs="Times New Roman"/>
+          <w:color w:val="D4D4D4"/>
+          <w:sz w:val="16"/>
+          <w:szCs w:val="16"/>
+          <w:lang w:eastAsia="zh-CN"/>
+        </w:rPr>
+        <w:t>Center</w:t>
+      </w:r>
+      <w:proofErr w:type="spellEnd"/>
+      <w:r>
+        <w:rPr>
+          <w:rFonts w:ascii="Consolas" w:eastAsia="Times New Roman" w:hAnsi="Consolas" w:cs="Times New Roman"/>
+          <w:color w:val="D4D4D4"/>
+          <w:sz w:val="16"/>
+          <w:szCs w:val="16"/>
+          <w:lang w:eastAsia="zh-CN"/>
+        </w:rPr>
+        <w:t xml:space="preserve">  </w:t>
+      </w:r>
+      <w:proofErr w:type="gramStart"/>
+      <w:r>
+        <w:rPr>
+          <w:rFonts w:ascii="Consolas" w:eastAsia="Times New Roman" w:hAnsi="Consolas" w:cs="Times New Roman"/>
+          <w:color w:val="D4D4D4"/>
+          <w:sz w:val="16"/>
+          <w:szCs w:val="16"/>
+          <w:lang w:eastAsia="zh-CN"/>
+        </w:rPr>
+        <w:t xml:space="preserve">  }</w:t>
+      </w:r>
+      <w:proofErr w:type="gramEnd"/>
+      <w:r>
+        <w:rPr>
+          <w:rFonts w:ascii="Consolas" w:eastAsia="Times New Roman" w:hAnsi="Consolas" w:cs="Times New Roman"/>
+          <w:color w:val="D4D4D4"/>
+          <w:sz w:val="16"/>
+          <w:szCs w:val="16"/>
+          <w:lang w:eastAsia="zh-CN"/>
+        </w:rPr>
+        <w:t>},</w:t>
       </w:r>
       <w:r>
         <w:rPr>
@@ -1904,7 +3344,139 @@
           <w:szCs w:val="16"/>
           <w:lang w:eastAsia="zh-CN"/>
         </w:rPr>
-        <w:t>, { Right_off1,     Left1,      Right1,     Center    }},</w:t>
+        <w:t xml:space="preserve">, </w:t>
+      </w:r>
+      <w:proofErr w:type="gramStart"/>
+      <w:r>
+        <w:rPr>
+          <w:rFonts w:ascii="Consolas" w:eastAsia="Times New Roman" w:hAnsi="Consolas" w:cs="Times New Roman"/>
+          <w:color w:val="D4D4D4"/>
+          <w:sz w:val="16"/>
+          <w:szCs w:val="16"/>
+          <w:lang w:eastAsia="zh-CN"/>
+        </w:rPr>
+        <w:t>{ Right</w:t>
+      </w:r>
+      <w:proofErr w:type="gramEnd"/>
+      <w:r>
+        <w:rPr>
+          <w:rFonts w:ascii="Consolas" w:eastAsia="Times New Roman" w:hAnsi="Consolas" w:cs="Times New Roman"/>
+          <w:color w:val="D4D4D4"/>
+          <w:sz w:val="16"/>
+          <w:szCs w:val="16"/>
+          <w:lang w:eastAsia="zh-CN"/>
+        </w:rPr>
+        <w:t>_off</w:t>
+      </w:r>
+      <w:proofErr w:type="gramStart"/>
+      <w:r>
+        <w:rPr>
+          <w:rFonts w:ascii="Consolas" w:eastAsia="Times New Roman" w:hAnsi="Consolas" w:cs="Times New Roman"/>
+          <w:color w:val="D4D4D4"/>
+          <w:sz w:val="16"/>
+          <w:szCs w:val="16"/>
+          <w:lang w:eastAsia="zh-CN"/>
+        </w:rPr>
+        <w:t xml:space="preserve">1,   </w:t>
+      </w:r>
+      <w:proofErr w:type="gramEnd"/>
+      <w:r>
+        <w:rPr>
+          <w:rFonts w:ascii="Consolas" w:eastAsia="Times New Roman" w:hAnsi="Consolas" w:cs="Times New Roman"/>
+          <w:color w:val="D4D4D4"/>
+          <w:sz w:val="16"/>
+          <w:szCs w:val="16"/>
+          <w:lang w:eastAsia="zh-CN"/>
+        </w:rPr>
+        <w:t>  Left</w:t>
+      </w:r>
+      <w:proofErr w:type="gramStart"/>
+      <w:r>
+        <w:rPr>
+          <w:rFonts w:ascii="Consolas" w:eastAsia="Times New Roman" w:hAnsi="Consolas" w:cs="Times New Roman"/>
+          <w:color w:val="D4D4D4"/>
+          <w:sz w:val="16"/>
+          <w:szCs w:val="16"/>
+          <w:lang w:eastAsia="zh-CN"/>
+        </w:rPr>
+        <w:t xml:space="preserve">1,   </w:t>
+      </w:r>
+      <w:proofErr w:type="gramEnd"/>
+      <w:r>
+        <w:rPr>
+          <w:rFonts w:ascii="Consolas" w:eastAsia="Times New Roman" w:hAnsi="Consolas" w:cs="Times New Roman"/>
+          <w:color w:val="D4D4D4"/>
+          <w:sz w:val="16"/>
+          <w:szCs w:val="16"/>
+          <w:lang w:eastAsia="zh-CN"/>
+        </w:rPr>
+        <w:t>   Right</w:t>
+      </w:r>
+      <w:proofErr w:type="gramStart"/>
+      <w:r>
+        <w:rPr>
+          <w:rFonts w:ascii="Consolas" w:eastAsia="Times New Roman" w:hAnsi="Consolas" w:cs="Times New Roman"/>
+          <w:color w:val="D4D4D4"/>
+          <w:sz w:val="16"/>
+          <w:szCs w:val="16"/>
+          <w:lang w:eastAsia="zh-CN"/>
+        </w:rPr>
+        <w:t xml:space="preserve">1,   </w:t>
+      </w:r>
+      <w:proofErr w:type="gramEnd"/>
+      <w:r>
+        <w:rPr>
+          <w:rFonts w:ascii="Consolas" w:eastAsia="Times New Roman" w:hAnsi="Consolas" w:cs="Times New Roman"/>
+          <w:color w:val="D4D4D4"/>
+          <w:sz w:val="16"/>
+          <w:szCs w:val="16"/>
+          <w:lang w:eastAsia="zh-CN"/>
+        </w:rPr>
+        <w:t xml:space="preserve">  </w:t>
+      </w:r>
+      <w:proofErr w:type="spellStart"/>
+      <w:r>
+        <w:rPr>
+          <w:rFonts w:ascii="Consolas" w:eastAsia="Times New Roman" w:hAnsi="Consolas" w:cs="Times New Roman"/>
+          <w:color w:val="D4D4D4"/>
+          <w:sz w:val="16"/>
+          <w:szCs w:val="16"/>
+          <w:lang w:eastAsia="zh-CN"/>
+        </w:rPr>
+        <w:t>Center</w:t>
+      </w:r>
+      <w:proofErr w:type="spellEnd"/>
+      <w:r>
+        <w:rPr>
+          <w:rFonts w:ascii="Consolas" w:eastAsia="Times New Roman" w:hAnsi="Consolas" w:cs="Times New Roman"/>
+          <w:color w:val="D4D4D4"/>
+          <w:sz w:val="16"/>
+          <w:szCs w:val="16"/>
+          <w:lang w:eastAsia="zh-CN"/>
+        </w:rPr>
+        <w:t xml:space="preserve">  </w:t>
+      </w:r>
+      <w:proofErr w:type="gramStart"/>
+      <w:r>
+        <w:rPr>
+          <w:rFonts w:ascii="Consolas" w:eastAsia="Times New Roman" w:hAnsi="Consolas" w:cs="Times New Roman"/>
+          <w:color w:val="D4D4D4"/>
+          <w:sz w:val="16"/>
+          <w:szCs w:val="16"/>
+          <w:lang w:eastAsia="zh-CN"/>
+        </w:rPr>
+        <w:t xml:space="preserve">  }</w:t>
+      </w:r>
+      <w:proofErr w:type="gramEnd"/>
+      <w:r>
+        <w:rPr>
+          <w:rFonts w:ascii="Consolas" w:eastAsia="Times New Roman" w:hAnsi="Consolas" w:cs="Times New Roman"/>
+          <w:color w:val="D4D4D4"/>
+          <w:sz w:val="16"/>
+          <w:szCs w:val="16"/>
+          <w:lang w:eastAsia="zh-CN"/>
+        </w:rPr>
+        <w:t>},</w:t>
       </w:r>
       <w:r>
         <w:rPr>
@@ -1982,7 +3554,128 @@
           <w:szCs w:val="16"/>
           <w:lang w:eastAsia="zh-CN"/>
         </w:rPr>
-        <w:t>, { Right_off2,     Right_off2, Right_off2, Right_off2}},</w:t>
+        <w:t xml:space="preserve">, </w:t>
+      </w:r>
+      <w:proofErr w:type="gramStart"/>
+      <w:r>
+        <w:rPr>
+          <w:rFonts w:ascii="Consolas" w:eastAsia="Times New Roman" w:hAnsi="Consolas" w:cs="Times New Roman"/>
+          <w:color w:val="D4D4D4"/>
+          <w:sz w:val="16"/>
+          <w:szCs w:val="16"/>
+          <w:lang w:eastAsia="zh-CN"/>
+        </w:rPr>
+        <w:t>{ Right</w:t>
+      </w:r>
+      <w:proofErr w:type="gramEnd"/>
+      <w:r>
+        <w:rPr>
+          <w:rFonts w:ascii="Consolas" w:eastAsia="Times New Roman" w:hAnsi="Consolas" w:cs="Times New Roman"/>
+          <w:color w:val="D4D4D4"/>
+          <w:sz w:val="16"/>
+          <w:szCs w:val="16"/>
+          <w:lang w:eastAsia="zh-CN"/>
+        </w:rPr>
+        <w:t>_off</w:t>
+      </w:r>
+      <w:proofErr w:type="gramStart"/>
+      <w:r>
+        <w:rPr>
+          <w:rFonts w:ascii="Consolas" w:eastAsia="Times New Roman" w:hAnsi="Consolas" w:cs="Times New Roman"/>
+          <w:color w:val="D4D4D4"/>
+          <w:sz w:val="16"/>
+          <w:szCs w:val="16"/>
+          <w:lang w:eastAsia="zh-CN"/>
+        </w:rPr>
+        <w:t xml:space="preserve">2,   </w:t>
+      </w:r>
+      <w:proofErr w:type="gramEnd"/>
+      <w:r>
+        <w:rPr>
+          <w:rFonts w:ascii="Consolas" w:eastAsia="Times New Roman" w:hAnsi="Consolas" w:cs="Times New Roman"/>
+          <w:color w:val="D4D4D4"/>
+          <w:sz w:val="16"/>
+          <w:szCs w:val="16"/>
+          <w:lang w:eastAsia="zh-CN"/>
+        </w:rPr>
+        <w:t xml:space="preserve">  </w:t>
+      </w:r>
+      <w:proofErr w:type="gramStart"/>
+      <w:r>
+        <w:rPr>
+          <w:rFonts w:ascii="Consolas" w:eastAsia="Times New Roman" w:hAnsi="Consolas" w:cs="Times New Roman"/>
+          <w:color w:val="D4D4D4"/>
+          <w:sz w:val="16"/>
+          <w:szCs w:val="16"/>
+          <w:lang w:eastAsia="zh-CN"/>
+        </w:rPr>
+        <w:t>Right</w:t>
+      </w:r>
+      <w:proofErr w:type="gramEnd"/>
+      <w:r>
+        <w:rPr>
+          <w:rFonts w:ascii="Consolas" w:eastAsia="Times New Roman" w:hAnsi="Consolas" w:cs="Times New Roman"/>
+          <w:color w:val="D4D4D4"/>
+          <w:sz w:val="16"/>
+          <w:szCs w:val="16"/>
+          <w:lang w:eastAsia="zh-CN"/>
+        </w:rPr>
+        <w:t xml:space="preserve">_off2, </w:t>
+      </w:r>
+      <w:proofErr w:type="gramStart"/>
+      <w:r>
+        <w:rPr>
+          <w:rFonts w:ascii="Consolas" w:eastAsia="Times New Roman" w:hAnsi="Consolas" w:cs="Times New Roman"/>
+          <w:color w:val="D4D4D4"/>
+          <w:sz w:val="16"/>
+          <w:szCs w:val="16"/>
+          <w:lang w:eastAsia="zh-CN"/>
+        </w:rPr>
+        <w:t>Right</w:t>
+      </w:r>
+      <w:proofErr w:type="gramEnd"/>
+      <w:r>
+        <w:rPr>
+          <w:rFonts w:ascii="Consolas" w:eastAsia="Times New Roman" w:hAnsi="Consolas" w:cs="Times New Roman"/>
+          <w:color w:val="D4D4D4"/>
+          <w:sz w:val="16"/>
+          <w:szCs w:val="16"/>
+          <w:lang w:eastAsia="zh-CN"/>
+        </w:rPr>
+        <w:t xml:space="preserve">_off2, </w:t>
+      </w:r>
+      <w:proofErr w:type="gramStart"/>
+      <w:r>
+        <w:rPr>
+          <w:rFonts w:ascii="Consolas" w:eastAsia="Times New Roman" w:hAnsi="Consolas" w:cs="Times New Roman"/>
+          <w:color w:val="D4D4D4"/>
+          <w:sz w:val="16"/>
+          <w:szCs w:val="16"/>
+          <w:lang w:eastAsia="zh-CN"/>
+        </w:rPr>
+        <w:t>Right</w:t>
+      </w:r>
+      <w:proofErr w:type="gramEnd"/>
+      <w:r>
+        <w:rPr>
+          <w:rFonts w:ascii="Consolas" w:eastAsia="Times New Roman" w:hAnsi="Consolas" w:cs="Times New Roman"/>
+          <w:color w:val="D4D4D4"/>
+          <w:sz w:val="16"/>
+          <w:szCs w:val="16"/>
+          <w:lang w:eastAsia="zh-CN"/>
+        </w:rPr>
+        <w:t>_off2}</w:t>
+      </w:r>
+      <w:proofErr w:type="gramStart"/>
+      <w:r>
+        <w:rPr>
+          <w:rFonts w:ascii="Consolas" w:eastAsia="Times New Roman" w:hAnsi="Consolas" w:cs="Times New Roman"/>
+          <w:color w:val="D4D4D4"/>
+          <w:sz w:val="16"/>
+          <w:szCs w:val="16"/>
+          <w:lang w:eastAsia="zh-CN"/>
+        </w:rPr>
+        <w:t>},</w:t>
       </w:r>
       <w:r>
         <w:rPr>
@@ -1992,7 +3685,18 @@
           <w:szCs w:val="16"/>
           <w:lang w:eastAsia="zh-CN"/>
         </w:rPr>
-        <w:t xml:space="preserve">   // Right_off1</w:t>
+        <w:t xml:space="preserve">   </w:t>
+      </w:r>
+      <w:proofErr w:type="gramEnd"/>
+      <w:r>
+        <w:rPr>
+          <w:rFonts w:ascii="Consolas" w:eastAsia="Times New Roman" w:hAnsi="Consolas" w:cs="Times New Roman"/>
+          <w:color w:val="6A9955"/>
+          <w:sz w:val="16"/>
+          <w:szCs w:val="16"/>
+          <w:lang w:eastAsia="zh-CN"/>
+        </w:rPr>
+        <w:t>// Right_off1</w:t>
       </w:r>
     </w:p>
     <w:p>
@@ -2030,7 +3734,18 @@
           <w:szCs w:val="16"/>
           <w:lang w:eastAsia="zh-CN"/>
         </w:rPr>
-        <w:t>0x03</w:t>
+        <w:t>0x</w:t>
+      </w:r>
+      <w:proofErr w:type="gramStart"/>
+      <w:r>
+        <w:rPr>
+          <w:rFonts w:ascii="Consolas" w:eastAsia="Times New Roman" w:hAnsi="Consolas" w:cs="Times New Roman"/>
+          <w:color w:val="B5CEA8"/>
+          <w:sz w:val="16"/>
+          <w:szCs w:val="16"/>
+          <w:lang w:eastAsia="zh-CN"/>
+        </w:rPr>
+        <w:t>03</w:t>
       </w:r>
       <w:r>
         <w:rPr>
@@ -2052,15 +3767,170 @@
         </w:rPr>
         <w:t>5000</w:t>
       </w:r>
-      <w:r>
-        <w:rPr>
-          <w:rFonts w:ascii="Consolas" w:eastAsia="Times New Roman" w:hAnsi="Consolas" w:cs="Times New Roman"/>
-          <w:color w:val="D4D4D4"/>
-          <w:sz w:val="16"/>
-          <w:szCs w:val="16"/>
-          <w:lang w:eastAsia="zh-CN"/>
-        </w:rPr>
-        <w:t>, { Right_stop,     Left1,      Right1,     Center    }},</w:t>
+      <w:proofErr w:type="gramEnd"/>
+      <w:r>
+        <w:rPr>
+          <w:rFonts w:ascii="Consolas" w:eastAsia="Times New Roman" w:hAnsi="Consolas" w:cs="Times New Roman"/>
+          <w:color w:val="D4D4D4"/>
+          <w:sz w:val="16"/>
+          <w:szCs w:val="16"/>
+          <w:lang w:eastAsia="zh-CN"/>
+        </w:rPr>
+        <w:t xml:space="preserve">, </w:t>
+      </w:r>
+      <w:proofErr w:type="gramStart"/>
+      <w:r>
+        <w:rPr>
+          <w:rFonts w:ascii="Consolas" w:eastAsia="Times New Roman" w:hAnsi="Consolas" w:cs="Times New Roman"/>
+          <w:color w:val="D4D4D4"/>
+          <w:sz w:val="16"/>
+          <w:szCs w:val="16"/>
+          <w:lang w:eastAsia="zh-CN"/>
+        </w:rPr>
+        <w:t xml:space="preserve">{ </w:t>
+      </w:r>
+      <w:proofErr w:type="spellStart"/>
+      <w:r>
+        <w:rPr>
+          <w:rFonts w:ascii="Consolas" w:eastAsia="Times New Roman" w:hAnsi="Consolas" w:cs="Times New Roman"/>
+          <w:color w:val="D4D4D4"/>
+          <w:sz w:val="16"/>
+          <w:szCs w:val="16"/>
+          <w:lang w:eastAsia="zh-CN"/>
+        </w:rPr>
+        <w:t>Right</w:t>
+      </w:r>
+      <w:proofErr w:type="gramEnd"/>
+      <w:r>
+        <w:rPr>
+          <w:rFonts w:ascii="Consolas" w:eastAsia="Times New Roman" w:hAnsi="Consolas" w:cs="Times New Roman"/>
+          <w:color w:val="D4D4D4"/>
+          <w:sz w:val="16"/>
+          <w:szCs w:val="16"/>
+          <w:lang w:eastAsia="zh-CN"/>
+        </w:rPr>
+        <w:t>_</w:t>
+      </w:r>
+      <w:proofErr w:type="gramStart"/>
+      <w:r>
+        <w:rPr>
+          <w:rFonts w:ascii="Consolas" w:eastAsia="Times New Roman" w:hAnsi="Consolas" w:cs="Times New Roman"/>
+          <w:color w:val="D4D4D4"/>
+          <w:sz w:val="16"/>
+          <w:szCs w:val="16"/>
+          <w:lang w:eastAsia="zh-CN"/>
+        </w:rPr>
+        <w:t>stop</w:t>
+      </w:r>
+      <w:proofErr w:type="spellEnd"/>
+      <w:r>
+        <w:rPr>
+          <w:rFonts w:ascii="Consolas" w:eastAsia="Times New Roman" w:hAnsi="Consolas" w:cs="Times New Roman"/>
+          <w:color w:val="D4D4D4"/>
+          <w:sz w:val="16"/>
+          <w:szCs w:val="16"/>
+          <w:lang w:eastAsia="zh-CN"/>
+        </w:rPr>
+        <w:t xml:space="preserve">,   </w:t>
+      </w:r>
+      <w:proofErr w:type="gramEnd"/>
+      <w:r>
+        <w:rPr>
+          <w:rFonts w:ascii="Consolas" w:eastAsia="Times New Roman" w:hAnsi="Consolas" w:cs="Times New Roman"/>
+          <w:color w:val="D4D4D4"/>
+          <w:sz w:val="16"/>
+          <w:szCs w:val="16"/>
+          <w:lang w:eastAsia="zh-CN"/>
+        </w:rPr>
+        <w:t>  Left</w:t>
+      </w:r>
+      <w:proofErr w:type="gramStart"/>
+      <w:r>
+        <w:rPr>
+          <w:rFonts w:ascii="Consolas" w:eastAsia="Times New Roman" w:hAnsi="Consolas" w:cs="Times New Roman"/>
+          <w:color w:val="D4D4D4"/>
+          <w:sz w:val="16"/>
+          <w:szCs w:val="16"/>
+          <w:lang w:eastAsia="zh-CN"/>
+        </w:rPr>
+        <w:t xml:space="preserve">1,   </w:t>
+      </w:r>
+      <w:proofErr w:type="gramEnd"/>
+      <w:r>
+        <w:rPr>
+          <w:rFonts w:ascii="Consolas" w:eastAsia="Times New Roman" w:hAnsi="Consolas" w:cs="Times New Roman"/>
+          <w:color w:val="D4D4D4"/>
+          <w:sz w:val="16"/>
+          <w:szCs w:val="16"/>
+          <w:lang w:eastAsia="zh-CN"/>
+        </w:rPr>
+        <w:t>   Right</w:t>
+      </w:r>
+      <w:proofErr w:type="gramStart"/>
+      <w:r>
+        <w:rPr>
+          <w:rFonts w:ascii="Consolas" w:eastAsia="Times New Roman" w:hAnsi="Consolas" w:cs="Times New Roman"/>
+          <w:color w:val="D4D4D4"/>
+          <w:sz w:val="16"/>
+          <w:szCs w:val="16"/>
+          <w:lang w:eastAsia="zh-CN"/>
+        </w:rPr>
+        <w:t xml:space="preserve">1,   </w:t>
+      </w:r>
+      <w:proofErr w:type="gramEnd"/>
+      <w:r>
+        <w:rPr>
+          <w:rFonts w:ascii="Consolas" w:eastAsia="Times New Roman" w:hAnsi="Consolas" w:cs="Times New Roman"/>
+          <w:color w:val="D4D4D4"/>
+          <w:sz w:val="16"/>
+          <w:szCs w:val="16"/>
+          <w:lang w:eastAsia="zh-CN"/>
+        </w:rPr>
+        <w:t xml:space="preserve">  </w:t>
+      </w:r>
+      <w:proofErr w:type="spellStart"/>
+      <w:r>
+        <w:rPr>
+          <w:rFonts w:ascii="Consolas" w:eastAsia="Times New Roman" w:hAnsi="Consolas" w:cs="Times New Roman"/>
+          <w:color w:val="D4D4D4"/>
+          <w:sz w:val="16"/>
+          <w:szCs w:val="16"/>
+          <w:lang w:eastAsia="zh-CN"/>
+        </w:rPr>
+        <w:t>Center</w:t>
+      </w:r>
+      <w:proofErr w:type="spellEnd"/>
+      <w:r>
+        <w:rPr>
+          <w:rFonts w:ascii="Consolas" w:eastAsia="Times New Roman" w:hAnsi="Consolas" w:cs="Times New Roman"/>
+          <w:color w:val="D4D4D4"/>
+          <w:sz w:val="16"/>
+          <w:szCs w:val="16"/>
+          <w:lang w:eastAsia="zh-CN"/>
+        </w:rPr>
+        <w:t xml:space="preserve">  </w:t>
+      </w:r>
+      <w:proofErr w:type="gramStart"/>
+      <w:r>
+        <w:rPr>
+          <w:rFonts w:ascii="Consolas" w:eastAsia="Times New Roman" w:hAnsi="Consolas" w:cs="Times New Roman"/>
+          <w:color w:val="D4D4D4"/>
+          <w:sz w:val="16"/>
+          <w:szCs w:val="16"/>
+          <w:lang w:eastAsia="zh-CN"/>
+        </w:rPr>
+        <w:t xml:space="preserve">  }</w:t>
+      </w:r>
+      <w:proofErr w:type="gramEnd"/>
+      <w:r>
+        <w:rPr>
+          <w:rFonts w:ascii="Consolas" w:eastAsia="Times New Roman" w:hAnsi="Consolas" w:cs="Times New Roman"/>
+          <w:color w:val="D4D4D4"/>
+          <w:sz w:val="16"/>
+          <w:szCs w:val="16"/>
+          <w:lang w:eastAsia="zh-CN"/>
+        </w:rPr>
+        <w:t>},</w:t>
       </w:r>
       <w:r>
         <w:rPr>
@@ -2108,7 +3978,18 @@
           <w:szCs w:val="16"/>
           <w:lang w:eastAsia="zh-CN"/>
         </w:rPr>
-        <w:t>0x00</w:t>
+        <w:t>0x</w:t>
+      </w:r>
+      <w:proofErr w:type="gramStart"/>
+      <w:r>
+        <w:rPr>
+          <w:rFonts w:ascii="Consolas" w:eastAsia="Times New Roman" w:hAnsi="Consolas" w:cs="Times New Roman"/>
+          <w:color w:val="B5CEA8"/>
+          <w:sz w:val="16"/>
+          <w:szCs w:val="16"/>
+          <w:lang w:eastAsia="zh-CN"/>
+        </w:rPr>
+        <w:t>00</w:t>
       </w:r>
       <w:r>
         <w:rPr>
@@ -2130,15 +4011,185 @@
         </w:rPr>
         <w:t>500</w:t>
       </w:r>
-      <w:r>
-        <w:rPr>
-          <w:rFonts w:ascii="Consolas" w:eastAsia="Times New Roman" w:hAnsi="Consolas" w:cs="Times New Roman"/>
-          <w:color w:val="D4D4D4"/>
-          <w:sz w:val="16"/>
-          <w:szCs w:val="16"/>
-          <w:lang w:eastAsia="zh-CN"/>
-        </w:rPr>
-        <w:t>, { Right_stop,     Right_stop, Right_stop, Right_stop}}</w:t>
+      <w:proofErr w:type="gramEnd"/>
+      <w:r>
+        <w:rPr>
+          <w:rFonts w:ascii="Consolas" w:eastAsia="Times New Roman" w:hAnsi="Consolas" w:cs="Times New Roman"/>
+          <w:color w:val="D4D4D4"/>
+          <w:sz w:val="16"/>
+          <w:szCs w:val="16"/>
+          <w:lang w:eastAsia="zh-CN"/>
+        </w:rPr>
+        <w:t xml:space="preserve">, </w:t>
+      </w:r>
+      <w:proofErr w:type="gramStart"/>
+      <w:r>
+        <w:rPr>
+          <w:rFonts w:ascii="Consolas" w:eastAsia="Times New Roman" w:hAnsi="Consolas" w:cs="Times New Roman"/>
+          <w:color w:val="D4D4D4"/>
+          <w:sz w:val="16"/>
+          <w:szCs w:val="16"/>
+          <w:lang w:eastAsia="zh-CN"/>
+        </w:rPr>
+        <w:t xml:space="preserve">{ </w:t>
+      </w:r>
+      <w:proofErr w:type="spellStart"/>
+      <w:r>
+        <w:rPr>
+          <w:rFonts w:ascii="Consolas" w:eastAsia="Times New Roman" w:hAnsi="Consolas" w:cs="Times New Roman"/>
+          <w:color w:val="D4D4D4"/>
+          <w:sz w:val="16"/>
+          <w:szCs w:val="16"/>
+          <w:lang w:eastAsia="zh-CN"/>
+        </w:rPr>
+        <w:t>Right</w:t>
+      </w:r>
+      <w:proofErr w:type="gramEnd"/>
+      <w:r>
+        <w:rPr>
+          <w:rFonts w:ascii="Consolas" w:eastAsia="Times New Roman" w:hAnsi="Consolas" w:cs="Times New Roman"/>
+          <w:color w:val="D4D4D4"/>
+          <w:sz w:val="16"/>
+          <w:szCs w:val="16"/>
+          <w:lang w:eastAsia="zh-CN"/>
+        </w:rPr>
+        <w:t>_</w:t>
+      </w:r>
+      <w:proofErr w:type="gramStart"/>
+      <w:r>
+        <w:rPr>
+          <w:rFonts w:ascii="Consolas" w:eastAsia="Times New Roman" w:hAnsi="Consolas" w:cs="Times New Roman"/>
+          <w:color w:val="D4D4D4"/>
+          <w:sz w:val="16"/>
+          <w:szCs w:val="16"/>
+          <w:lang w:eastAsia="zh-CN"/>
+        </w:rPr>
+        <w:t>stop</w:t>
+      </w:r>
+      <w:proofErr w:type="spellEnd"/>
+      <w:r>
+        <w:rPr>
+          <w:rFonts w:ascii="Consolas" w:eastAsia="Times New Roman" w:hAnsi="Consolas" w:cs="Times New Roman"/>
+          <w:color w:val="D4D4D4"/>
+          <w:sz w:val="16"/>
+          <w:szCs w:val="16"/>
+          <w:lang w:eastAsia="zh-CN"/>
+        </w:rPr>
+        <w:t xml:space="preserve">,   </w:t>
+      </w:r>
+      <w:proofErr w:type="gramEnd"/>
+      <w:r>
+        <w:rPr>
+          <w:rFonts w:ascii="Consolas" w:eastAsia="Times New Roman" w:hAnsi="Consolas" w:cs="Times New Roman"/>
+          <w:color w:val="D4D4D4"/>
+          <w:sz w:val="16"/>
+          <w:szCs w:val="16"/>
+          <w:lang w:eastAsia="zh-CN"/>
+        </w:rPr>
+        <w:t xml:space="preserve">  </w:t>
+      </w:r>
+      <w:proofErr w:type="spellStart"/>
+      <w:proofErr w:type="gramStart"/>
+      <w:r>
+        <w:rPr>
+          <w:rFonts w:ascii="Consolas" w:eastAsia="Times New Roman" w:hAnsi="Consolas" w:cs="Times New Roman"/>
+          <w:color w:val="D4D4D4"/>
+          <w:sz w:val="16"/>
+          <w:szCs w:val="16"/>
+          <w:lang w:eastAsia="zh-CN"/>
+        </w:rPr>
+        <w:t>Right</w:t>
+      </w:r>
+      <w:proofErr w:type="gramEnd"/>
+      <w:r>
+        <w:rPr>
+          <w:rFonts w:ascii="Consolas" w:eastAsia="Times New Roman" w:hAnsi="Consolas" w:cs="Times New Roman"/>
+          <w:color w:val="D4D4D4"/>
+          <w:sz w:val="16"/>
+          <w:szCs w:val="16"/>
+          <w:lang w:eastAsia="zh-CN"/>
+        </w:rPr>
+        <w:t>_stop</w:t>
+      </w:r>
+      <w:proofErr w:type="spellEnd"/>
+      <w:r>
+        <w:rPr>
+          <w:rFonts w:ascii="Consolas" w:eastAsia="Times New Roman" w:hAnsi="Consolas" w:cs="Times New Roman"/>
+          <w:color w:val="D4D4D4"/>
+          <w:sz w:val="16"/>
+          <w:szCs w:val="16"/>
+          <w:lang w:eastAsia="zh-CN"/>
+        </w:rPr>
+        <w:t xml:space="preserve">, </w:t>
+      </w:r>
+      <w:proofErr w:type="spellStart"/>
+      <w:proofErr w:type="gramStart"/>
+      <w:r>
+        <w:rPr>
+          <w:rFonts w:ascii="Consolas" w:eastAsia="Times New Roman" w:hAnsi="Consolas" w:cs="Times New Roman"/>
+          <w:color w:val="D4D4D4"/>
+          <w:sz w:val="16"/>
+          <w:szCs w:val="16"/>
+          <w:lang w:eastAsia="zh-CN"/>
+        </w:rPr>
+        <w:t>Right</w:t>
+      </w:r>
+      <w:proofErr w:type="gramEnd"/>
+      <w:r>
+        <w:rPr>
+          <w:rFonts w:ascii="Consolas" w:eastAsia="Times New Roman" w:hAnsi="Consolas" w:cs="Times New Roman"/>
+          <w:color w:val="D4D4D4"/>
+          <w:sz w:val="16"/>
+          <w:szCs w:val="16"/>
+          <w:lang w:eastAsia="zh-CN"/>
+        </w:rPr>
+        <w:t>_stop</w:t>
+      </w:r>
+      <w:proofErr w:type="spellEnd"/>
+      <w:r>
+        <w:rPr>
+          <w:rFonts w:ascii="Consolas" w:eastAsia="Times New Roman" w:hAnsi="Consolas" w:cs="Times New Roman"/>
+          <w:color w:val="D4D4D4"/>
+          <w:sz w:val="16"/>
+          <w:szCs w:val="16"/>
+          <w:lang w:eastAsia="zh-CN"/>
+        </w:rPr>
+        <w:t xml:space="preserve">, </w:t>
+      </w:r>
+      <w:proofErr w:type="spellStart"/>
+      <w:proofErr w:type="gramStart"/>
+      <w:r>
+        <w:rPr>
+          <w:rFonts w:ascii="Consolas" w:eastAsia="Times New Roman" w:hAnsi="Consolas" w:cs="Times New Roman"/>
+          <w:color w:val="D4D4D4"/>
+          <w:sz w:val="16"/>
+          <w:szCs w:val="16"/>
+          <w:lang w:eastAsia="zh-CN"/>
+        </w:rPr>
+        <w:t>Right</w:t>
+      </w:r>
+      <w:proofErr w:type="gramEnd"/>
+      <w:r>
+        <w:rPr>
+          <w:rFonts w:ascii="Consolas" w:eastAsia="Times New Roman" w:hAnsi="Consolas" w:cs="Times New Roman"/>
+          <w:color w:val="D4D4D4"/>
+          <w:sz w:val="16"/>
+          <w:szCs w:val="16"/>
+          <w:lang w:eastAsia="zh-CN"/>
+        </w:rPr>
+        <w:t>_stop</w:t>
+      </w:r>
+      <w:proofErr w:type="spellEnd"/>
+      <w:proofErr w:type="gramStart"/>
+      <w:r>
+        <w:rPr>
+          <w:rFonts w:ascii="Consolas" w:eastAsia="Times New Roman" w:hAnsi="Consolas" w:cs="Times New Roman"/>
+          <w:color w:val="D4D4D4"/>
+          <w:sz w:val="16"/>
+          <w:szCs w:val="16"/>
+          <w:lang w:eastAsia="zh-CN"/>
+        </w:rPr>
+        <w:t>}}</w:t>
       </w:r>
       <w:r>
         <w:rPr>
@@ -2148,8 +4199,31 @@
           <w:szCs w:val="16"/>
           <w:lang w:eastAsia="zh-CN"/>
         </w:rPr>
-        <w:t xml:space="preserve">    // Right_stop</w:t>
-      </w:r>
+        <w:t xml:space="preserve">   </w:t>
+      </w:r>
+      <w:proofErr w:type="gramEnd"/>
+      <w:r>
+        <w:rPr>
+          <w:rFonts w:ascii="Consolas" w:eastAsia="Times New Roman" w:hAnsi="Consolas" w:cs="Times New Roman"/>
+          <w:color w:val="6A9955"/>
+          <w:sz w:val="16"/>
+          <w:szCs w:val="16"/>
+          <w:lang w:eastAsia="zh-CN"/>
+        </w:rPr>
+        <w:t xml:space="preserve"> // </w:t>
+      </w:r>
+      <w:proofErr w:type="spellStart"/>
+      <w:r>
+        <w:rPr>
+          <w:rFonts w:ascii="Consolas" w:eastAsia="Times New Roman" w:hAnsi="Consolas" w:cs="Times New Roman"/>
+          <w:color w:val="6A9955"/>
+          <w:sz w:val="16"/>
+          <w:szCs w:val="16"/>
+          <w:lang w:eastAsia="zh-CN"/>
+        </w:rPr>
+        <w:t>Right_stop</w:t>
+      </w:r>
+      <w:proofErr w:type="spellEnd"/>
     </w:p>
     <w:p>
       <w:pPr>
@@ -2305,7 +4379,29 @@
           <w:lang w:val="en-US"/>
         </w:rPr>
         <w:lastRenderedPageBreak/>
-        <w:t>It acts as an indicator LED to visually show that the routine is actively running as long as the LED is toggling off and on, it helps to monitor the system activity in real time.</w:t>
+        <w:t xml:space="preserve">It acts as an indicator LED to visually show that the routine is actively running </w:t>
+      </w:r>
+      <w:proofErr w:type="gramStart"/>
+      <w:r>
+        <w:rPr>
+          <w:rFonts w:ascii="Arial" w:hAnsi="Arial" w:cs="Arial"/>
+          <w:color w:val="FF0000"/>
+          <w:sz w:val="20"/>
+          <w:szCs w:val="20"/>
+          <w:lang w:val="en-US"/>
+        </w:rPr>
+        <w:t>as long as</w:t>
+      </w:r>
+      <w:proofErr w:type="gramEnd"/>
+      <w:r>
+        <w:rPr>
+          <w:rFonts w:ascii="Arial" w:hAnsi="Arial" w:cs="Arial"/>
+          <w:color w:val="FF0000"/>
+          <w:sz w:val="20"/>
+          <w:szCs w:val="20"/>
+          <w:lang w:val="en-US"/>
+        </w:rPr>
+        <w:t xml:space="preserve"> the LED is toggling off and on, it helps to monitor the system activity in real time.</w:t>
       </w:r>
       <w:r>
         <w:rPr>

</xml_diff>

<commit_message>
Final changes to q6 of lab2
</commit_message>
<xml_diff>
--- a/SC2107/LabHandout/SC2107-Lab2-Handoutv4M.docx
+++ b/SC2107/LabHandout/SC2107-Lab2-Handoutv4M.docx
@@ -99,29 +99,7 @@
           <w:u w:val="single"/>
           <w:lang w:val="en-US"/>
         </w:rPr>
-        <w:t xml:space="preserve">to be submitted to </w:t>
-      </w:r>
-      <w:proofErr w:type="spellStart"/>
-      <w:r>
-        <w:rPr>
-          <w:rFonts w:ascii="Arial" w:hAnsi="Arial" w:cs="Arial"/>
-          <w:sz w:val="20"/>
-          <w:szCs w:val="20"/>
-          <w:u w:val="single"/>
-          <w:lang w:val="en-US"/>
-        </w:rPr>
-        <w:t>NTULearn</w:t>
-      </w:r>
-      <w:proofErr w:type="spellEnd"/>
-      <w:r>
-        <w:rPr>
-          <w:rFonts w:ascii="Arial" w:hAnsi="Arial" w:cs="Arial"/>
-          <w:sz w:val="20"/>
-          <w:szCs w:val="20"/>
-          <w:u w:val="single"/>
-          <w:lang w:val="en-US"/>
-        </w:rPr>
-        <w:t xml:space="preserve"> before next lab</w:t>
+        <w:t>to be submitted to NTULearn before next lab</w:t>
       </w:r>
       <w:r>
         <w:rPr>
@@ -259,17 +237,7 @@
           <w:szCs w:val="20"/>
           <w:lang w:val="en-US"/>
         </w:rPr>
-        <w:t xml:space="preserve">  Date</w:t>
-      </w:r>
-      <w:proofErr w:type="gramStart"/>
-      <w:r>
-        <w:rPr>
-          <w:rFonts w:ascii="Arial" w:hAnsi="Arial" w:cs="Arial"/>
-          <w:sz w:val="20"/>
-          <w:szCs w:val="20"/>
-          <w:lang w:val="en-US"/>
-        </w:rPr>
-        <w:t xml:space="preserve">: </w:t>
+        <w:t xml:space="preserve">  Date: </w:t>
       </w:r>
       <w:r>
         <w:rPr>
@@ -289,18 +257,7 @@
           <w:u w:val="single"/>
           <w:lang w:val="en-US"/>
         </w:rPr>
-        <w:t>12</w:t>
-      </w:r>
-      <w:proofErr w:type="gramEnd"/>
-      <w:r>
-        <w:rPr>
-          <w:rFonts w:ascii="Arial" w:hAnsi="Arial" w:cs="Arial"/>
-          <w:sz w:val="20"/>
-          <w:szCs w:val="20"/>
-          <w:u w:val="single"/>
-          <w:lang w:val="en-US"/>
-        </w:rPr>
-        <w:t>/9/2025</w:t>
+        <w:t>12/9/2025</w:t>
       </w:r>
     </w:p>
     <w:p>
@@ -458,47 +415,7 @@
           <w:szCs w:val="20"/>
           <w:lang w:val="en-US"/>
         </w:rPr>
-        <w:t xml:space="preserve">Section 6.2. Which parameter do you need to tweak in the </w:t>
-      </w:r>
-      <w:proofErr w:type="spellStart"/>
-      <w:r>
-        <w:rPr>
-          <w:rFonts w:ascii="Arial" w:hAnsi="Arial" w:cs="Arial"/>
-          <w:sz w:val="20"/>
-          <w:szCs w:val="20"/>
-          <w:lang w:val="en-US"/>
-        </w:rPr>
-        <w:t>Reflectance_</w:t>
-      </w:r>
-      <w:proofErr w:type="gramStart"/>
-      <w:r>
-        <w:rPr>
-          <w:rFonts w:ascii="Arial" w:hAnsi="Arial" w:cs="Arial"/>
-          <w:sz w:val="20"/>
-          <w:szCs w:val="20"/>
-          <w:lang w:val="en-US"/>
-        </w:rPr>
-        <w:t>Read</w:t>
-      </w:r>
-      <w:proofErr w:type="spellEnd"/>
-      <w:r>
-        <w:rPr>
-          <w:rFonts w:ascii="Arial" w:hAnsi="Arial" w:cs="Arial"/>
-          <w:sz w:val="20"/>
-          <w:szCs w:val="20"/>
-          <w:lang w:val="en-US"/>
-        </w:rPr>
-        <w:t>(</w:t>
-      </w:r>
-      <w:proofErr w:type="gramEnd"/>
-      <w:r>
-        <w:rPr>
-          <w:rFonts w:ascii="Arial" w:hAnsi="Arial" w:cs="Arial"/>
-          <w:sz w:val="20"/>
-          <w:szCs w:val="20"/>
-          <w:lang w:val="en-US"/>
-        </w:rPr>
-        <w:t>) if the reflectance sensor reading is not accurate? Hint: check the 8 steps for Reflectance reading.</w:t>
+        <w:t>Section 6.2. Which parameter do you need to tweak in the Reflectance_Read() if the reflectance sensor reading is not accurate? Hint: check the 8 steps for Reflectance reading.</w:t>
       </w:r>
     </w:p>
     <w:p>
@@ -523,29 +440,7 @@
           <w:szCs w:val="20"/>
           <w:lang w:val="en-US"/>
         </w:rPr>
-        <w:t xml:space="preserve">It’s the </w:t>
-      </w:r>
-      <w:proofErr w:type="gramStart"/>
-      <w:r>
-        <w:rPr>
-          <w:rFonts w:ascii="Arial" w:hAnsi="Arial" w:cs="Arial"/>
-          <w:color w:val="FF0000"/>
-          <w:sz w:val="20"/>
-          <w:szCs w:val="20"/>
-          <w:lang w:val="en-US"/>
-        </w:rPr>
-        <w:t>wait</w:t>
-      </w:r>
-      <w:proofErr w:type="gramEnd"/>
-      <w:r>
-        <w:rPr>
-          <w:rFonts w:ascii="Arial" w:hAnsi="Arial" w:cs="Arial"/>
-          <w:color w:val="FF0000"/>
-          <w:sz w:val="20"/>
-          <w:szCs w:val="20"/>
-          <w:lang w:val="en-US"/>
-        </w:rPr>
-        <w:t xml:space="preserve"> time between changing P7 to input and capturing the input data from P7. Depending on the wait time between them, it controls how much the capacitor can discharge before being recorded. The difference between a black and white surface might blur out if the wait time is too short or long.</w:t>
+        <w:t>It’s the wait time between changing P7 to input and capturing the input data from P7. Depending on the wait time between them, it controls how much the capacitor can discharge before being recorded. The difference between a black and white surface might blur out if the wait time is too short or long.</w:t>
       </w:r>
       <w:r>
         <w:rPr>
@@ -628,19 +523,8 @@
           <w:sz w:val="20"/>
           <w:szCs w:val="20"/>
         </w:rPr>
-        <w:t>P7-&gt;DIR &amp;= ~</w:t>
-      </w:r>
-      <w:proofErr w:type="gramStart"/>
-      <w:r>
-        <w:rPr>
-          <w:rFonts w:ascii="Arial" w:hAnsi="Arial" w:cs="Arial"/>
-          <w:color w:val="FF0000"/>
-          <w:sz w:val="20"/>
-          <w:szCs w:val="20"/>
-        </w:rPr>
-        <w:t>0x04;</w:t>
-      </w:r>
-      <w:proofErr w:type="gramEnd"/>
+        <w:t>P7-&gt;DIR &amp;= ~0x04;</w:t>
+      </w:r>
     </w:p>
     <w:p>
       <w:pPr>
@@ -662,19 +546,8 @@
           <w:sz w:val="20"/>
           <w:szCs w:val="20"/>
         </w:rPr>
-        <w:t>P7-&gt;SEL0 &amp;= ~</w:t>
-      </w:r>
-      <w:proofErr w:type="gramStart"/>
-      <w:r>
-        <w:rPr>
-          <w:rFonts w:ascii="Arial" w:hAnsi="Arial" w:cs="Arial"/>
-          <w:color w:val="FF0000"/>
-          <w:sz w:val="20"/>
-          <w:szCs w:val="20"/>
-        </w:rPr>
-        <w:t>0x04;</w:t>
-      </w:r>
-      <w:proofErr w:type="gramEnd"/>
+        <w:t>P7-&gt;SEL0 &amp;= ~0x04;</w:t>
+      </w:r>
     </w:p>
     <w:p>
       <w:pPr>
@@ -696,19 +569,8 @@
           <w:sz w:val="20"/>
           <w:szCs w:val="20"/>
         </w:rPr>
-        <w:t>P7-&gt; SEL1 &amp;= ~</w:t>
-      </w:r>
-      <w:proofErr w:type="gramStart"/>
-      <w:r>
-        <w:rPr>
-          <w:rFonts w:ascii="Arial" w:hAnsi="Arial" w:cs="Arial"/>
-          <w:color w:val="FF0000"/>
-          <w:sz w:val="20"/>
-          <w:szCs w:val="20"/>
-        </w:rPr>
-        <w:t>0x04;</w:t>
-      </w:r>
-      <w:proofErr w:type="gramEnd"/>
+        <w:t>P7-&gt; SEL1 &amp;= ~0x04;</w:t>
+      </w:r>
     </w:p>
     <w:p>
       <w:pPr>
@@ -731,19 +593,8 @@
           <w:sz w:val="20"/>
           <w:szCs w:val="20"/>
         </w:rPr>
-        <w:t>P7-&gt;REN &amp;= ~</w:t>
-      </w:r>
-      <w:proofErr w:type="gramStart"/>
-      <w:r>
-        <w:rPr>
-          <w:rFonts w:ascii="Arial" w:hAnsi="Arial" w:cs="Arial"/>
-          <w:color w:val="FF0000"/>
-          <w:sz w:val="20"/>
-          <w:szCs w:val="20"/>
-        </w:rPr>
-        <w:t>0x04;</w:t>
-      </w:r>
-      <w:proofErr w:type="gramEnd"/>
+        <w:t>P7-&gt;REN &amp;= ~0x04;</w:t>
+      </w:r>
     </w:p>
     <w:p>
       <w:pPr>
@@ -778,27 +629,15 @@
           <w:lang w:val="en-US"/>
         </w:rPr>
       </w:pPr>
-      <w:proofErr w:type="spellStart"/>
-      <w:r>
-        <w:rPr>
-          <w:rFonts w:ascii="Arial" w:hAnsi="Arial" w:cs="Arial"/>
-          <w:sz w:val="20"/>
-          <w:szCs w:val="20"/>
-          <w:lang w:val="en-US"/>
-        </w:rPr>
-        <w:t>Secton</w:t>
-      </w:r>
-      <w:proofErr w:type="spellEnd"/>
-      <w:r>
-        <w:rPr>
-          <w:rFonts w:ascii="Arial" w:hAnsi="Arial" w:cs="Arial"/>
-          <w:sz w:val="20"/>
-          <w:szCs w:val="20"/>
-          <w:lang w:val="en-US"/>
-        </w:rPr>
-        <w:t xml:space="preserve"> 6.3. What is the value returned by the </w:t>
-      </w:r>
-      <w:proofErr w:type="spellStart"/>
+      <w:r>
+        <w:rPr>
+          <w:rFonts w:ascii="Arial" w:hAnsi="Arial" w:cs="Arial"/>
+          <w:sz w:val="20"/>
+          <w:szCs w:val="20"/>
+          <w:lang w:val="en-US"/>
+        </w:rPr>
+        <w:t xml:space="preserve">Secton 6.3. What is the value returned by the </w:t>
+      </w:r>
       <w:r>
         <w:rPr>
           <w:rFonts w:ascii="Arial" w:eastAsia="Arial,Bold" w:hAnsi="Arial" w:cs="Arial"/>
@@ -806,37 +645,7 @@
           <w:szCs w:val="20"/>
           <w:lang w:eastAsia="en-SG"/>
         </w:rPr>
-        <w:t>Reflectance_</w:t>
-      </w:r>
-      <w:proofErr w:type="gramStart"/>
-      <w:r>
-        <w:rPr>
-          <w:rFonts w:ascii="Arial" w:eastAsia="Arial,Bold" w:hAnsi="Arial" w:cs="Arial"/>
-          <w:sz w:val="20"/>
-          <w:szCs w:val="20"/>
-          <w:lang w:eastAsia="en-SG"/>
-        </w:rPr>
-        <w:t>Position</w:t>
-      </w:r>
-      <w:proofErr w:type="spellEnd"/>
-      <w:r>
-        <w:rPr>
-          <w:rFonts w:ascii="Arial" w:eastAsia="Arial,Bold" w:hAnsi="Arial" w:cs="Arial"/>
-          <w:sz w:val="20"/>
-          <w:szCs w:val="20"/>
-          <w:lang w:eastAsia="en-SG"/>
-        </w:rPr>
-        <w:t>(</w:t>
-      </w:r>
-      <w:proofErr w:type="gramEnd"/>
-      <w:r>
-        <w:rPr>
-          <w:rFonts w:ascii="Arial" w:eastAsia="Arial,Bold" w:hAnsi="Arial" w:cs="Arial"/>
-          <w:sz w:val="20"/>
-          <w:szCs w:val="20"/>
-          <w:lang w:eastAsia="en-SG"/>
-        </w:rPr>
-        <w:t>)</w:t>
+        <w:t>Reflectance_Position()</w:t>
       </w:r>
       <w:r>
         <w:rPr>
@@ -947,51 +756,7 @@
           <w:szCs w:val="20"/>
           <w:lang w:val="en-US"/>
         </w:rPr>
-        <w:t xml:space="preserve"> of W are signed and the value returned is also signed. </w:t>
-      </w:r>
-      <w:proofErr w:type="gramStart"/>
-      <w:r>
-        <w:rPr>
-          <w:rFonts w:ascii="Arial" w:hAnsi="Arial" w:cs="Arial"/>
-          <w:color w:val="FF0000"/>
-          <w:sz w:val="20"/>
-          <w:szCs w:val="20"/>
-          <w:lang w:val="en-US"/>
-        </w:rPr>
-        <w:t>Thus</w:t>
-      </w:r>
-      <w:proofErr w:type="gramEnd"/>
-      <w:r>
-        <w:rPr>
-          <w:rFonts w:ascii="Arial" w:hAnsi="Arial" w:cs="Arial"/>
-          <w:color w:val="FF0000"/>
-          <w:sz w:val="20"/>
-          <w:szCs w:val="20"/>
-          <w:lang w:val="en-US"/>
-        </w:rPr>
-        <w:t xml:space="preserve"> the corresponding sensors on each side have equal magnitude but opposite signs, which </w:t>
-      </w:r>
-      <w:proofErr w:type="gramStart"/>
-      <w:r>
-        <w:rPr>
-          <w:rFonts w:ascii="Arial" w:hAnsi="Arial" w:cs="Arial"/>
-          <w:color w:val="FF0000"/>
-          <w:sz w:val="20"/>
-          <w:szCs w:val="20"/>
-          <w:lang w:val="en-US"/>
-        </w:rPr>
-        <w:t>cancels</w:t>
-      </w:r>
-      <w:proofErr w:type="gramEnd"/>
-      <w:r>
-        <w:rPr>
-          <w:rFonts w:ascii="Arial" w:hAnsi="Arial" w:cs="Arial"/>
-          <w:color w:val="FF0000"/>
-          <w:sz w:val="20"/>
-          <w:szCs w:val="20"/>
-          <w:lang w:val="en-US"/>
-        </w:rPr>
-        <w:t xml:space="preserve"> each other out. </w:t>
+        <w:t xml:space="preserve"> of W are signed and the value returned is also signed. Thus the corresponding sensors on each side have equal magnitude but opposite signs, which cancels each other out. </w:t>
       </w:r>
     </w:p>
     <w:p>
@@ -1078,7 +843,6 @@
         </w:rPr>
         <w:t xml:space="preserve"> </w:t>
       </w:r>
-      <w:proofErr w:type="spellStart"/>
       <w:r>
         <w:rPr>
           <w:rFonts w:ascii="Arial" w:eastAsia="Arial,Bold" w:hAnsi="Arial" w:cs="Arial"/>
@@ -1086,37 +850,7 @@
           <w:szCs w:val="20"/>
           <w:lang w:eastAsia="en-SG"/>
         </w:rPr>
-        <w:t>Reflectance_</w:t>
-      </w:r>
-      <w:proofErr w:type="gramStart"/>
-      <w:r>
-        <w:rPr>
-          <w:rFonts w:ascii="Arial" w:eastAsia="Arial,Bold" w:hAnsi="Arial" w:cs="Arial"/>
-          <w:sz w:val="20"/>
-          <w:szCs w:val="20"/>
-          <w:lang w:eastAsia="en-SG"/>
-        </w:rPr>
-        <w:t>Position</w:t>
-      </w:r>
-      <w:proofErr w:type="spellEnd"/>
-      <w:r>
-        <w:rPr>
-          <w:rFonts w:ascii="Arial" w:eastAsia="Arial,Bold" w:hAnsi="Arial" w:cs="Arial"/>
-          <w:sz w:val="20"/>
-          <w:szCs w:val="20"/>
-          <w:lang w:eastAsia="en-SG"/>
-        </w:rPr>
-        <w:t>(</w:t>
-      </w:r>
-      <w:proofErr w:type="gramEnd"/>
-      <w:r>
-        <w:rPr>
-          <w:rFonts w:ascii="Arial" w:eastAsia="Arial,Bold" w:hAnsi="Arial" w:cs="Arial"/>
-          <w:sz w:val="20"/>
-          <w:szCs w:val="20"/>
-          <w:lang w:eastAsia="en-SG"/>
-        </w:rPr>
-        <w:t>)</w:t>
+        <w:t>Reflectance_Position()</w:t>
       </w:r>
       <w:r>
         <w:rPr>
@@ -1150,29 +884,7 @@
           <w:szCs w:val="20"/>
           <w:lang w:val="en-US"/>
         </w:rPr>
-        <w:t xml:space="preserve">Offset </w:t>
-      </w:r>
-      <w:proofErr w:type="gramStart"/>
-      <w:r>
-        <w:rPr>
-          <w:rFonts w:ascii="Arial" w:hAnsi="Arial" w:cs="Arial"/>
-          <w:color w:val="FF0000"/>
-          <w:sz w:val="20"/>
-          <w:szCs w:val="20"/>
-          <w:lang w:val="en-US"/>
-        </w:rPr>
-        <w:t>error</w:t>
-      </w:r>
-      <w:proofErr w:type="gramEnd"/>
-      <w:r>
-        <w:rPr>
-          <w:rFonts w:ascii="Arial" w:hAnsi="Arial" w:cs="Arial"/>
-          <w:color w:val="FF0000"/>
-          <w:sz w:val="20"/>
-          <w:szCs w:val="20"/>
-          <w:lang w:val="en-US"/>
-        </w:rPr>
-        <w:t xml:space="preserve"> come from the physical positioning or geometry of the sensor array where they are discrete spacing between detectors and line width mismatch between sensor width. Non ideal reflectivity timing as it is manually set. These cause the estimated distance to shift relative to true distance.</w:t>
+        <w:t>Offset error come from the physical positioning or geometry of the sensor array where they are discrete spacing between detectors and line width mismatch between sensor width. Non ideal reflectivity timing as it is manually set. These cause the estimated distance to shift relative to true distance.</w:t>
       </w:r>
     </w:p>
     <w:p>
@@ -1302,6 +1014,121 @@
           <w:szCs w:val="20"/>
         </w:rPr>
         <w:lastRenderedPageBreak/>
+        <mc:AlternateContent>
+          <mc:Choice Requires="wpi">
+            <w:drawing>
+              <wp:anchor distT="0" distB="0" distL="114300" distR="114300" simplePos="0" relativeHeight="251692032" behindDoc="0" locked="0" layoutInCell="1" allowOverlap="1" wp14:anchorId="27910F6D" wp14:editId="4E5B9796">
+                <wp:simplePos x="0" y="0"/>
+                <wp:positionH relativeFrom="column">
+                  <wp:posOffset>647700</wp:posOffset>
+                </wp:positionH>
+                <wp:positionV relativeFrom="paragraph">
+                  <wp:posOffset>776605</wp:posOffset>
+                </wp:positionV>
+                <wp:extent cx="3209040" cy="1203450"/>
+                <wp:effectExtent l="38100" t="38100" r="48895" b="34925"/>
+                <wp:wrapNone/>
+                <wp:docPr id="728980168" name="Ink 61"/>
+                <wp:cNvGraphicFramePr/>
+                <a:graphic xmlns:a="http://schemas.openxmlformats.org/drawingml/2006/main">
+                  <a:graphicData uri="http://schemas.microsoft.com/office/word/2010/wordprocessingInk">
+                    <w14:contentPart bwMode="auto" r:id="rId7">
+                      <w14:nvContentPartPr>
+                        <w14:cNvContentPartPr/>
+                      </w14:nvContentPartPr>
+                      <w14:xfrm>
+                        <a:off x="0" y="0"/>
+                        <a:ext cx="3209040" cy="1203450"/>
+                      </w14:xfrm>
+                    </w14:contentPart>
+                  </a:graphicData>
+                </a:graphic>
+              </wp:anchor>
+            </w:drawing>
+          </mc:Choice>
+          <mc:Fallback>
+            <w:pict>
+              <v:shapetype w14:anchorId="6450D22F" id="_x0000_t75" coordsize="21600,21600" o:spt="75" o:preferrelative="t" path="m@4@5l@4@11@9@11@9@5xe" filled="f" stroked="f">
+                <v:stroke joinstyle="miter"/>
+                <v:formulas>
+                  <v:f eqn="if lineDrawn pixelLineWidth 0"/>
+                  <v:f eqn="sum @0 1 0"/>
+                  <v:f eqn="sum 0 0 @1"/>
+                  <v:f eqn="prod @2 1 2"/>
+                  <v:f eqn="prod @3 21600 pixelWidth"/>
+                  <v:f eqn="prod @3 21600 pixelHeight"/>
+                  <v:f eqn="sum @0 0 1"/>
+                  <v:f eqn="prod @6 1 2"/>
+                  <v:f eqn="prod @7 21600 pixelWidth"/>
+                  <v:f eqn="sum @8 21600 0"/>
+                  <v:f eqn="prod @7 21600 pixelHeight"/>
+                  <v:f eqn="sum @10 21600 0"/>
+                </v:formulas>
+                <v:path o:extrusionok="f" gradientshapeok="t" o:connecttype="rect"/>
+                <o:lock v:ext="edit" aspectratio="t"/>
+              </v:shapetype>
+              <v:shape id="Ink 61" o:spid="_x0000_s1026" type="#_x0000_t75" style="position:absolute;margin-left:50.5pt;margin-top:60.65pt;width:253.7pt;height:95.7pt;z-index:251692032;visibility:visible;mso-wrap-style:square;mso-wrap-distance-left:9pt;mso-wrap-distance-top:0;mso-wrap-distance-right:9pt;mso-wrap-distance-bottom:0;mso-position-horizontal:absolute;mso-position-horizontal-relative:text;mso-position-vertical:absolute;mso-position-vertical-relative:text" o:gfxdata="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">
+                <v:imagedata r:id="rId8" o:title=""/>
+              </v:shape>
+            </w:pict>
+          </mc:Fallback>
+        </mc:AlternateContent>
+      </w:r>
+      <w:r>
+        <w:rPr>
+          <w:rFonts w:ascii="Arial" w:hAnsi="Arial" w:cs="Arial"/>
+          <w:noProof/>
+          <w:sz w:val="20"/>
+          <w:szCs w:val="20"/>
+        </w:rPr>
+        <mc:AlternateContent>
+          <mc:Choice Requires="wpi">
+            <w:drawing>
+              <wp:anchor distT="0" distB="0" distL="114300" distR="114300" simplePos="0" relativeHeight="251659264" behindDoc="0" locked="0" layoutInCell="1" allowOverlap="1" wp14:anchorId="14F6F437" wp14:editId="473B701A">
+                <wp:simplePos x="0" y="0"/>
+                <wp:positionH relativeFrom="column">
+                  <wp:posOffset>723765</wp:posOffset>
+                </wp:positionH>
+                <wp:positionV relativeFrom="paragraph">
+                  <wp:posOffset>431490</wp:posOffset>
+                </wp:positionV>
+                <wp:extent cx="3065760" cy="383400"/>
+                <wp:effectExtent l="38100" t="38100" r="20955" b="36195"/>
+                <wp:wrapNone/>
+                <wp:docPr id="742886871" name="Ink 5"/>
+                <wp:cNvGraphicFramePr/>
+                <a:graphic xmlns:a="http://schemas.openxmlformats.org/drawingml/2006/main">
+                  <a:graphicData uri="http://schemas.microsoft.com/office/word/2010/wordprocessingInk">
+                    <w14:contentPart bwMode="auto" r:id="rId9">
+                      <w14:nvContentPartPr>
+                        <w14:cNvContentPartPr/>
+                      </w14:nvContentPartPr>
+                      <w14:xfrm>
+                        <a:off x="0" y="0"/>
+                        <a:ext cx="3065760" cy="383400"/>
+                      </w14:xfrm>
+                    </w14:contentPart>
+                  </a:graphicData>
+                </a:graphic>
+              </wp:anchor>
+            </w:drawing>
+          </mc:Choice>
+          <mc:Fallback>
+            <w:pict>
+              <v:shape w14:anchorId="36FFAD63" id="Ink 5" o:spid="_x0000_s1026" type="#_x0000_t75" style="position:absolute;margin-left:56.5pt;margin-top:33.5pt;width:242.4pt;height:31.2pt;z-index:251659264;visibility:visible;mso-wrap-style:square;mso-wrap-distance-left:9pt;mso-wrap-distance-top:0;mso-wrap-distance-right:9pt;mso-wrap-distance-bottom:0;mso-position-horizontal:absolute;mso-position-horizontal-relative:text;mso-position-vertical:absolute;mso-position-vertical-relative:text" o:gfxdata="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">
+                <v:imagedata r:id="rId10" o:title=""/>
+              </v:shape>
+            </w:pict>
+          </mc:Fallback>
+        </mc:AlternateContent>
+      </w:r>
+      <w:r>
+        <w:rPr>
+          <w:rFonts w:ascii="Arial" w:hAnsi="Arial" w:cs="Arial"/>
+          <w:noProof/>
+          <w:sz w:val="20"/>
+          <w:szCs w:val="20"/>
+        </w:rPr>
         <w:drawing>
           <wp:inline distT="0" distB="0" distL="0" distR="0" wp14:anchorId="6A5B4655" wp14:editId="00EF5DEF">
             <wp:extent cx="4730993" cy="2101958"/>
@@ -1318,7 +1145,7 @@
                     <pic:cNvPicPr/>
                   </pic:nvPicPr>
                   <pic:blipFill>
-                    <a:blip r:embed="rId7"/>
+                    <a:blip r:embed="rId11"/>
                     <a:stretch>
                       <a:fillRect/>
                     </a:stretch>
@@ -1356,9 +1183,8 @@
           <w:sz w:val="20"/>
           <w:szCs w:val="20"/>
         </w:rPr>
-        <w:t xml:space="preserve">The motor inputs will be pulsing between </w:t>
-      </w:r>
-      <w:proofErr w:type="spellStart"/>
+        <w:t>The motor inputs will be pulsing between center and left output from the sensors</w:t>
+      </w:r>
       <w:r>
         <w:rPr>
           <w:rFonts w:ascii="Arial" w:hAnsi="Arial" w:cs="Arial"/>
@@ -1366,9 +1192,8 @@
           <w:sz w:val="20"/>
           <w:szCs w:val="20"/>
         </w:rPr>
-        <w:t>center</w:t>
-      </w:r>
-      <w:proofErr w:type="spellEnd"/>
+        <w:t>, which mean 11 and 10 respectively</w:t>
+      </w:r>
       <w:r>
         <w:rPr>
           <w:rFonts w:ascii="Arial" w:hAnsi="Arial" w:cs="Arial"/>
@@ -1376,7 +1201,43 @@
           <w:sz w:val="20"/>
           <w:szCs w:val="20"/>
         </w:rPr>
-        <w:t xml:space="preserve"> and left output from the sensors. The right wheel will toggle between slower or same as the left wheel as the FSM would constantly toggle between trying to turn right and not turning.</w:t>
+        <w:t xml:space="preserve">. The right wheel will </w:t>
+      </w:r>
+      <w:r>
+        <w:rPr>
+          <w:rFonts w:ascii="Arial" w:hAnsi="Arial" w:cs="Arial"/>
+          <w:color w:val="FF0000"/>
+          <w:sz w:val="20"/>
+          <w:szCs w:val="20"/>
+        </w:rPr>
+        <w:t xml:space="preserve">move </w:t>
+      </w:r>
+      <w:r>
+        <w:rPr>
+          <w:rFonts w:ascii="Arial" w:hAnsi="Arial" w:cs="Arial"/>
+          <w:color w:val="FF0000"/>
+          <w:sz w:val="20"/>
+          <w:szCs w:val="20"/>
+        </w:rPr>
+        <w:t xml:space="preserve">slower </w:t>
+      </w:r>
+      <w:r>
+        <w:rPr>
+          <w:rFonts w:ascii="Arial" w:hAnsi="Arial" w:cs="Arial"/>
+          <w:color w:val="FF0000"/>
+          <w:sz w:val="20"/>
+          <w:szCs w:val="20"/>
+        </w:rPr>
+        <w:t xml:space="preserve">than </w:t>
+      </w:r>
+      <w:r>
+        <w:rPr>
+          <w:rFonts w:ascii="Arial" w:hAnsi="Arial" w:cs="Arial"/>
+          <w:color w:val="FF0000"/>
+          <w:sz w:val="20"/>
+          <w:szCs w:val="20"/>
+        </w:rPr>
+        <w:t>the left wheel as the FSM would constantly toggle between trying to turn right and not turning.</w:t>
       </w:r>
     </w:p>
     <w:p>
@@ -1504,7 +1365,7 @@
                     <pic:cNvPicPr/>
                   </pic:nvPicPr>
                   <pic:blipFill>
-                    <a:blip r:embed="rId8"/>
+                    <a:blip r:embed="rId12"/>
                     <a:stretch>
                       <a:fillRect/>
                     </a:stretch>
@@ -1570,7 +1431,6 @@
           <w:lang w:eastAsia="zh-CN"/>
         </w:rPr>
       </w:pPr>
-      <w:proofErr w:type="spellStart"/>
       <w:r>
         <w:rPr>
           <w:rFonts w:ascii="Consolas" w:eastAsia="Times New Roman" w:hAnsi="Consolas" w:cs="Times New Roman"/>
@@ -1581,7 +1441,6 @@
         </w:rPr>
         <w:t>State_t</w:t>
       </w:r>
-      <w:proofErr w:type="spellEnd"/>
       <w:r>
         <w:rPr>
           <w:rFonts w:ascii="Consolas" w:eastAsia="Times New Roman" w:hAnsi="Consolas" w:cs="Times New Roman"/>
@@ -1592,8 +1451,6 @@
         </w:rPr>
         <w:t xml:space="preserve"> </w:t>
       </w:r>
-      <w:proofErr w:type="spellStart"/>
-      <w:proofErr w:type="gramStart"/>
       <w:r>
         <w:rPr>
           <w:rFonts w:ascii="Consolas" w:eastAsia="Times New Roman" w:hAnsi="Consolas" w:cs="Times New Roman"/>
@@ -1604,7 +1461,6 @@
         </w:rPr>
         <w:t>fsm</w:t>
       </w:r>
-      <w:proofErr w:type="spellEnd"/>
       <w:r>
         <w:rPr>
           <w:rFonts w:ascii="Consolas" w:eastAsia="Times New Roman" w:hAnsi="Consolas" w:cs="Times New Roman"/>
@@ -1633,18 +1489,7 @@
           <w:szCs w:val="16"/>
           <w:lang w:eastAsia="zh-CN"/>
         </w:rPr>
-        <w:t>]=</w:t>
-      </w:r>
-      <w:proofErr w:type="gramEnd"/>
-      <w:r>
-        <w:rPr>
-          <w:rFonts w:ascii="Consolas" w:eastAsia="Times New Roman" w:hAnsi="Consolas" w:cs="Times New Roman"/>
-          <w:color w:val="D4D4D4"/>
-          <w:sz w:val="16"/>
-          <w:szCs w:val="16"/>
-          <w:lang w:eastAsia="zh-CN"/>
-        </w:rPr>
-        <w:t>{</w:t>
+        <w:t>]={</w:t>
       </w:r>
     </w:p>
     <w:p>
@@ -1682,9 +1527,18 @@
           <w:szCs w:val="16"/>
           <w:lang w:eastAsia="zh-CN"/>
         </w:rPr>
-        <w:t>0x</w:t>
-      </w:r>
-      <w:proofErr w:type="gramStart"/>
+        <w:t>0x03</w:t>
+      </w:r>
+      <w:r>
+        <w:rPr>
+          <w:rFonts w:ascii="Consolas" w:eastAsia="Times New Roman" w:hAnsi="Consolas" w:cs="Times New Roman"/>
+          <w:color w:val="D4D4D4"/>
+          <w:sz w:val="16"/>
+          <w:szCs w:val="16"/>
+          <w:lang w:eastAsia="zh-CN"/>
+        </w:rPr>
+        <w:t>,  </w:t>
+      </w:r>
       <w:r>
         <w:rPr>
           <w:rFonts w:ascii="Consolas" w:eastAsia="Times New Roman" w:hAnsi="Consolas" w:cs="Times New Roman"/>
@@ -1693,7 +1547,7 @@
           <w:szCs w:val="16"/>
           <w:lang w:eastAsia="zh-CN"/>
         </w:rPr>
-        <w:t>03</w:t>
+        <w:t>500</w:t>
       </w:r>
       <w:r>
         <w:rPr>
@@ -1703,138 +1557,7 @@
           <w:szCs w:val="16"/>
           <w:lang w:eastAsia="zh-CN"/>
         </w:rPr>
-        <w:t>,  </w:t>
-      </w:r>
-      <w:r>
-        <w:rPr>
-          <w:rFonts w:ascii="Consolas" w:eastAsia="Times New Roman" w:hAnsi="Consolas" w:cs="Times New Roman"/>
-          <w:color w:val="B5CEA8"/>
-          <w:sz w:val="16"/>
-          <w:szCs w:val="16"/>
-          <w:lang w:eastAsia="zh-CN"/>
-        </w:rPr>
-        <w:t>500</w:t>
-      </w:r>
-      <w:proofErr w:type="gramEnd"/>
-      <w:r>
-        <w:rPr>
-          <w:rFonts w:ascii="Consolas" w:eastAsia="Times New Roman" w:hAnsi="Consolas" w:cs="Times New Roman"/>
-          <w:color w:val="D4D4D4"/>
-          <w:sz w:val="16"/>
-          <w:szCs w:val="16"/>
-          <w:lang w:eastAsia="zh-CN"/>
-        </w:rPr>
-        <w:t xml:space="preserve">, </w:t>
-      </w:r>
-      <w:proofErr w:type="gramStart"/>
-      <w:r>
-        <w:rPr>
-          <w:rFonts w:ascii="Consolas" w:eastAsia="Times New Roman" w:hAnsi="Consolas" w:cs="Times New Roman"/>
-          <w:color w:val="D4D4D4"/>
-          <w:sz w:val="16"/>
-          <w:szCs w:val="16"/>
-          <w:lang w:eastAsia="zh-CN"/>
-        </w:rPr>
-        <w:t xml:space="preserve">{ Right1,   </w:t>
-      </w:r>
-      <w:proofErr w:type="gramEnd"/>
-      <w:r>
-        <w:rPr>
-          <w:rFonts w:ascii="Consolas" w:eastAsia="Times New Roman" w:hAnsi="Consolas" w:cs="Times New Roman"/>
-          <w:color w:val="D4D4D4"/>
-          <w:sz w:val="16"/>
-          <w:szCs w:val="16"/>
-          <w:lang w:eastAsia="zh-CN"/>
-        </w:rPr>
-        <w:t>      Left</w:t>
-      </w:r>
-      <w:proofErr w:type="gramStart"/>
-      <w:r>
-        <w:rPr>
-          <w:rFonts w:ascii="Consolas" w:eastAsia="Times New Roman" w:hAnsi="Consolas" w:cs="Times New Roman"/>
-          <w:color w:val="D4D4D4"/>
-          <w:sz w:val="16"/>
-          <w:szCs w:val="16"/>
-          <w:lang w:eastAsia="zh-CN"/>
-        </w:rPr>
-        <w:t xml:space="preserve">1,   </w:t>
-      </w:r>
-      <w:proofErr w:type="gramEnd"/>
-      <w:r>
-        <w:rPr>
-          <w:rFonts w:ascii="Consolas" w:eastAsia="Times New Roman" w:hAnsi="Consolas" w:cs="Times New Roman"/>
-          <w:color w:val="D4D4D4"/>
-          <w:sz w:val="16"/>
-          <w:szCs w:val="16"/>
-          <w:lang w:eastAsia="zh-CN"/>
-        </w:rPr>
-        <w:t>   Right</w:t>
-      </w:r>
-      <w:proofErr w:type="gramStart"/>
-      <w:r>
-        <w:rPr>
-          <w:rFonts w:ascii="Consolas" w:eastAsia="Times New Roman" w:hAnsi="Consolas" w:cs="Times New Roman"/>
-          <w:color w:val="D4D4D4"/>
-          <w:sz w:val="16"/>
-          <w:szCs w:val="16"/>
-          <w:lang w:eastAsia="zh-CN"/>
-        </w:rPr>
-        <w:t xml:space="preserve">1,   </w:t>
-      </w:r>
-      <w:proofErr w:type="gramEnd"/>
-      <w:r>
-        <w:rPr>
-          <w:rFonts w:ascii="Consolas" w:eastAsia="Times New Roman" w:hAnsi="Consolas" w:cs="Times New Roman"/>
-          <w:color w:val="D4D4D4"/>
-          <w:sz w:val="16"/>
-          <w:szCs w:val="16"/>
-          <w:lang w:eastAsia="zh-CN"/>
-        </w:rPr>
-        <w:t xml:space="preserve">  </w:t>
-      </w:r>
-      <w:proofErr w:type="spellStart"/>
-      <w:r>
-        <w:rPr>
-          <w:rFonts w:ascii="Consolas" w:eastAsia="Times New Roman" w:hAnsi="Consolas" w:cs="Times New Roman"/>
-          <w:color w:val="D4D4D4"/>
-          <w:sz w:val="16"/>
-          <w:szCs w:val="16"/>
-          <w:lang w:eastAsia="zh-CN"/>
-        </w:rPr>
-        <w:t>Center</w:t>
-      </w:r>
-      <w:proofErr w:type="spellEnd"/>
-      <w:r>
-        <w:rPr>
-          <w:rFonts w:ascii="Consolas" w:eastAsia="Times New Roman" w:hAnsi="Consolas" w:cs="Times New Roman"/>
-          <w:color w:val="D4D4D4"/>
-          <w:sz w:val="16"/>
-          <w:szCs w:val="16"/>
-          <w:lang w:eastAsia="zh-CN"/>
-        </w:rPr>
-        <w:t xml:space="preserve">  </w:t>
-      </w:r>
-      <w:proofErr w:type="gramStart"/>
-      <w:r>
-        <w:rPr>
-          <w:rFonts w:ascii="Consolas" w:eastAsia="Times New Roman" w:hAnsi="Consolas" w:cs="Times New Roman"/>
-          <w:color w:val="D4D4D4"/>
-          <w:sz w:val="16"/>
-          <w:szCs w:val="16"/>
-          <w:lang w:eastAsia="zh-CN"/>
-        </w:rPr>
-        <w:t xml:space="preserve">  }</w:t>
-      </w:r>
-      <w:proofErr w:type="gramEnd"/>
-      <w:r>
-        <w:rPr>
-          <w:rFonts w:ascii="Consolas" w:eastAsia="Times New Roman" w:hAnsi="Consolas" w:cs="Times New Roman"/>
-          <w:color w:val="D4D4D4"/>
-          <w:sz w:val="16"/>
-          <w:szCs w:val="16"/>
-          <w:lang w:eastAsia="zh-CN"/>
-        </w:rPr>
-        <w:t>},</w:t>
+        <w:t>, { Right1,         Left1,      Right1,     Center    }},</w:t>
       </w:r>
       <w:r>
         <w:rPr>
@@ -1844,20 +1567,8 @@
           <w:szCs w:val="16"/>
           <w:lang w:eastAsia="zh-CN"/>
         </w:rPr>
-        <w:t xml:space="preserve">   // </w:t>
-      </w:r>
-      <w:proofErr w:type="spellStart"/>
-      <w:r>
-        <w:rPr>
-          <w:rFonts w:ascii="Consolas" w:eastAsia="Times New Roman" w:hAnsi="Consolas" w:cs="Times New Roman"/>
-          <w:color w:val="6A9955"/>
-          <w:sz w:val="16"/>
-          <w:szCs w:val="16"/>
-          <w:lang w:eastAsia="zh-CN"/>
-        </w:rPr>
-        <w:t>Center</w:t>
-      </w:r>
-      <w:proofErr w:type="spellEnd"/>
+        <w:t xml:space="preserve">   // Center</w:t>
+      </w:r>
     </w:p>
     <w:p>
       <w:pPr>
@@ -1894,9 +1605,18 @@
           <w:szCs w:val="16"/>
           <w:lang w:eastAsia="zh-CN"/>
         </w:rPr>
-        <w:t>0x</w:t>
-      </w:r>
-      <w:proofErr w:type="gramStart"/>
+        <w:t>0x02</w:t>
+      </w:r>
+      <w:r>
+        <w:rPr>
+          <w:rFonts w:ascii="Consolas" w:eastAsia="Times New Roman" w:hAnsi="Consolas" w:cs="Times New Roman"/>
+          <w:color w:val="D4D4D4"/>
+          <w:sz w:val="16"/>
+          <w:szCs w:val="16"/>
+          <w:lang w:eastAsia="zh-CN"/>
+        </w:rPr>
+        <w:t>,  </w:t>
+      </w:r>
       <w:r>
         <w:rPr>
           <w:rFonts w:ascii="Consolas" w:eastAsia="Times New Roman" w:hAnsi="Consolas" w:cs="Times New Roman"/>
@@ -1905,7 +1625,7 @@
           <w:szCs w:val="16"/>
           <w:lang w:eastAsia="zh-CN"/>
         </w:rPr>
-        <w:t>02</w:t>
+        <w:t>500</w:t>
       </w:r>
       <w:r>
         <w:rPr>
@@ -1915,160 +1635,7 @@
           <w:szCs w:val="16"/>
           <w:lang w:eastAsia="zh-CN"/>
         </w:rPr>
-        <w:t>,  </w:t>
-      </w:r>
-      <w:r>
-        <w:rPr>
-          <w:rFonts w:ascii="Consolas" w:eastAsia="Times New Roman" w:hAnsi="Consolas" w:cs="Times New Roman"/>
-          <w:color w:val="B5CEA8"/>
-          <w:sz w:val="16"/>
-          <w:szCs w:val="16"/>
-          <w:lang w:eastAsia="zh-CN"/>
-        </w:rPr>
-        <w:t>500</w:t>
-      </w:r>
-      <w:proofErr w:type="gramEnd"/>
-      <w:r>
-        <w:rPr>
-          <w:rFonts w:ascii="Consolas" w:eastAsia="Times New Roman" w:hAnsi="Consolas" w:cs="Times New Roman"/>
-          <w:color w:val="D4D4D4"/>
-          <w:sz w:val="16"/>
-          <w:szCs w:val="16"/>
-          <w:lang w:eastAsia="zh-CN"/>
-        </w:rPr>
-        <w:t xml:space="preserve">, </w:t>
-      </w:r>
-      <w:proofErr w:type="gramStart"/>
-      <w:r>
-        <w:rPr>
-          <w:rFonts w:ascii="Consolas" w:eastAsia="Times New Roman" w:hAnsi="Consolas" w:cs="Times New Roman"/>
-          <w:color w:val="D4D4D4"/>
-          <w:sz w:val="16"/>
-          <w:szCs w:val="16"/>
-          <w:lang w:eastAsia="zh-CN"/>
-        </w:rPr>
-        <w:t>{ Left</w:t>
-      </w:r>
-      <w:proofErr w:type="gramEnd"/>
-      <w:r>
-        <w:rPr>
-          <w:rFonts w:ascii="Consolas" w:eastAsia="Times New Roman" w:hAnsi="Consolas" w:cs="Times New Roman"/>
-          <w:color w:val="D4D4D4"/>
-          <w:sz w:val="16"/>
-          <w:szCs w:val="16"/>
-          <w:lang w:eastAsia="zh-CN"/>
-        </w:rPr>
-        <w:t>_off</w:t>
-      </w:r>
-      <w:proofErr w:type="gramStart"/>
-      <w:r>
-        <w:rPr>
-          <w:rFonts w:ascii="Consolas" w:eastAsia="Times New Roman" w:hAnsi="Consolas" w:cs="Times New Roman"/>
-          <w:color w:val="D4D4D4"/>
-          <w:sz w:val="16"/>
-          <w:szCs w:val="16"/>
-          <w:lang w:eastAsia="zh-CN"/>
-        </w:rPr>
-        <w:t xml:space="preserve">1,   </w:t>
-      </w:r>
-      <w:proofErr w:type="gramEnd"/>
-      <w:r>
-        <w:rPr>
-          <w:rFonts w:ascii="Consolas" w:eastAsia="Times New Roman" w:hAnsi="Consolas" w:cs="Times New Roman"/>
-          <w:color w:val="D4D4D4"/>
-          <w:sz w:val="16"/>
-          <w:szCs w:val="16"/>
-          <w:lang w:eastAsia="zh-CN"/>
-        </w:rPr>
-        <w:t>   Left</w:t>
-      </w:r>
-      <w:proofErr w:type="gramStart"/>
-      <w:r>
-        <w:rPr>
-          <w:rFonts w:ascii="Consolas" w:eastAsia="Times New Roman" w:hAnsi="Consolas" w:cs="Times New Roman"/>
-          <w:color w:val="D4D4D4"/>
-          <w:sz w:val="16"/>
-          <w:szCs w:val="16"/>
-          <w:lang w:eastAsia="zh-CN"/>
-        </w:rPr>
-        <w:t xml:space="preserve">2,   </w:t>
-      </w:r>
-      <w:proofErr w:type="gramEnd"/>
-      <w:r>
-        <w:rPr>
-          <w:rFonts w:ascii="Consolas" w:eastAsia="Times New Roman" w:hAnsi="Consolas" w:cs="Times New Roman"/>
-          <w:color w:val="D4D4D4"/>
-          <w:sz w:val="16"/>
-          <w:szCs w:val="16"/>
-          <w:lang w:eastAsia="zh-CN"/>
-        </w:rPr>
-        <w:t>   Right</w:t>
-      </w:r>
-      <w:proofErr w:type="gramStart"/>
-      <w:r>
-        <w:rPr>
-          <w:rFonts w:ascii="Consolas" w:eastAsia="Times New Roman" w:hAnsi="Consolas" w:cs="Times New Roman"/>
-          <w:color w:val="D4D4D4"/>
-          <w:sz w:val="16"/>
-          <w:szCs w:val="16"/>
-          <w:lang w:eastAsia="zh-CN"/>
-        </w:rPr>
-        <w:t xml:space="preserve">1,   </w:t>
-      </w:r>
-      <w:proofErr w:type="gramEnd"/>
-      <w:r>
-        <w:rPr>
-          <w:rFonts w:ascii="Consolas" w:eastAsia="Times New Roman" w:hAnsi="Consolas" w:cs="Times New Roman"/>
-          <w:color w:val="D4D4D4"/>
-          <w:sz w:val="16"/>
-          <w:szCs w:val="16"/>
-          <w:lang w:eastAsia="zh-CN"/>
-        </w:rPr>
-        <w:t xml:space="preserve">  </w:t>
-      </w:r>
-      <w:proofErr w:type="spellStart"/>
-      <w:r>
-        <w:rPr>
-          <w:rFonts w:ascii="Consolas" w:eastAsia="Times New Roman" w:hAnsi="Consolas" w:cs="Times New Roman"/>
-          <w:color w:val="D4D4D4"/>
-          <w:sz w:val="16"/>
-          <w:szCs w:val="16"/>
-          <w:lang w:eastAsia="zh-CN"/>
-        </w:rPr>
-        <w:t>Center</w:t>
-      </w:r>
-      <w:proofErr w:type="spellEnd"/>
-      <w:r>
-        <w:rPr>
-          <w:rFonts w:ascii="Consolas" w:eastAsia="Times New Roman" w:hAnsi="Consolas" w:cs="Times New Roman"/>
-          <w:color w:val="D4D4D4"/>
-          <w:sz w:val="16"/>
-          <w:szCs w:val="16"/>
-          <w:lang w:eastAsia="zh-CN"/>
-        </w:rPr>
-        <w:t xml:space="preserve">  </w:t>
-      </w:r>
-      <w:proofErr w:type="gramStart"/>
-      <w:r>
-        <w:rPr>
-          <w:rFonts w:ascii="Consolas" w:eastAsia="Times New Roman" w:hAnsi="Consolas" w:cs="Times New Roman"/>
-          <w:color w:val="D4D4D4"/>
-          <w:sz w:val="16"/>
-          <w:szCs w:val="16"/>
-          <w:lang w:eastAsia="zh-CN"/>
-        </w:rPr>
-        <w:t xml:space="preserve">  }</w:t>
-      </w:r>
-      <w:proofErr w:type="gramEnd"/>
-      <w:r>
-        <w:rPr>
-          <w:rFonts w:ascii="Consolas" w:eastAsia="Times New Roman" w:hAnsi="Consolas" w:cs="Times New Roman"/>
-          <w:color w:val="D4D4D4"/>
-          <w:sz w:val="16"/>
-          <w:szCs w:val="16"/>
-          <w:lang w:eastAsia="zh-CN"/>
-        </w:rPr>
-        <w:t>},</w:t>
+        <w:t>, { Left_off1,      Left2,      Right1,     Center    }},</w:t>
       </w:r>
       <w:r>
         <w:rPr>
@@ -2116,9 +1683,18 @@
           <w:szCs w:val="16"/>
           <w:lang w:eastAsia="zh-CN"/>
         </w:rPr>
-        <w:t>0x</w:t>
-      </w:r>
-      <w:proofErr w:type="gramStart"/>
+        <w:t>0x03</w:t>
+      </w:r>
+      <w:r>
+        <w:rPr>
+          <w:rFonts w:ascii="Consolas" w:eastAsia="Times New Roman" w:hAnsi="Consolas" w:cs="Times New Roman"/>
+          <w:color w:val="D4D4D4"/>
+          <w:sz w:val="16"/>
+          <w:szCs w:val="16"/>
+          <w:lang w:eastAsia="zh-CN"/>
+        </w:rPr>
+        <w:t>,  </w:t>
+      </w:r>
       <w:r>
         <w:rPr>
           <w:rFonts w:ascii="Consolas" w:eastAsia="Times New Roman" w:hAnsi="Consolas" w:cs="Times New Roman"/>
@@ -2127,7 +1703,7 @@
           <w:szCs w:val="16"/>
           <w:lang w:eastAsia="zh-CN"/>
         </w:rPr>
-        <w:t>03</w:t>
+        <w:t>500</w:t>
       </w:r>
       <w:r>
         <w:rPr>
@@ -2137,160 +1713,7 @@
           <w:szCs w:val="16"/>
           <w:lang w:eastAsia="zh-CN"/>
         </w:rPr>
-        <w:t>,  </w:t>
-      </w:r>
-      <w:r>
-        <w:rPr>
-          <w:rFonts w:ascii="Consolas" w:eastAsia="Times New Roman" w:hAnsi="Consolas" w:cs="Times New Roman"/>
-          <w:color w:val="B5CEA8"/>
-          <w:sz w:val="16"/>
-          <w:szCs w:val="16"/>
-          <w:lang w:eastAsia="zh-CN"/>
-        </w:rPr>
-        <w:t>500</w:t>
-      </w:r>
-      <w:proofErr w:type="gramEnd"/>
-      <w:r>
-        <w:rPr>
-          <w:rFonts w:ascii="Consolas" w:eastAsia="Times New Roman" w:hAnsi="Consolas" w:cs="Times New Roman"/>
-          <w:color w:val="D4D4D4"/>
-          <w:sz w:val="16"/>
-          <w:szCs w:val="16"/>
-          <w:lang w:eastAsia="zh-CN"/>
-        </w:rPr>
-        <w:t xml:space="preserve">, </w:t>
-      </w:r>
-      <w:proofErr w:type="gramStart"/>
-      <w:r>
-        <w:rPr>
-          <w:rFonts w:ascii="Consolas" w:eastAsia="Times New Roman" w:hAnsi="Consolas" w:cs="Times New Roman"/>
-          <w:color w:val="D4D4D4"/>
-          <w:sz w:val="16"/>
-          <w:szCs w:val="16"/>
-          <w:lang w:eastAsia="zh-CN"/>
-        </w:rPr>
-        <w:t>{ Left</w:t>
-      </w:r>
-      <w:proofErr w:type="gramEnd"/>
-      <w:r>
-        <w:rPr>
-          <w:rFonts w:ascii="Consolas" w:eastAsia="Times New Roman" w:hAnsi="Consolas" w:cs="Times New Roman"/>
-          <w:color w:val="D4D4D4"/>
-          <w:sz w:val="16"/>
-          <w:szCs w:val="16"/>
-          <w:lang w:eastAsia="zh-CN"/>
-        </w:rPr>
-        <w:t>_off</w:t>
-      </w:r>
-      <w:proofErr w:type="gramStart"/>
-      <w:r>
-        <w:rPr>
-          <w:rFonts w:ascii="Consolas" w:eastAsia="Times New Roman" w:hAnsi="Consolas" w:cs="Times New Roman"/>
-          <w:color w:val="D4D4D4"/>
-          <w:sz w:val="16"/>
-          <w:szCs w:val="16"/>
-          <w:lang w:eastAsia="zh-CN"/>
-        </w:rPr>
-        <w:t xml:space="preserve">1,   </w:t>
-      </w:r>
-      <w:proofErr w:type="gramEnd"/>
-      <w:r>
-        <w:rPr>
-          <w:rFonts w:ascii="Consolas" w:eastAsia="Times New Roman" w:hAnsi="Consolas" w:cs="Times New Roman"/>
-          <w:color w:val="D4D4D4"/>
-          <w:sz w:val="16"/>
-          <w:szCs w:val="16"/>
-          <w:lang w:eastAsia="zh-CN"/>
-        </w:rPr>
-        <w:t>   Left</w:t>
-      </w:r>
-      <w:proofErr w:type="gramStart"/>
-      <w:r>
-        <w:rPr>
-          <w:rFonts w:ascii="Consolas" w:eastAsia="Times New Roman" w:hAnsi="Consolas" w:cs="Times New Roman"/>
-          <w:color w:val="D4D4D4"/>
-          <w:sz w:val="16"/>
-          <w:szCs w:val="16"/>
-          <w:lang w:eastAsia="zh-CN"/>
-        </w:rPr>
-        <w:t xml:space="preserve">1,   </w:t>
-      </w:r>
-      <w:proofErr w:type="gramEnd"/>
-      <w:r>
-        <w:rPr>
-          <w:rFonts w:ascii="Consolas" w:eastAsia="Times New Roman" w:hAnsi="Consolas" w:cs="Times New Roman"/>
-          <w:color w:val="D4D4D4"/>
-          <w:sz w:val="16"/>
-          <w:szCs w:val="16"/>
-          <w:lang w:eastAsia="zh-CN"/>
-        </w:rPr>
-        <w:t>   Right</w:t>
-      </w:r>
-      <w:proofErr w:type="gramStart"/>
-      <w:r>
-        <w:rPr>
-          <w:rFonts w:ascii="Consolas" w:eastAsia="Times New Roman" w:hAnsi="Consolas" w:cs="Times New Roman"/>
-          <w:color w:val="D4D4D4"/>
-          <w:sz w:val="16"/>
-          <w:szCs w:val="16"/>
-          <w:lang w:eastAsia="zh-CN"/>
-        </w:rPr>
-        <w:t xml:space="preserve">1,   </w:t>
-      </w:r>
-      <w:proofErr w:type="gramEnd"/>
-      <w:r>
-        <w:rPr>
-          <w:rFonts w:ascii="Consolas" w:eastAsia="Times New Roman" w:hAnsi="Consolas" w:cs="Times New Roman"/>
-          <w:color w:val="D4D4D4"/>
-          <w:sz w:val="16"/>
-          <w:szCs w:val="16"/>
-          <w:lang w:eastAsia="zh-CN"/>
-        </w:rPr>
-        <w:t xml:space="preserve">  </w:t>
-      </w:r>
-      <w:proofErr w:type="spellStart"/>
-      <w:r>
-        <w:rPr>
-          <w:rFonts w:ascii="Consolas" w:eastAsia="Times New Roman" w:hAnsi="Consolas" w:cs="Times New Roman"/>
-          <w:color w:val="D4D4D4"/>
-          <w:sz w:val="16"/>
-          <w:szCs w:val="16"/>
-          <w:lang w:eastAsia="zh-CN"/>
-        </w:rPr>
-        <w:t>Center</w:t>
-      </w:r>
-      <w:proofErr w:type="spellEnd"/>
-      <w:r>
-        <w:rPr>
-          <w:rFonts w:ascii="Consolas" w:eastAsia="Times New Roman" w:hAnsi="Consolas" w:cs="Times New Roman"/>
-          <w:color w:val="D4D4D4"/>
-          <w:sz w:val="16"/>
-          <w:szCs w:val="16"/>
-          <w:lang w:eastAsia="zh-CN"/>
-        </w:rPr>
-        <w:t xml:space="preserve">  </w:t>
-      </w:r>
-      <w:proofErr w:type="gramStart"/>
-      <w:r>
-        <w:rPr>
-          <w:rFonts w:ascii="Consolas" w:eastAsia="Times New Roman" w:hAnsi="Consolas" w:cs="Times New Roman"/>
-          <w:color w:val="D4D4D4"/>
-          <w:sz w:val="16"/>
-          <w:szCs w:val="16"/>
-          <w:lang w:eastAsia="zh-CN"/>
-        </w:rPr>
-        <w:t xml:space="preserve">  }</w:t>
-      </w:r>
-      <w:proofErr w:type="gramEnd"/>
-      <w:r>
-        <w:rPr>
-          <w:rFonts w:ascii="Consolas" w:eastAsia="Times New Roman" w:hAnsi="Consolas" w:cs="Times New Roman"/>
-          <w:color w:val="D4D4D4"/>
-          <w:sz w:val="16"/>
-          <w:szCs w:val="16"/>
-          <w:lang w:eastAsia="zh-CN"/>
-        </w:rPr>
-        <w:t>},</w:t>
+        <w:t>, { Left_off1,      Left1,      Right1,     Center    }},</w:t>
       </w:r>
       <w:r>
         <w:rPr>
@@ -2368,139 +1791,7 @@
           <w:szCs w:val="16"/>
           <w:lang w:eastAsia="zh-CN"/>
         </w:rPr>
-        <w:t xml:space="preserve">, </w:t>
-      </w:r>
-      <w:proofErr w:type="gramStart"/>
-      <w:r>
-        <w:rPr>
-          <w:rFonts w:ascii="Consolas" w:eastAsia="Times New Roman" w:hAnsi="Consolas" w:cs="Times New Roman"/>
-          <w:color w:val="D4D4D4"/>
-          <w:sz w:val="16"/>
-          <w:szCs w:val="16"/>
-          <w:lang w:eastAsia="zh-CN"/>
-        </w:rPr>
-        <w:t>{ Left</w:t>
-      </w:r>
-      <w:proofErr w:type="gramEnd"/>
-      <w:r>
-        <w:rPr>
-          <w:rFonts w:ascii="Consolas" w:eastAsia="Times New Roman" w:hAnsi="Consolas" w:cs="Times New Roman"/>
-          <w:color w:val="D4D4D4"/>
-          <w:sz w:val="16"/>
-          <w:szCs w:val="16"/>
-          <w:lang w:eastAsia="zh-CN"/>
-        </w:rPr>
-        <w:t>_off</w:t>
-      </w:r>
-      <w:proofErr w:type="gramStart"/>
-      <w:r>
-        <w:rPr>
-          <w:rFonts w:ascii="Consolas" w:eastAsia="Times New Roman" w:hAnsi="Consolas" w:cs="Times New Roman"/>
-          <w:color w:val="D4D4D4"/>
-          <w:sz w:val="16"/>
-          <w:szCs w:val="16"/>
-          <w:lang w:eastAsia="zh-CN"/>
-        </w:rPr>
-        <w:t xml:space="preserve">2,   </w:t>
-      </w:r>
-      <w:proofErr w:type="gramEnd"/>
-      <w:r>
-        <w:rPr>
-          <w:rFonts w:ascii="Consolas" w:eastAsia="Times New Roman" w:hAnsi="Consolas" w:cs="Times New Roman"/>
-          <w:color w:val="D4D4D4"/>
-          <w:sz w:val="16"/>
-          <w:szCs w:val="16"/>
-          <w:lang w:eastAsia="zh-CN"/>
-        </w:rPr>
-        <w:t>   </w:t>
-      </w:r>
-      <w:proofErr w:type="gramStart"/>
-      <w:r>
-        <w:rPr>
-          <w:rFonts w:ascii="Consolas" w:eastAsia="Times New Roman" w:hAnsi="Consolas" w:cs="Times New Roman"/>
-          <w:color w:val="D4D4D4"/>
-          <w:sz w:val="16"/>
-          <w:szCs w:val="16"/>
-          <w:lang w:eastAsia="zh-CN"/>
-        </w:rPr>
-        <w:t>Left</w:t>
-      </w:r>
-      <w:proofErr w:type="gramEnd"/>
-      <w:r>
-        <w:rPr>
-          <w:rFonts w:ascii="Consolas" w:eastAsia="Times New Roman" w:hAnsi="Consolas" w:cs="Times New Roman"/>
-          <w:color w:val="D4D4D4"/>
-          <w:sz w:val="16"/>
-          <w:szCs w:val="16"/>
-          <w:lang w:eastAsia="zh-CN"/>
-        </w:rPr>
-        <w:t>_off</w:t>
-      </w:r>
-      <w:proofErr w:type="gramStart"/>
-      <w:r>
-        <w:rPr>
-          <w:rFonts w:ascii="Consolas" w:eastAsia="Times New Roman" w:hAnsi="Consolas" w:cs="Times New Roman"/>
-          <w:color w:val="D4D4D4"/>
-          <w:sz w:val="16"/>
-          <w:szCs w:val="16"/>
-          <w:lang w:eastAsia="zh-CN"/>
-        </w:rPr>
-        <w:t>2,  Left</w:t>
-      </w:r>
-      <w:proofErr w:type="gramEnd"/>
-      <w:r>
-        <w:rPr>
-          <w:rFonts w:ascii="Consolas" w:eastAsia="Times New Roman" w:hAnsi="Consolas" w:cs="Times New Roman"/>
-          <w:color w:val="D4D4D4"/>
-          <w:sz w:val="16"/>
-          <w:szCs w:val="16"/>
-          <w:lang w:eastAsia="zh-CN"/>
-        </w:rPr>
-        <w:t>_off</w:t>
-      </w:r>
-      <w:proofErr w:type="gramStart"/>
-      <w:r>
-        <w:rPr>
-          <w:rFonts w:ascii="Consolas" w:eastAsia="Times New Roman" w:hAnsi="Consolas" w:cs="Times New Roman"/>
-          <w:color w:val="D4D4D4"/>
-          <w:sz w:val="16"/>
-          <w:szCs w:val="16"/>
-          <w:lang w:eastAsia="zh-CN"/>
-        </w:rPr>
-        <w:t>2,  Left</w:t>
-      </w:r>
-      <w:proofErr w:type="gramEnd"/>
-      <w:r>
-        <w:rPr>
-          <w:rFonts w:ascii="Consolas" w:eastAsia="Times New Roman" w:hAnsi="Consolas" w:cs="Times New Roman"/>
-          <w:color w:val="D4D4D4"/>
-          <w:sz w:val="16"/>
-          <w:szCs w:val="16"/>
-          <w:lang w:eastAsia="zh-CN"/>
-        </w:rPr>
-        <w:t>_off</w:t>
-      </w:r>
-      <w:proofErr w:type="gramStart"/>
-      <w:r>
-        <w:rPr>
-          <w:rFonts w:ascii="Consolas" w:eastAsia="Times New Roman" w:hAnsi="Consolas" w:cs="Times New Roman"/>
-          <w:color w:val="D4D4D4"/>
-          <w:sz w:val="16"/>
-          <w:szCs w:val="16"/>
-          <w:lang w:eastAsia="zh-CN"/>
-        </w:rPr>
-        <w:t>2 }</w:t>
-      </w:r>
-      <w:proofErr w:type="gramEnd"/>
-      <w:r>
-        <w:rPr>
-          <w:rFonts w:ascii="Consolas" w:eastAsia="Times New Roman" w:hAnsi="Consolas" w:cs="Times New Roman"/>
-          <w:color w:val="D4D4D4"/>
-          <w:sz w:val="16"/>
-          <w:szCs w:val="16"/>
-          <w:lang w:eastAsia="zh-CN"/>
-        </w:rPr>
-        <w:t>},</w:t>
+        <w:t>, { Left_off2,      Left_off2,  Left_off2,  Left_off2 }},</w:t>
       </w:r>
       <w:r>
         <w:rPr>
@@ -2578,161 +1869,7 @@
           <w:szCs w:val="16"/>
           <w:lang w:eastAsia="zh-CN"/>
         </w:rPr>
-        <w:t xml:space="preserve">, </w:t>
-      </w:r>
-      <w:proofErr w:type="gramStart"/>
-      <w:r>
-        <w:rPr>
-          <w:rFonts w:ascii="Consolas" w:eastAsia="Times New Roman" w:hAnsi="Consolas" w:cs="Times New Roman"/>
-          <w:color w:val="D4D4D4"/>
-          <w:sz w:val="16"/>
-          <w:szCs w:val="16"/>
-          <w:lang w:eastAsia="zh-CN"/>
-        </w:rPr>
-        <w:t xml:space="preserve">{ </w:t>
-      </w:r>
-      <w:proofErr w:type="spellStart"/>
-      <w:r>
-        <w:rPr>
-          <w:rFonts w:ascii="Consolas" w:eastAsia="Times New Roman" w:hAnsi="Consolas" w:cs="Times New Roman"/>
-          <w:color w:val="D4D4D4"/>
-          <w:sz w:val="16"/>
-          <w:szCs w:val="16"/>
-          <w:lang w:eastAsia="zh-CN"/>
-        </w:rPr>
-        <w:t>Left</w:t>
-      </w:r>
-      <w:proofErr w:type="gramEnd"/>
-      <w:r>
-        <w:rPr>
-          <w:rFonts w:ascii="Consolas" w:eastAsia="Times New Roman" w:hAnsi="Consolas" w:cs="Times New Roman"/>
-          <w:color w:val="D4D4D4"/>
-          <w:sz w:val="16"/>
-          <w:szCs w:val="16"/>
-          <w:lang w:eastAsia="zh-CN"/>
-        </w:rPr>
-        <w:t>_</w:t>
-      </w:r>
-      <w:proofErr w:type="gramStart"/>
-      <w:r>
-        <w:rPr>
-          <w:rFonts w:ascii="Consolas" w:eastAsia="Times New Roman" w:hAnsi="Consolas" w:cs="Times New Roman"/>
-          <w:color w:val="D4D4D4"/>
-          <w:sz w:val="16"/>
-          <w:szCs w:val="16"/>
-          <w:lang w:eastAsia="zh-CN"/>
-        </w:rPr>
-        <w:t>stop</w:t>
-      </w:r>
-      <w:proofErr w:type="spellEnd"/>
-      <w:r>
-        <w:rPr>
-          <w:rFonts w:ascii="Consolas" w:eastAsia="Times New Roman" w:hAnsi="Consolas" w:cs="Times New Roman"/>
-          <w:color w:val="D4D4D4"/>
-          <w:sz w:val="16"/>
-          <w:szCs w:val="16"/>
-          <w:lang w:eastAsia="zh-CN"/>
-        </w:rPr>
-        <w:t xml:space="preserve">,   </w:t>
-      </w:r>
-      <w:proofErr w:type="gramEnd"/>
-      <w:r>
-        <w:rPr>
-          <w:rFonts w:ascii="Consolas" w:eastAsia="Times New Roman" w:hAnsi="Consolas" w:cs="Times New Roman"/>
-          <w:color w:val="D4D4D4"/>
-          <w:sz w:val="16"/>
-          <w:szCs w:val="16"/>
-          <w:lang w:eastAsia="zh-CN"/>
-        </w:rPr>
-        <w:t>   Left</w:t>
-      </w:r>
-      <w:proofErr w:type="gramStart"/>
-      <w:r>
-        <w:rPr>
-          <w:rFonts w:ascii="Consolas" w:eastAsia="Times New Roman" w:hAnsi="Consolas" w:cs="Times New Roman"/>
-          <w:color w:val="D4D4D4"/>
-          <w:sz w:val="16"/>
-          <w:szCs w:val="16"/>
-          <w:lang w:eastAsia="zh-CN"/>
-        </w:rPr>
-        <w:t xml:space="preserve">1,   </w:t>
-      </w:r>
-      <w:proofErr w:type="gramEnd"/>
-      <w:r>
-        <w:rPr>
-          <w:rFonts w:ascii="Consolas" w:eastAsia="Times New Roman" w:hAnsi="Consolas" w:cs="Times New Roman"/>
-          <w:color w:val="D4D4D4"/>
-          <w:sz w:val="16"/>
-          <w:szCs w:val="16"/>
-          <w:lang w:eastAsia="zh-CN"/>
-        </w:rPr>
-        <w:t>   Right</w:t>
-      </w:r>
-      <w:proofErr w:type="gramStart"/>
-      <w:r>
-        <w:rPr>
-          <w:rFonts w:ascii="Consolas" w:eastAsia="Times New Roman" w:hAnsi="Consolas" w:cs="Times New Roman"/>
-          <w:color w:val="D4D4D4"/>
-          <w:sz w:val="16"/>
-          <w:szCs w:val="16"/>
-          <w:lang w:eastAsia="zh-CN"/>
-        </w:rPr>
-        <w:t xml:space="preserve">1,   </w:t>
-      </w:r>
-      <w:proofErr w:type="gramEnd"/>
-      <w:r>
-        <w:rPr>
-          <w:rFonts w:ascii="Consolas" w:eastAsia="Times New Roman" w:hAnsi="Consolas" w:cs="Times New Roman"/>
-          <w:color w:val="D4D4D4"/>
-          <w:sz w:val="16"/>
-          <w:szCs w:val="16"/>
-          <w:lang w:eastAsia="zh-CN"/>
-        </w:rPr>
-        <w:t xml:space="preserve">  </w:t>
-      </w:r>
-      <w:proofErr w:type="spellStart"/>
-      <w:r>
-        <w:rPr>
-          <w:rFonts w:ascii="Consolas" w:eastAsia="Times New Roman" w:hAnsi="Consolas" w:cs="Times New Roman"/>
-          <w:color w:val="D4D4D4"/>
-          <w:sz w:val="16"/>
-          <w:szCs w:val="16"/>
-          <w:lang w:eastAsia="zh-CN"/>
-        </w:rPr>
-        <w:t>Center</w:t>
-      </w:r>
-      <w:proofErr w:type="spellEnd"/>
-      <w:r>
-        <w:rPr>
-          <w:rFonts w:ascii="Consolas" w:eastAsia="Times New Roman" w:hAnsi="Consolas" w:cs="Times New Roman"/>
-          <w:color w:val="D4D4D4"/>
-          <w:sz w:val="16"/>
-          <w:szCs w:val="16"/>
-          <w:lang w:eastAsia="zh-CN"/>
-        </w:rPr>
-        <w:t xml:space="preserve">  </w:t>
-      </w:r>
-      <w:proofErr w:type="gramStart"/>
-      <w:r>
-        <w:rPr>
-          <w:rFonts w:ascii="Consolas" w:eastAsia="Times New Roman" w:hAnsi="Consolas" w:cs="Times New Roman"/>
-          <w:color w:val="D4D4D4"/>
-          <w:sz w:val="16"/>
-          <w:szCs w:val="16"/>
-          <w:lang w:eastAsia="zh-CN"/>
-        </w:rPr>
-        <w:t xml:space="preserve">  }</w:t>
-      </w:r>
-      <w:proofErr w:type="gramEnd"/>
-      <w:r>
-        <w:rPr>
-          <w:rFonts w:ascii="Consolas" w:eastAsia="Times New Roman" w:hAnsi="Consolas" w:cs="Times New Roman"/>
-          <w:color w:val="D4D4D4"/>
-          <w:sz w:val="16"/>
-          <w:szCs w:val="16"/>
-          <w:lang w:eastAsia="zh-CN"/>
-        </w:rPr>
-        <w:t>},</w:t>
+        <w:t>, { Left_stop,      Left1,      Right1,     Center    }},</w:t>
       </w:r>
       <w:r>
         <w:rPr>
@@ -2780,9 +1917,18 @@
           <w:szCs w:val="16"/>
           <w:lang w:eastAsia="zh-CN"/>
         </w:rPr>
-        <w:t>0x</w:t>
-      </w:r>
-      <w:proofErr w:type="gramStart"/>
+        <w:t>0x00</w:t>
+      </w:r>
+      <w:r>
+        <w:rPr>
+          <w:rFonts w:ascii="Consolas" w:eastAsia="Times New Roman" w:hAnsi="Consolas" w:cs="Times New Roman"/>
+          <w:color w:val="D4D4D4"/>
+          <w:sz w:val="16"/>
+          <w:szCs w:val="16"/>
+          <w:lang w:eastAsia="zh-CN"/>
+        </w:rPr>
+        <w:t>,  </w:t>
+      </w:r>
       <w:r>
         <w:rPr>
           <w:rFonts w:ascii="Consolas" w:eastAsia="Times New Roman" w:hAnsi="Consolas" w:cs="Times New Roman"/>
@@ -2791,7 +1937,7 @@
           <w:szCs w:val="16"/>
           <w:lang w:eastAsia="zh-CN"/>
         </w:rPr>
-        <w:t>00</w:t>
+        <w:t>500</w:t>
       </w:r>
       <w:r>
         <w:rPr>
@@ -2801,238 +1947,7 @@
           <w:szCs w:val="16"/>
           <w:lang w:eastAsia="zh-CN"/>
         </w:rPr>
-        <w:t>,  </w:t>
-      </w:r>
-      <w:r>
-        <w:rPr>
-          <w:rFonts w:ascii="Consolas" w:eastAsia="Times New Roman" w:hAnsi="Consolas" w:cs="Times New Roman"/>
-          <w:color w:val="B5CEA8"/>
-          <w:sz w:val="16"/>
-          <w:szCs w:val="16"/>
-          <w:lang w:eastAsia="zh-CN"/>
-        </w:rPr>
-        <w:t>500</w:t>
-      </w:r>
-      <w:proofErr w:type="gramEnd"/>
-      <w:r>
-        <w:rPr>
-          <w:rFonts w:ascii="Consolas" w:eastAsia="Times New Roman" w:hAnsi="Consolas" w:cs="Times New Roman"/>
-          <w:color w:val="D4D4D4"/>
-          <w:sz w:val="16"/>
-          <w:szCs w:val="16"/>
-          <w:lang w:eastAsia="zh-CN"/>
-        </w:rPr>
-        <w:t xml:space="preserve">, </w:t>
-      </w:r>
-      <w:proofErr w:type="gramStart"/>
-      <w:r>
-        <w:rPr>
-          <w:rFonts w:ascii="Consolas" w:eastAsia="Times New Roman" w:hAnsi="Consolas" w:cs="Times New Roman"/>
-          <w:color w:val="D4D4D4"/>
-          <w:sz w:val="16"/>
-          <w:szCs w:val="16"/>
-          <w:lang w:eastAsia="zh-CN"/>
-        </w:rPr>
-        <w:t xml:space="preserve">{ </w:t>
-      </w:r>
-      <w:proofErr w:type="spellStart"/>
-      <w:r>
-        <w:rPr>
-          <w:rFonts w:ascii="Consolas" w:eastAsia="Times New Roman" w:hAnsi="Consolas" w:cs="Times New Roman"/>
-          <w:color w:val="D4D4D4"/>
-          <w:sz w:val="16"/>
-          <w:szCs w:val="16"/>
-          <w:lang w:eastAsia="zh-CN"/>
-        </w:rPr>
-        <w:t>Left</w:t>
-      </w:r>
-      <w:proofErr w:type="gramEnd"/>
-      <w:r>
-        <w:rPr>
-          <w:rFonts w:ascii="Consolas" w:eastAsia="Times New Roman" w:hAnsi="Consolas" w:cs="Times New Roman"/>
-          <w:color w:val="D4D4D4"/>
-          <w:sz w:val="16"/>
-          <w:szCs w:val="16"/>
-          <w:lang w:eastAsia="zh-CN"/>
-        </w:rPr>
-        <w:t>_</w:t>
-      </w:r>
-      <w:proofErr w:type="gramStart"/>
-      <w:r>
-        <w:rPr>
-          <w:rFonts w:ascii="Consolas" w:eastAsia="Times New Roman" w:hAnsi="Consolas" w:cs="Times New Roman"/>
-          <w:color w:val="D4D4D4"/>
-          <w:sz w:val="16"/>
-          <w:szCs w:val="16"/>
-          <w:lang w:eastAsia="zh-CN"/>
-        </w:rPr>
-        <w:t>stop</w:t>
-      </w:r>
-      <w:proofErr w:type="spellEnd"/>
-      <w:r>
-        <w:rPr>
-          <w:rFonts w:ascii="Consolas" w:eastAsia="Times New Roman" w:hAnsi="Consolas" w:cs="Times New Roman"/>
-          <w:color w:val="D4D4D4"/>
-          <w:sz w:val="16"/>
-          <w:szCs w:val="16"/>
-          <w:lang w:eastAsia="zh-CN"/>
-        </w:rPr>
-        <w:t xml:space="preserve">,   </w:t>
-      </w:r>
-      <w:proofErr w:type="gramEnd"/>
-      <w:r>
-        <w:rPr>
-          <w:rFonts w:ascii="Consolas" w:eastAsia="Times New Roman" w:hAnsi="Consolas" w:cs="Times New Roman"/>
-          <w:color w:val="D4D4D4"/>
-          <w:sz w:val="16"/>
-          <w:szCs w:val="16"/>
-          <w:lang w:eastAsia="zh-CN"/>
-        </w:rPr>
-        <w:t>   </w:t>
-      </w:r>
-      <w:proofErr w:type="spellStart"/>
-      <w:proofErr w:type="gramStart"/>
-      <w:r>
-        <w:rPr>
-          <w:rFonts w:ascii="Consolas" w:eastAsia="Times New Roman" w:hAnsi="Consolas" w:cs="Times New Roman"/>
-          <w:color w:val="D4D4D4"/>
-          <w:sz w:val="16"/>
-          <w:szCs w:val="16"/>
-          <w:lang w:eastAsia="zh-CN"/>
-        </w:rPr>
-        <w:t>Left</w:t>
-      </w:r>
-      <w:proofErr w:type="gramEnd"/>
-      <w:r>
-        <w:rPr>
-          <w:rFonts w:ascii="Consolas" w:eastAsia="Times New Roman" w:hAnsi="Consolas" w:cs="Times New Roman"/>
-          <w:color w:val="D4D4D4"/>
-          <w:sz w:val="16"/>
-          <w:szCs w:val="16"/>
-          <w:lang w:eastAsia="zh-CN"/>
-        </w:rPr>
-        <w:t>_</w:t>
-      </w:r>
-      <w:proofErr w:type="gramStart"/>
-      <w:r>
-        <w:rPr>
-          <w:rFonts w:ascii="Consolas" w:eastAsia="Times New Roman" w:hAnsi="Consolas" w:cs="Times New Roman"/>
-          <w:color w:val="D4D4D4"/>
-          <w:sz w:val="16"/>
-          <w:szCs w:val="16"/>
-          <w:lang w:eastAsia="zh-CN"/>
-        </w:rPr>
-        <w:t>stop</w:t>
-      </w:r>
-      <w:proofErr w:type="spellEnd"/>
-      <w:r>
-        <w:rPr>
-          <w:rFonts w:ascii="Consolas" w:eastAsia="Times New Roman" w:hAnsi="Consolas" w:cs="Times New Roman"/>
-          <w:color w:val="D4D4D4"/>
-          <w:sz w:val="16"/>
-          <w:szCs w:val="16"/>
-          <w:lang w:eastAsia="zh-CN"/>
-        </w:rPr>
-        <w:t>,  </w:t>
-      </w:r>
-      <w:proofErr w:type="spellStart"/>
-      <w:r>
-        <w:rPr>
-          <w:rFonts w:ascii="Consolas" w:eastAsia="Times New Roman" w:hAnsi="Consolas" w:cs="Times New Roman"/>
-          <w:color w:val="D4D4D4"/>
-          <w:sz w:val="16"/>
-          <w:szCs w:val="16"/>
-          <w:lang w:eastAsia="zh-CN"/>
-        </w:rPr>
-        <w:t>Left</w:t>
-      </w:r>
-      <w:proofErr w:type="gramEnd"/>
-      <w:r>
-        <w:rPr>
-          <w:rFonts w:ascii="Consolas" w:eastAsia="Times New Roman" w:hAnsi="Consolas" w:cs="Times New Roman"/>
-          <w:color w:val="D4D4D4"/>
-          <w:sz w:val="16"/>
-          <w:szCs w:val="16"/>
-          <w:lang w:eastAsia="zh-CN"/>
-        </w:rPr>
-        <w:t>_</w:t>
-      </w:r>
-      <w:proofErr w:type="gramStart"/>
-      <w:r>
-        <w:rPr>
-          <w:rFonts w:ascii="Consolas" w:eastAsia="Times New Roman" w:hAnsi="Consolas" w:cs="Times New Roman"/>
-          <w:color w:val="D4D4D4"/>
-          <w:sz w:val="16"/>
-          <w:szCs w:val="16"/>
-          <w:lang w:eastAsia="zh-CN"/>
-        </w:rPr>
-        <w:t>stop</w:t>
-      </w:r>
-      <w:proofErr w:type="spellEnd"/>
-      <w:r>
-        <w:rPr>
-          <w:rFonts w:ascii="Consolas" w:eastAsia="Times New Roman" w:hAnsi="Consolas" w:cs="Times New Roman"/>
-          <w:color w:val="D4D4D4"/>
-          <w:sz w:val="16"/>
-          <w:szCs w:val="16"/>
-          <w:lang w:eastAsia="zh-CN"/>
-        </w:rPr>
-        <w:t>,  </w:t>
-      </w:r>
-      <w:proofErr w:type="spellStart"/>
-      <w:r>
-        <w:rPr>
-          <w:rFonts w:ascii="Consolas" w:eastAsia="Times New Roman" w:hAnsi="Consolas" w:cs="Times New Roman"/>
-          <w:color w:val="D4D4D4"/>
-          <w:sz w:val="16"/>
-          <w:szCs w:val="16"/>
-          <w:lang w:eastAsia="zh-CN"/>
-        </w:rPr>
-        <w:t>Left</w:t>
-      </w:r>
-      <w:proofErr w:type="gramEnd"/>
-      <w:r>
-        <w:rPr>
-          <w:rFonts w:ascii="Consolas" w:eastAsia="Times New Roman" w:hAnsi="Consolas" w:cs="Times New Roman"/>
-          <w:color w:val="D4D4D4"/>
-          <w:sz w:val="16"/>
-          <w:szCs w:val="16"/>
-          <w:lang w:eastAsia="zh-CN"/>
-        </w:rPr>
-        <w:t>_</w:t>
-      </w:r>
-      <w:proofErr w:type="gramStart"/>
-      <w:r>
-        <w:rPr>
-          <w:rFonts w:ascii="Consolas" w:eastAsia="Times New Roman" w:hAnsi="Consolas" w:cs="Times New Roman"/>
-          <w:color w:val="D4D4D4"/>
-          <w:sz w:val="16"/>
-          <w:szCs w:val="16"/>
-          <w:lang w:eastAsia="zh-CN"/>
-        </w:rPr>
-        <w:t>stop</w:t>
-      </w:r>
-      <w:proofErr w:type="spellEnd"/>
-      <w:r>
-        <w:rPr>
-          <w:rFonts w:ascii="Consolas" w:eastAsia="Times New Roman" w:hAnsi="Consolas" w:cs="Times New Roman"/>
-          <w:color w:val="D4D4D4"/>
-          <w:sz w:val="16"/>
-          <w:szCs w:val="16"/>
-          <w:lang w:eastAsia="zh-CN"/>
-        </w:rPr>
-        <w:t xml:space="preserve"> }</w:t>
-      </w:r>
-      <w:proofErr w:type="gramEnd"/>
-      <w:r>
-        <w:rPr>
-          <w:rFonts w:ascii="Consolas" w:eastAsia="Times New Roman" w:hAnsi="Consolas" w:cs="Times New Roman"/>
-          <w:color w:val="D4D4D4"/>
-          <w:sz w:val="16"/>
-          <w:szCs w:val="16"/>
-          <w:lang w:eastAsia="zh-CN"/>
-        </w:rPr>
-        <w:t>},</w:t>
+        <w:t>, { Left_stop,      Left_stop,  Left_stop,  Left_stop }},</w:t>
       </w:r>
       <w:r>
         <w:rPr>
@@ -3042,20 +1957,8 @@
           <w:szCs w:val="16"/>
           <w:lang w:eastAsia="zh-CN"/>
         </w:rPr>
-        <w:t xml:space="preserve">   // </w:t>
-      </w:r>
-      <w:proofErr w:type="spellStart"/>
-      <w:r>
-        <w:rPr>
-          <w:rFonts w:ascii="Consolas" w:eastAsia="Times New Roman" w:hAnsi="Consolas" w:cs="Times New Roman"/>
-          <w:color w:val="6A9955"/>
-          <w:sz w:val="16"/>
-          <w:szCs w:val="16"/>
-          <w:lang w:eastAsia="zh-CN"/>
-        </w:rPr>
-        <w:t>Left_stop</w:t>
-      </w:r>
-      <w:proofErr w:type="spellEnd"/>
+        <w:t xml:space="preserve">   // Left_stop</w:t>
+      </w:r>
     </w:p>
     <w:p>
       <w:pPr>
@@ -3092,9 +1995,18 @@
           <w:szCs w:val="16"/>
           <w:lang w:eastAsia="zh-CN"/>
         </w:rPr>
-        <w:t>0x</w:t>
-      </w:r>
-      <w:proofErr w:type="gramStart"/>
+        <w:t>0x01</w:t>
+      </w:r>
+      <w:r>
+        <w:rPr>
+          <w:rFonts w:ascii="Consolas" w:eastAsia="Times New Roman" w:hAnsi="Consolas" w:cs="Times New Roman"/>
+          <w:color w:val="D4D4D4"/>
+          <w:sz w:val="16"/>
+          <w:szCs w:val="16"/>
+          <w:lang w:eastAsia="zh-CN"/>
+        </w:rPr>
+        <w:t>,  </w:t>
+      </w:r>
       <w:r>
         <w:rPr>
           <w:rFonts w:ascii="Consolas" w:eastAsia="Times New Roman" w:hAnsi="Consolas" w:cs="Times New Roman"/>
@@ -3103,7 +2015,7 @@
           <w:szCs w:val="16"/>
           <w:lang w:eastAsia="zh-CN"/>
         </w:rPr>
-        <w:t>01</w:t>
+        <w:t>500</w:t>
       </w:r>
       <w:r>
         <w:rPr>
@@ -3113,160 +2025,7 @@
           <w:szCs w:val="16"/>
           <w:lang w:eastAsia="zh-CN"/>
         </w:rPr>
-        <w:t>,  </w:t>
-      </w:r>
-      <w:r>
-        <w:rPr>
-          <w:rFonts w:ascii="Consolas" w:eastAsia="Times New Roman" w:hAnsi="Consolas" w:cs="Times New Roman"/>
-          <w:color w:val="B5CEA8"/>
-          <w:sz w:val="16"/>
-          <w:szCs w:val="16"/>
-          <w:lang w:eastAsia="zh-CN"/>
-        </w:rPr>
-        <w:t>500</w:t>
-      </w:r>
-      <w:proofErr w:type="gramEnd"/>
-      <w:r>
-        <w:rPr>
-          <w:rFonts w:ascii="Consolas" w:eastAsia="Times New Roman" w:hAnsi="Consolas" w:cs="Times New Roman"/>
-          <w:color w:val="D4D4D4"/>
-          <w:sz w:val="16"/>
-          <w:szCs w:val="16"/>
-          <w:lang w:eastAsia="zh-CN"/>
-        </w:rPr>
-        <w:t xml:space="preserve">, </w:t>
-      </w:r>
-      <w:proofErr w:type="gramStart"/>
-      <w:r>
-        <w:rPr>
-          <w:rFonts w:ascii="Consolas" w:eastAsia="Times New Roman" w:hAnsi="Consolas" w:cs="Times New Roman"/>
-          <w:color w:val="D4D4D4"/>
-          <w:sz w:val="16"/>
-          <w:szCs w:val="16"/>
-          <w:lang w:eastAsia="zh-CN"/>
-        </w:rPr>
-        <w:t>{ Right</w:t>
-      </w:r>
-      <w:proofErr w:type="gramEnd"/>
-      <w:r>
-        <w:rPr>
-          <w:rFonts w:ascii="Consolas" w:eastAsia="Times New Roman" w:hAnsi="Consolas" w:cs="Times New Roman"/>
-          <w:color w:val="D4D4D4"/>
-          <w:sz w:val="16"/>
-          <w:szCs w:val="16"/>
-          <w:lang w:eastAsia="zh-CN"/>
-        </w:rPr>
-        <w:t>_off</w:t>
-      </w:r>
-      <w:proofErr w:type="gramStart"/>
-      <w:r>
-        <w:rPr>
-          <w:rFonts w:ascii="Consolas" w:eastAsia="Times New Roman" w:hAnsi="Consolas" w:cs="Times New Roman"/>
-          <w:color w:val="D4D4D4"/>
-          <w:sz w:val="16"/>
-          <w:szCs w:val="16"/>
-          <w:lang w:eastAsia="zh-CN"/>
-        </w:rPr>
-        <w:t xml:space="preserve">1,   </w:t>
-      </w:r>
-      <w:proofErr w:type="gramEnd"/>
-      <w:r>
-        <w:rPr>
-          <w:rFonts w:ascii="Consolas" w:eastAsia="Times New Roman" w:hAnsi="Consolas" w:cs="Times New Roman"/>
-          <w:color w:val="D4D4D4"/>
-          <w:sz w:val="16"/>
-          <w:szCs w:val="16"/>
-          <w:lang w:eastAsia="zh-CN"/>
-        </w:rPr>
-        <w:t>  Left</w:t>
-      </w:r>
-      <w:proofErr w:type="gramStart"/>
-      <w:r>
-        <w:rPr>
-          <w:rFonts w:ascii="Consolas" w:eastAsia="Times New Roman" w:hAnsi="Consolas" w:cs="Times New Roman"/>
-          <w:color w:val="D4D4D4"/>
-          <w:sz w:val="16"/>
-          <w:szCs w:val="16"/>
-          <w:lang w:eastAsia="zh-CN"/>
-        </w:rPr>
-        <w:t xml:space="preserve">1,   </w:t>
-      </w:r>
-      <w:proofErr w:type="gramEnd"/>
-      <w:r>
-        <w:rPr>
-          <w:rFonts w:ascii="Consolas" w:eastAsia="Times New Roman" w:hAnsi="Consolas" w:cs="Times New Roman"/>
-          <w:color w:val="D4D4D4"/>
-          <w:sz w:val="16"/>
-          <w:szCs w:val="16"/>
-          <w:lang w:eastAsia="zh-CN"/>
-        </w:rPr>
-        <w:t>   Right</w:t>
-      </w:r>
-      <w:proofErr w:type="gramStart"/>
-      <w:r>
-        <w:rPr>
-          <w:rFonts w:ascii="Consolas" w:eastAsia="Times New Roman" w:hAnsi="Consolas" w:cs="Times New Roman"/>
-          <w:color w:val="D4D4D4"/>
-          <w:sz w:val="16"/>
-          <w:szCs w:val="16"/>
-          <w:lang w:eastAsia="zh-CN"/>
-        </w:rPr>
-        <w:t xml:space="preserve">2,   </w:t>
-      </w:r>
-      <w:proofErr w:type="gramEnd"/>
-      <w:r>
-        <w:rPr>
-          <w:rFonts w:ascii="Consolas" w:eastAsia="Times New Roman" w:hAnsi="Consolas" w:cs="Times New Roman"/>
-          <w:color w:val="D4D4D4"/>
-          <w:sz w:val="16"/>
-          <w:szCs w:val="16"/>
-          <w:lang w:eastAsia="zh-CN"/>
-        </w:rPr>
-        <w:t xml:space="preserve">  </w:t>
-      </w:r>
-      <w:proofErr w:type="spellStart"/>
-      <w:r>
-        <w:rPr>
-          <w:rFonts w:ascii="Consolas" w:eastAsia="Times New Roman" w:hAnsi="Consolas" w:cs="Times New Roman"/>
-          <w:color w:val="D4D4D4"/>
-          <w:sz w:val="16"/>
-          <w:szCs w:val="16"/>
-          <w:lang w:eastAsia="zh-CN"/>
-        </w:rPr>
-        <w:t>Center</w:t>
-      </w:r>
-      <w:proofErr w:type="spellEnd"/>
-      <w:r>
-        <w:rPr>
-          <w:rFonts w:ascii="Consolas" w:eastAsia="Times New Roman" w:hAnsi="Consolas" w:cs="Times New Roman"/>
-          <w:color w:val="D4D4D4"/>
-          <w:sz w:val="16"/>
-          <w:szCs w:val="16"/>
-          <w:lang w:eastAsia="zh-CN"/>
-        </w:rPr>
-        <w:t xml:space="preserve">  </w:t>
-      </w:r>
-      <w:proofErr w:type="gramStart"/>
-      <w:r>
-        <w:rPr>
-          <w:rFonts w:ascii="Consolas" w:eastAsia="Times New Roman" w:hAnsi="Consolas" w:cs="Times New Roman"/>
-          <w:color w:val="D4D4D4"/>
-          <w:sz w:val="16"/>
-          <w:szCs w:val="16"/>
-          <w:lang w:eastAsia="zh-CN"/>
-        </w:rPr>
-        <w:t xml:space="preserve">  }</w:t>
-      </w:r>
-      <w:proofErr w:type="gramEnd"/>
-      <w:r>
-        <w:rPr>
-          <w:rFonts w:ascii="Consolas" w:eastAsia="Times New Roman" w:hAnsi="Consolas" w:cs="Times New Roman"/>
-          <w:color w:val="D4D4D4"/>
-          <w:sz w:val="16"/>
-          <w:szCs w:val="16"/>
-          <w:lang w:eastAsia="zh-CN"/>
-        </w:rPr>
-        <w:t>},</w:t>
+        <w:t>, { Right_off1,     Left1,      Right2,     Center    }},</w:t>
       </w:r>
       <w:r>
         <w:rPr>
@@ -3344,139 +2103,7 @@
           <w:szCs w:val="16"/>
           <w:lang w:eastAsia="zh-CN"/>
         </w:rPr>
-        <w:t xml:space="preserve">, </w:t>
-      </w:r>
-      <w:proofErr w:type="gramStart"/>
-      <w:r>
-        <w:rPr>
-          <w:rFonts w:ascii="Consolas" w:eastAsia="Times New Roman" w:hAnsi="Consolas" w:cs="Times New Roman"/>
-          <w:color w:val="D4D4D4"/>
-          <w:sz w:val="16"/>
-          <w:szCs w:val="16"/>
-          <w:lang w:eastAsia="zh-CN"/>
-        </w:rPr>
-        <w:t>{ Right</w:t>
-      </w:r>
-      <w:proofErr w:type="gramEnd"/>
-      <w:r>
-        <w:rPr>
-          <w:rFonts w:ascii="Consolas" w:eastAsia="Times New Roman" w:hAnsi="Consolas" w:cs="Times New Roman"/>
-          <w:color w:val="D4D4D4"/>
-          <w:sz w:val="16"/>
-          <w:szCs w:val="16"/>
-          <w:lang w:eastAsia="zh-CN"/>
-        </w:rPr>
-        <w:t>_off</w:t>
-      </w:r>
-      <w:proofErr w:type="gramStart"/>
-      <w:r>
-        <w:rPr>
-          <w:rFonts w:ascii="Consolas" w:eastAsia="Times New Roman" w:hAnsi="Consolas" w:cs="Times New Roman"/>
-          <w:color w:val="D4D4D4"/>
-          <w:sz w:val="16"/>
-          <w:szCs w:val="16"/>
-          <w:lang w:eastAsia="zh-CN"/>
-        </w:rPr>
-        <w:t xml:space="preserve">1,   </w:t>
-      </w:r>
-      <w:proofErr w:type="gramEnd"/>
-      <w:r>
-        <w:rPr>
-          <w:rFonts w:ascii="Consolas" w:eastAsia="Times New Roman" w:hAnsi="Consolas" w:cs="Times New Roman"/>
-          <w:color w:val="D4D4D4"/>
-          <w:sz w:val="16"/>
-          <w:szCs w:val="16"/>
-          <w:lang w:eastAsia="zh-CN"/>
-        </w:rPr>
-        <w:t>  Left</w:t>
-      </w:r>
-      <w:proofErr w:type="gramStart"/>
-      <w:r>
-        <w:rPr>
-          <w:rFonts w:ascii="Consolas" w:eastAsia="Times New Roman" w:hAnsi="Consolas" w:cs="Times New Roman"/>
-          <w:color w:val="D4D4D4"/>
-          <w:sz w:val="16"/>
-          <w:szCs w:val="16"/>
-          <w:lang w:eastAsia="zh-CN"/>
-        </w:rPr>
-        <w:t xml:space="preserve">1,   </w:t>
-      </w:r>
-      <w:proofErr w:type="gramEnd"/>
-      <w:r>
-        <w:rPr>
-          <w:rFonts w:ascii="Consolas" w:eastAsia="Times New Roman" w:hAnsi="Consolas" w:cs="Times New Roman"/>
-          <w:color w:val="D4D4D4"/>
-          <w:sz w:val="16"/>
-          <w:szCs w:val="16"/>
-          <w:lang w:eastAsia="zh-CN"/>
-        </w:rPr>
-        <w:t>   Right</w:t>
-      </w:r>
-      <w:proofErr w:type="gramStart"/>
-      <w:r>
-        <w:rPr>
-          <w:rFonts w:ascii="Consolas" w:eastAsia="Times New Roman" w:hAnsi="Consolas" w:cs="Times New Roman"/>
-          <w:color w:val="D4D4D4"/>
-          <w:sz w:val="16"/>
-          <w:szCs w:val="16"/>
-          <w:lang w:eastAsia="zh-CN"/>
-        </w:rPr>
-        <w:t xml:space="preserve">1,   </w:t>
-      </w:r>
-      <w:proofErr w:type="gramEnd"/>
-      <w:r>
-        <w:rPr>
-          <w:rFonts w:ascii="Consolas" w:eastAsia="Times New Roman" w:hAnsi="Consolas" w:cs="Times New Roman"/>
-          <w:color w:val="D4D4D4"/>
-          <w:sz w:val="16"/>
-          <w:szCs w:val="16"/>
-          <w:lang w:eastAsia="zh-CN"/>
-        </w:rPr>
-        <w:t xml:space="preserve">  </w:t>
-      </w:r>
-      <w:proofErr w:type="spellStart"/>
-      <w:r>
-        <w:rPr>
-          <w:rFonts w:ascii="Consolas" w:eastAsia="Times New Roman" w:hAnsi="Consolas" w:cs="Times New Roman"/>
-          <w:color w:val="D4D4D4"/>
-          <w:sz w:val="16"/>
-          <w:szCs w:val="16"/>
-          <w:lang w:eastAsia="zh-CN"/>
-        </w:rPr>
-        <w:t>Center</w:t>
-      </w:r>
-      <w:proofErr w:type="spellEnd"/>
-      <w:r>
-        <w:rPr>
-          <w:rFonts w:ascii="Consolas" w:eastAsia="Times New Roman" w:hAnsi="Consolas" w:cs="Times New Roman"/>
-          <w:color w:val="D4D4D4"/>
-          <w:sz w:val="16"/>
-          <w:szCs w:val="16"/>
-          <w:lang w:eastAsia="zh-CN"/>
-        </w:rPr>
-        <w:t xml:space="preserve">  </w:t>
-      </w:r>
-      <w:proofErr w:type="gramStart"/>
-      <w:r>
-        <w:rPr>
-          <w:rFonts w:ascii="Consolas" w:eastAsia="Times New Roman" w:hAnsi="Consolas" w:cs="Times New Roman"/>
-          <w:color w:val="D4D4D4"/>
-          <w:sz w:val="16"/>
-          <w:szCs w:val="16"/>
-          <w:lang w:eastAsia="zh-CN"/>
-        </w:rPr>
-        <w:t xml:space="preserve">  }</w:t>
-      </w:r>
-      <w:proofErr w:type="gramEnd"/>
-      <w:r>
-        <w:rPr>
-          <w:rFonts w:ascii="Consolas" w:eastAsia="Times New Roman" w:hAnsi="Consolas" w:cs="Times New Roman"/>
-          <w:color w:val="D4D4D4"/>
-          <w:sz w:val="16"/>
-          <w:szCs w:val="16"/>
-          <w:lang w:eastAsia="zh-CN"/>
-        </w:rPr>
-        <w:t>},</w:t>
+        <w:t>, { Right_off1,     Left1,      Right1,     Center    }},</w:t>
       </w:r>
       <w:r>
         <w:rPr>
@@ -3554,128 +2181,7 @@
           <w:szCs w:val="16"/>
           <w:lang w:eastAsia="zh-CN"/>
         </w:rPr>
-        <w:t xml:space="preserve">, </w:t>
-      </w:r>
-      <w:proofErr w:type="gramStart"/>
-      <w:r>
-        <w:rPr>
-          <w:rFonts w:ascii="Consolas" w:eastAsia="Times New Roman" w:hAnsi="Consolas" w:cs="Times New Roman"/>
-          <w:color w:val="D4D4D4"/>
-          <w:sz w:val="16"/>
-          <w:szCs w:val="16"/>
-          <w:lang w:eastAsia="zh-CN"/>
-        </w:rPr>
-        <w:t>{ Right</w:t>
-      </w:r>
-      <w:proofErr w:type="gramEnd"/>
-      <w:r>
-        <w:rPr>
-          <w:rFonts w:ascii="Consolas" w:eastAsia="Times New Roman" w:hAnsi="Consolas" w:cs="Times New Roman"/>
-          <w:color w:val="D4D4D4"/>
-          <w:sz w:val="16"/>
-          <w:szCs w:val="16"/>
-          <w:lang w:eastAsia="zh-CN"/>
-        </w:rPr>
-        <w:t>_off</w:t>
-      </w:r>
-      <w:proofErr w:type="gramStart"/>
-      <w:r>
-        <w:rPr>
-          <w:rFonts w:ascii="Consolas" w:eastAsia="Times New Roman" w:hAnsi="Consolas" w:cs="Times New Roman"/>
-          <w:color w:val="D4D4D4"/>
-          <w:sz w:val="16"/>
-          <w:szCs w:val="16"/>
-          <w:lang w:eastAsia="zh-CN"/>
-        </w:rPr>
-        <w:t xml:space="preserve">2,   </w:t>
-      </w:r>
-      <w:proofErr w:type="gramEnd"/>
-      <w:r>
-        <w:rPr>
-          <w:rFonts w:ascii="Consolas" w:eastAsia="Times New Roman" w:hAnsi="Consolas" w:cs="Times New Roman"/>
-          <w:color w:val="D4D4D4"/>
-          <w:sz w:val="16"/>
-          <w:szCs w:val="16"/>
-          <w:lang w:eastAsia="zh-CN"/>
-        </w:rPr>
-        <w:t xml:space="preserve">  </w:t>
-      </w:r>
-      <w:proofErr w:type="gramStart"/>
-      <w:r>
-        <w:rPr>
-          <w:rFonts w:ascii="Consolas" w:eastAsia="Times New Roman" w:hAnsi="Consolas" w:cs="Times New Roman"/>
-          <w:color w:val="D4D4D4"/>
-          <w:sz w:val="16"/>
-          <w:szCs w:val="16"/>
-          <w:lang w:eastAsia="zh-CN"/>
-        </w:rPr>
-        <w:t>Right</w:t>
-      </w:r>
-      <w:proofErr w:type="gramEnd"/>
-      <w:r>
-        <w:rPr>
-          <w:rFonts w:ascii="Consolas" w:eastAsia="Times New Roman" w:hAnsi="Consolas" w:cs="Times New Roman"/>
-          <w:color w:val="D4D4D4"/>
-          <w:sz w:val="16"/>
-          <w:szCs w:val="16"/>
-          <w:lang w:eastAsia="zh-CN"/>
-        </w:rPr>
-        <w:t xml:space="preserve">_off2, </w:t>
-      </w:r>
-      <w:proofErr w:type="gramStart"/>
-      <w:r>
-        <w:rPr>
-          <w:rFonts w:ascii="Consolas" w:eastAsia="Times New Roman" w:hAnsi="Consolas" w:cs="Times New Roman"/>
-          <w:color w:val="D4D4D4"/>
-          <w:sz w:val="16"/>
-          <w:szCs w:val="16"/>
-          <w:lang w:eastAsia="zh-CN"/>
-        </w:rPr>
-        <w:t>Right</w:t>
-      </w:r>
-      <w:proofErr w:type="gramEnd"/>
-      <w:r>
-        <w:rPr>
-          <w:rFonts w:ascii="Consolas" w:eastAsia="Times New Roman" w:hAnsi="Consolas" w:cs="Times New Roman"/>
-          <w:color w:val="D4D4D4"/>
-          <w:sz w:val="16"/>
-          <w:szCs w:val="16"/>
-          <w:lang w:eastAsia="zh-CN"/>
-        </w:rPr>
-        <w:t xml:space="preserve">_off2, </w:t>
-      </w:r>
-      <w:proofErr w:type="gramStart"/>
-      <w:r>
-        <w:rPr>
-          <w:rFonts w:ascii="Consolas" w:eastAsia="Times New Roman" w:hAnsi="Consolas" w:cs="Times New Roman"/>
-          <w:color w:val="D4D4D4"/>
-          <w:sz w:val="16"/>
-          <w:szCs w:val="16"/>
-          <w:lang w:eastAsia="zh-CN"/>
-        </w:rPr>
-        <w:t>Right</w:t>
-      </w:r>
-      <w:proofErr w:type="gramEnd"/>
-      <w:r>
-        <w:rPr>
-          <w:rFonts w:ascii="Consolas" w:eastAsia="Times New Roman" w:hAnsi="Consolas" w:cs="Times New Roman"/>
-          <w:color w:val="D4D4D4"/>
-          <w:sz w:val="16"/>
-          <w:szCs w:val="16"/>
-          <w:lang w:eastAsia="zh-CN"/>
-        </w:rPr>
-        <w:t>_off2}</w:t>
-      </w:r>
-      <w:proofErr w:type="gramStart"/>
-      <w:r>
-        <w:rPr>
-          <w:rFonts w:ascii="Consolas" w:eastAsia="Times New Roman" w:hAnsi="Consolas" w:cs="Times New Roman"/>
-          <w:color w:val="D4D4D4"/>
-          <w:sz w:val="16"/>
-          <w:szCs w:val="16"/>
-          <w:lang w:eastAsia="zh-CN"/>
-        </w:rPr>
-        <w:t>},</w:t>
+        <w:t>, { Right_off2,     Right_off2, Right_off2, Right_off2}},</w:t>
       </w:r>
       <w:r>
         <w:rPr>
@@ -3685,18 +2191,7 @@
           <w:szCs w:val="16"/>
           <w:lang w:eastAsia="zh-CN"/>
         </w:rPr>
-        <w:t xml:space="preserve">   </w:t>
-      </w:r>
-      <w:proofErr w:type="gramEnd"/>
-      <w:r>
-        <w:rPr>
-          <w:rFonts w:ascii="Consolas" w:eastAsia="Times New Roman" w:hAnsi="Consolas" w:cs="Times New Roman"/>
-          <w:color w:val="6A9955"/>
-          <w:sz w:val="16"/>
-          <w:szCs w:val="16"/>
-          <w:lang w:eastAsia="zh-CN"/>
-        </w:rPr>
-        <w:t>// Right_off1</w:t>
+        <w:t xml:space="preserve">   // Right_off1</w:t>
       </w:r>
     </w:p>
     <w:p>
@@ -3734,9 +2229,18 @@
           <w:szCs w:val="16"/>
           <w:lang w:eastAsia="zh-CN"/>
         </w:rPr>
-        <w:t>0x</w:t>
-      </w:r>
-      <w:proofErr w:type="gramStart"/>
+        <w:t>0x03</w:t>
+      </w:r>
+      <w:r>
+        <w:rPr>
+          <w:rFonts w:ascii="Consolas" w:eastAsia="Times New Roman" w:hAnsi="Consolas" w:cs="Times New Roman"/>
+          <w:color w:val="D4D4D4"/>
+          <w:sz w:val="16"/>
+          <w:szCs w:val="16"/>
+          <w:lang w:eastAsia="zh-CN"/>
+        </w:rPr>
+        <w:t>,  </w:t>
+      </w:r>
       <w:r>
         <w:rPr>
           <w:rFonts w:ascii="Consolas" w:eastAsia="Times New Roman" w:hAnsi="Consolas" w:cs="Times New Roman"/>
@@ -3745,7 +2249,7 @@
           <w:szCs w:val="16"/>
           <w:lang w:eastAsia="zh-CN"/>
         </w:rPr>
-        <w:t>03</w:t>
+        <w:t>5000</w:t>
       </w:r>
       <w:r>
         <w:rPr>
@@ -3755,182 +2259,7 @@
           <w:szCs w:val="16"/>
           <w:lang w:eastAsia="zh-CN"/>
         </w:rPr>
-        <w:t>,  </w:t>
-      </w:r>
-      <w:r>
-        <w:rPr>
-          <w:rFonts w:ascii="Consolas" w:eastAsia="Times New Roman" w:hAnsi="Consolas" w:cs="Times New Roman"/>
-          <w:color w:val="B5CEA8"/>
-          <w:sz w:val="16"/>
-          <w:szCs w:val="16"/>
-          <w:lang w:eastAsia="zh-CN"/>
-        </w:rPr>
-        <w:t>5000</w:t>
-      </w:r>
-      <w:proofErr w:type="gramEnd"/>
-      <w:r>
-        <w:rPr>
-          <w:rFonts w:ascii="Consolas" w:eastAsia="Times New Roman" w:hAnsi="Consolas" w:cs="Times New Roman"/>
-          <w:color w:val="D4D4D4"/>
-          <w:sz w:val="16"/>
-          <w:szCs w:val="16"/>
-          <w:lang w:eastAsia="zh-CN"/>
-        </w:rPr>
-        <w:t xml:space="preserve">, </w:t>
-      </w:r>
-      <w:proofErr w:type="gramStart"/>
-      <w:r>
-        <w:rPr>
-          <w:rFonts w:ascii="Consolas" w:eastAsia="Times New Roman" w:hAnsi="Consolas" w:cs="Times New Roman"/>
-          <w:color w:val="D4D4D4"/>
-          <w:sz w:val="16"/>
-          <w:szCs w:val="16"/>
-          <w:lang w:eastAsia="zh-CN"/>
-        </w:rPr>
-        <w:t xml:space="preserve">{ </w:t>
-      </w:r>
-      <w:proofErr w:type="spellStart"/>
-      <w:r>
-        <w:rPr>
-          <w:rFonts w:ascii="Consolas" w:eastAsia="Times New Roman" w:hAnsi="Consolas" w:cs="Times New Roman"/>
-          <w:color w:val="D4D4D4"/>
-          <w:sz w:val="16"/>
-          <w:szCs w:val="16"/>
-          <w:lang w:eastAsia="zh-CN"/>
-        </w:rPr>
-        <w:t>Right</w:t>
-      </w:r>
-      <w:proofErr w:type="gramEnd"/>
-      <w:r>
-        <w:rPr>
-          <w:rFonts w:ascii="Consolas" w:eastAsia="Times New Roman" w:hAnsi="Consolas" w:cs="Times New Roman"/>
-          <w:color w:val="D4D4D4"/>
-          <w:sz w:val="16"/>
-          <w:szCs w:val="16"/>
-          <w:lang w:eastAsia="zh-CN"/>
-        </w:rPr>
-        <w:t>_</w:t>
-      </w:r>
-      <w:proofErr w:type="gramStart"/>
-      <w:r>
-        <w:rPr>
-          <w:rFonts w:ascii="Consolas" w:eastAsia="Times New Roman" w:hAnsi="Consolas" w:cs="Times New Roman"/>
-          <w:color w:val="D4D4D4"/>
-          <w:sz w:val="16"/>
-          <w:szCs w:val="16"/>
-          <w:lang w:eastAsia="zh-CN"/>
-        </w:rPr>
-        <w:t>stop</w:t>
-      </w:r>
-      <w:proofErr w:type="spellEnd"/>
-      <w:r>
-        <w:rPr>
-          <w:rFonts w:ascii="Consolas" w:eastAsia="Times New Roman" w:hAnsi="Consolas" w:cs="Times New Roman"/>
-          <w:color w:val="D4D4D4"/>
-          <w:sz w:val="16"/>
-          <w:szCs w:val="16"/>
-          <w:lang w:eastAsia="zh-CN"/>
-        </w:rPr>
-        <w:t xml:space="preserve">,   </w:t>
-      </w:r>
-      <w:proofErr w:type="gramEnd"/>
-      <w:r>
-        <w:rPr>
-          <w:rFonts w:ascii="Consolas" w:eastAsia="Times New Roman" w:hAnsi="Consolas" w:cs="Times New Roman"/>
-          <w:color w:val="D4D4D4"/>
-          <w:sz w:val="16"/>
-          <w:szCs w:val="16"/>
-          <w:lang w:eastAsia="zh-CN"/>
-        </w:rPr>
-        <w:t>  Left</w:t>
-      </w:r>
-      <w:proofErr w:type="gramStart"/>
-      <w:r>
-        <w:rPr>
-          <w:rFonts w:ascii="Consolas" w:eastAsia="Times New Roman" w:hAnsi="Consolas" w:cs="Times New Roman"/>
-          <w:color w:val="D4D4D4"/>
-          <w:sz w:val="16"/>
-          <w:szCs w:val="16"/>
-          <w:lang w:eastAsia="zh-CN"/>
-        </w:rPr>
-        <w:t xml:space="preserve">1,   </w:t>
-      </w:r>
-      <w:proofErr w:type="gramEnd"/>
-      <w:r>
-        <w:rPr>
-          <w:rFonts w:ascii="Consolas" w:eastAsia="Times New Roman" w:hAnsi="Consolas" w:cs="Times New Roman"/>
-          <w:color w:val="D4D4D4"/>
-          <w:sz w:val="16"/>
-          <w:szCs w:val="16"/>
-          <w:lang w:eastAsia="zh-CN"/>
-        </w:rPr>
-        <w:t>   Right</w:t>
-      </w:r>
-      <w:proofErr w:type="gramStart"/>
-      <w:r>
-        <w:rPr>
-          <w:rFonts w:ascii="Consolas" w:eastAsia="Times New Roman" w:hAnsi="Consolas" w:cs="Times New Roman"/>
-          <w:color w:val="D4D4D4"/>
-          <w:sz w:val="16"/>
-          <w:szCs w:val="16"/>
-          <w:lang w:eastAsia="zh-CN"/>
-        </w:rPr>
-        <w:t xml:space="preserve">1,   </w:t>
-      </w:r>
-      <w:proofErr w:type="gramEnd"/>
-      <w:r>
-        <w:rPr>
-          <w:rFonts w:ascii="Consolas" w:eastAsia="Times New Roman" w:hAnsi="Consolas" w:cs="Times New Roman"/>
-          <w:color w:val="D4D4D4"/>
-          <w:sz w:val="16"/>
-          <w:szCs w:val="16"/>
-          <w:lang w:eastAsia="zh-CN"/>
-        </w:rPr>
-        <w:t xml:space="preserve">  </w:t>
-      </w:r>
-      <w:proofErr w:type="spellStart"/>
-      <w:r>
-        <w:rPr>
-          <w:rFonts w:ascii="Consolas" w:eastAsia="Times New Roman" w:hAnsi="Consolas" w:cs="Times New Roman"/>
-          <w:color w:val="D4D4D4"/>
-          <w:sz w:val="16"/>
-          <w:szCs w:val="16"/>
-          <w:lang w:eastAsia="zh-CN"/>
-        </w:rPr>
-        <w:t>Center</w:t>
-      </w:r>
-      <w:proofErr w:type="spellEnd"/>
-      <w:r>
-        <w:rPr>
-          <w:rFonts w:ascii="Consolas" w:eastAsia="Times New Roman" w:hAnsi="Consolas" w:cs="Times New Roman"/>
-          <w:color w:val="D4D4D4"/>
-          <w:sz w:val="16"/>
-          <w:szCs w:val="16"/>
-          <w:lang w:eastAsia="zh-CN"/>
-        </w:rPr>
-        <w:t xml:space="preserve">  </w:t>
-      </w:r>
-      <w:proofErr w:type="gramStart"/>
-      <w:r>
-        <w:rPr>
-          <w:rFonts w:ascii="Consolas" w:eastAsia="Times New Roman" w:hAnsi="Consolas" w:cs="Times New Roman"/>
-          <w:color w:val="D4D4D4"/>
-          <w:sz w:val="16"/>
-          <w:szCs w:val="16"/>
-          <w:lang w:eastAsia="zh-CN"/>
-        </w:rPr>
-        <w:t xml:space="preserve">  }</w:t>
-      </w:r>
-      <w:proofErr w:type="gramEnd"/>
-      <w:r>
-        <w:rPr>
-          <w:rFonts w:ascii="Consolas" w:eastAsia="Times New Roman" w:hAnsi="Consolas" w:cs="Times New Roman"/>
-          <w:color w:val="D4D4D4"/>
-          <w:sz w:val="16"/>
-          <w:szCs w:val="16"/>
-          <w:lang w:eastAsia="zh-CN"/>
-        </w:rPr>
-        <w:t>},</w:t>
+        <w:t>, { Right_stop,     Left1,      Right1,     Center    }},</w:t>
       </w:r>
       <w:r>
         <w:rPr>
@@ -3978,9 +2307,18 @@
           <w:szCs w:val="16"/>
           <w:lang w:eastAsia="zh-CN"/>
         </w:rPr>
-        <w:t>0x</w:t>
-      </w:r>
-      <w:proofErr w:type="gramStart"/>
+        <w:t>0x00</w:t>
+      </w:r>
+      <w:r>
+        <w:rPr>
+          <w:rFonts w:ascii="Consolas" w:eastAsia="Times New Roman" w:hAnsi="Consolas" w:cs="Times New Roman"/>
+          <w:color w:val="D4D4D4"/>
+          <w:sz w:val="16"/>
+          <w:szCs w:val="16"/>
+          <w:lang w:eastAsia="zh-CN"/>
+        </w:rPr>
+        <w:t>,  </w:t>
+      </w:r>
       <w:r>
         <w:rPr>
           <w:rFonts w:ascii="Consolas" w:eastAsia="Times New Roman" w:hAnsi="Consolas" w:cs="Times New Roman"/>
@@ -3989,7 +2327,7 @@
           <w:szCs w:val="16"/>
           <w:lang w:eastAsia="zh-CN"/>
         </w:rPr>
-        <w:t>00</w:t>
+        <w:t>500</w:t>
       </w:r>
       <w:r>
         <w:rPr>
@@ -3999,197 +2337,7 @@
           <w:szCs w:val="16"/>
           <w:lang w:eastAsia="zh-CN"/>
         </w:rPr>
-        <w:t>,  </w:t>
-      </w:r>
-      <w:r>
-        <w:rPr>
-          <w:rFonts w:ascii="Consolas" w:eastAsia="Times New Roman" w:hAnsi="Consolas" w:cs="Times New Roman"/>
-          <w:color w:val="B5CEA8"/>
-          <w:sz w:val="16"/>
-          <w:szCs w:val="16"/>
-          <w:lang w:eastAsia="zh-CN"/>
-        </w:rPr>
-        <w:t>500</w:t>
-      </w:r>
-      <w:proofErr w:type="gramEnd"/>
-      <w:r>
-        <w:rPr>
-          <w:rFonts w:ascii="Consolas" w:eastAsia="Times New Roman" w:hAnsi="Consolas" w:cs="Times New Roman"/>
-          <w:color w:val="D4D4D4"/>
-          <w:sz w:val="16"/>
-          <w:szCs w:val="16"/>
-          <w:lang w:eastAsia="zh-CN"/>
-        </w:rPr>
-        <w:t xml:space="preserve">, </w:t>
-      </w:r>
-      <w:proofErr w:type="gramStart"/>
-      <w:r>
-        <w:rPr>
-          <w:rFonts w:ascii="Consolas" w:eastAsia="Times New Roman" w:hAnsi="Consolas" w:cs="Times New Roman"/>
-          <w:color w:val="D4D4D4"/>
-          <w:sz w:val="16"/>
-          <w:szCs w:val="16"/>
-          <w:lang w:eastAsia="zh-CN"/>
-        </w:rPr>
-        <w:t xml:space="preserve">{ </w:t>
-      </w:r>
-      <w:proofErr w:type="spellStart"/>
-      <w:r>
-        <w:rPr>
-          <w:rFonts w:ascii="Consolas" w:eastAsia="Times New Roman" w:hAnsi="Consolas" w:cs="Times New Roman"/>
-          <w:color w:val="D4D4D4"/>
-          <w:sz w:val="16"/>
-          <w:szCs w:val="16"/>
-          <w:lang w:eastAsia="zh-CN"/>
-        </w:rPr>
-        <w:t>Right</w:t>
-      </w:r>
-      <w:proofErr w:type="gramEnd"/>
-      <w:r>
-        <w:rPr>
-          <w:rFonts w:ascii="Consolas" w:eastAsia="Times New Roman" w:hAnsi="Consolas" w:cs="Times New Roman"/>
-          <w:color w:val="D4D4D4"/>
-          <w:sz w:val="16"/>
-          <w:szCs w:val="16"/>
-          <w:lang w:eastAsia="zh-CN"/>
-        </w:rPr>
-        <w:t>_</w:t>
-      </w:r>
-      <w:proofErr w:type="gramStart"/>
-      <w:r>
-        <w:rPr>
-          <w:rFonts w:ascii="Consolas" w:eastAsia="Times New Roman" w:hAnsi="Consolas" w:cs="Times New Roman"/>
-          <w:color w:val="D4D4D4"/>
-          <w:sz w:val="16"/>
-          <w:szCs w:val="16"/>
-          <w:lang w:eastAsia="zh-CN"/>
-        </w:rPr>
-        <w:t>stop</w:t>
-      </w:r>
-      <w:proofErr w:type="spellEnd"/>
-      <w:r>
-        <w:rPr>
-          <w:rFonts w:ascii="Consolas" w:eastAsia="Times New Roman" w:hAnsi="Consolas" w:cs="Times New Roman"/>
-          <w:color w:val="D4D4D4"/>
-          <w:sz w:val="16"/>
-          <w:szCs w:val="16"/>
-          <w:lang w:eastAsia="zh-CN"/>
-        </w:rPr>
-        <w:t xml:space="preserve">,   </w:t>
-      </w:r>
-      <w:proofErr w:type="gramEnd"/>
-      <w:r>
-        <w:rPr>
-          <w:rFonts w:ascii="Consolas" w:eastAsia="Times New Roman" w:hAnsi="Consolas" w:cs="Times New Roman"/>
-          <w:color w:val="D4D4D4"/>
-          <w:sz w:val="16"/>
-          <w:szCs w:val="16"/>
-          <w:lang w:eastAsia="zh-CN"/>
-        </w:rPr>
-        <w:t xml:space="preserve">  </w:t>
-      </w:r>
-      <w:proofErr w:type="spellStart"/>
-      <w:proofErr w:type="gramStart"/>
-      <w:r>
-        <w:rPr>
-          <w:rFonts w:ascii="Consolas" w:eastAsia="Times New Roman" w:hAnsi="Consolas" w:cs="Times New Roman"/>
-          <w:color w:val="D4D4D4"/>
-          <w:sz w:val="16"/>
-          <w:szCs w:val="16"/>
-          <w:lang w:eastAsia="zh-CN"/>
-        </w:rPr>
-        <w:t>Right</w:t>
-      </w:r>
-      <w:proofErr w:type="gramEnd"/>
-      <w:r>
-        <w:rPr>
-          <w:rFonts w:ascii="Consolas" w:eastAsia="Times New Roman" w:hAnsi="Consolas" w:cs="Times New Roman"/>
-          <w:color w:val="D4D4D4"/>
-          <w:sz w:val="16"/>
-          <w:szCs w:val="16"/>
-          <w:lang w:eastAsia="zh-CN"/>
-        </w:rPr>
-        <w:t>_stop</w:t>
-      </w:r>
-      <w:proofErr w:type="spellEnd"/>
-      <w:r>
-        <w:rPr>
-          <w:rFonts w:ascii="Consolas" w:eastAsia="Times New Roman" w:hAnsi="Consolas" w:cs="Times New Roman"/>
-          <w:color w:val="D4D4D4"/>
-          <w:sz w:val="16"/>
-          <w:szCs w:val="16"/>
-          <w:lang w:eastAsia="zh-CN"/>
-        </w:rPr>
-        <w:t xml:space="preserve">, </w:t>
-      </w:r>
-      <w:proofErr w:type="spellStart"/>
-      <w:proofErr w:type="gramStart"/>
-      <w:r>
-        <w:rPr>
-          <w:rFonts w:ascii="Consolas" w:eastAsia="Times New Roman" w:hAnsi="Consolas" w:cs="Times New Roman"/>
-          <w:color w:val="D4D4D4"/>
-          <w:sz w:val="16"/>
-          <w:szCs w:val="16"/>
-          <w:lang w:eastAsia="zh-CN"/>
-        </w:rPr>
-        <w:t>Right</w:t>
-      </w:r>
-      <w:proofErr w:type="gramEnd"/>
-      <w:r>
-        <w:rPr>
-          <w:rFonts w:ascii="Consolas" w:eastAsia="Times New Roman" w:hAnsi="Consolas" w:cs="Times New Roman"/>
-          <w:color w:val="D4D4D4"/>
-          <w:sz w:val="16"/>
-          <w:szCs w:val="16"/>
-          <w:lang w:eastAsia="zh-CN"/>
-        </w:rPr>
-        <w:t>_stop</w:t>
-      </w:r>
-      <w:proofErr w:type="spellEnd"/>
-      <w:r>
-        <w:rPr>
-          <w:rFonts w:ascii="Consolas" w:eastAsia="Times New Roman" w:hAnsi="Consolas" w:cs="Times New Roman"/>
-          <w:color w:val="D4D4D4"/>
-          <w:sz w:val="16"/>
-          <w:szCs w:val="16"/>
-          <w:lang w:eastAsia="zh-CN"/>
-        </w:rPr>
-        <w:t xml:space="preserve">, </w:t>
-      </w:r>
-      <w:proofErr w:type="spellStart"/>
-      <w:proofErr w:type="gramStart"/>
-      <w:r>
-        <w:rPr>
-          <w:rFonts w:ascii="Consolas" w:eastAsia="Times New Roman" w:hAnsi="Consolas" w:cs="Times New Roman"/>
-          <w:color w:val="D4D4D4"/>
-          <w:sz w:val="16"/>
-          <w:szCs w:val="16"/>
-          <w:lang w:eastAsia="zh-CN"/>
-        </w:rPr>
-        <w:t>Right</w:t>
-      </w:r>
-      <w:proofErr w:type="gramEnd"/>
-      <w:r>
-        <w:rPr>
-          <w:rFonts w:ascii="Consolas" w:eastAsia="Times New Roman" w:hAnsi="Consolas" w:cs="Times New Roman"/>
-          <w:color w:val="D4D4D4"/>
-          <w:sz w:val="16"/>
-          <w:szCs w:val="16"/>
-          <w:lang w:eastAsia="zh-CN"/>
-        </w:rPr>
-        <w:t>_stop</w:t>
-      </w:r>
-      <w:proofErr w:type="spellEnd"/>
-      <w:proofErr w:type="gramStart"/>
-      <w:r>
-        <w:rPr>
-          <w:rFonts w:ascii="Consolas" w:eastAsia="Times New Roman" w:hAnsi="Consolas" w:cs="Times New Roman"/>
-          <w:color w:val="D4D4D4"/>
-          <w:sz w:val="16"/>
-          <w:szCs w:val="16"/>
-          <w:lang w:eastAsia="zh-CN"/>
-        </w:rPr>
-        <w:t>}}</w:t>
+        <w:t>, { Right_stop,     Right_stop, Right_stop, Right_stop}}</w:t>
       </w:r>
       <w:r>
         <w:rPr>
@@ -4199,31 +2347,8 @@
           <w:szCs w:val="16"/>
           <w:lang w:eastAsia="zh-CN"/>
         </w:rPr>
-        <w:t xml:space="preserve">   </w:t>
-      </w:r>
-      <w:proofErr w:type="gramEnd"/>
-      <w:r>
-        <w:rPr>
-          <w:rFonts w:ascii="Consolas" w:eastAsia="Times New Roman" w:hAnsi="Consolas" w:cs="Times New Roman"/>
-          <w:color w:val="6A9955"/>
-          <w:sz w:val="16"/>
-          <w:szCs w:val="16"/>
-          <w:lang w:eastAsia="zh-CN"/>
-        </w:rPr>
-        <w:t xml:space="preserve"> // </w:t>
-      </w:r>
-      <w:proofErr w:type="spellStart"/>
-      <w:r>
-        <w:rPr>
-          <w:rFonts w:ascii="Consolas" w:eastAsia="Times New Roman" w:hAnsi="Consolas" w:cs="Times New Roman"/>
-          <w:color w:val="6A9955"/>
-          <w:sz w:val="16"/>
-          <w:szCs w:val="16"/>
-          <w:lang w:eastAsia="zh-CN"/>
-        </w:rPr>
-        <w:t>Right_stop</w:t>
-      </w:r>
-      <w:proofErr w:type="spellEnd"/>
+        <w:t xml:space="preserve">    // Right_stop</w:t>
+      </w:r>
     </w:p>
     <w:p>
       <w:pPr>
@@ -4379,29 +2504,7 @@
           <w:lang w:val="en-US"/>
         </w:rPr>
         <w:lastRenderedPageBreak/>
-        <w:t xml:space="preserve">It acts as an indicator LED to visually show that the routine is actively running </w:t>
-      </w:r>
-      <w:proofErr w:type="gramStart"/>
-      <w:r>
-        <w:rPr>
-          <w:rFonts w:ascii="Arial" w:hAnsi="Arial" w:cs="Arial"/>
-          <w:color w:val="FF0000"/>
-          <w:sz w:val="20"/>
-          <w:szCs w:val="20"/>
-          <w:lang w:val="en-US"/>
-        </w:rPr>
-        <w:t>as long as</w:t>
-      </w:r>
-      <w:proofErr w:type="gramEnd"/>
-      <w:r>
-        <w:rPr>
-          <w:rFonts w:ascii="Arial" w:hAnsi="Arial" w:cs="Arial"/>
-          <w:color w:val="FF0000"/>
-          <w:sz w:val="20"/>
-          <w:szCs w:val="20"/>
-          <w:lang w:val="en-US"/>
-        </w:rPr>
-        <w:t xml:space="preserve"> the LED is toggling off and on, it helps to monitor the system activity in real time.</w:t>
+        <w:t>It acts as an indicator LED to visually show that the routine is actively running as long as the LED is toggling off and on, it helps to monitor the system activity in real time.</w:t>
       </w:r>
       <w:r>
         <w:rPr>
@@ -4415,9 +2518,9 @@
       </w:r>
     </w:p>
     <w:sectPr>
-      <w:headerReference w:type="default" r:id="rId9"/>
-      <w:footerReference w:type="default" r:id="rId10"/>
-      <w:footerReference w:type="first" r:id="rId11"/>
+      <w:headerReference w:type="default" r:id="rId13"/>
+      <w:footerReference w:type="default" r:id="rId14"/>
+      <w:footerReference w:type="first" r:id="rId15"/>
       <w:pgSz w:w="11906" w:h="16838"/>
       <w:pgMar w:top="1440" w:right="1440" w:bottom="1440" w:left="1440" w:header="708" w:footer="708" w:gutter="0"/>
       <w:cols w:space="708"/>
@@ -7563,6 +5666,91 @@
 </w:styles>
 </file>
 
+<file path=word/ink/ink1.xml><?xml version="1.0" encoding="utf-8"?>
+<inkml:ink xmlns:inkml="http://www.w3.org/2003/InkML">
+  <inkml:definitions>
+    <inkml:context xml:id="ctx0">
+      <inkml:inkSource xml:id="inkSrc0">
+        <inkml:traceFormat>
+          <inkml:channel name="X" type="integer" min="-2.14748E9" max="2.14748E9" units="cm"/>
+          <inkml:channel name="Y" type="integer" min="-2.14748E9" max="2.14748E9" units="cm"/>
+          <inkml:channel name="F" type="integer" max="32767" units="dev"/>
+        </inkml:traceFormat>
+        <inkml:channelProperties>
+          <inkml:channelProperty channel="X" name="resolution" value="1000" units="1/cm"/>
+          <inkml:channelProperty channel="Y" name="resolution" value="1000" units="1/cm"/>
+          <inkml:channelProperty channel="F" name="resolution" value="0" units="1/dev"/>
+        </inkml:channelProperties>
+      </inkml:inkSource>
+      <inkml:timestamp xml:id="ts0" timeString="2025-09-14T18:07:09.534"/>
+    </inkml:context>
+    <inkml:brush xml:id="br0">
+      <inkml:brushProperty name="width" value="0.035" units="cm"/>
+      <inkml:brushProperty name="height" value="0.035" units="cm"/>
+      <inkml:brushProperty name="color" value="#E71224"/>
+    </inkml:brush>
+  </inkml:definitions>
+  <inkml:trace contextRef="#ctx0" brushRef="#br0">2645 1799 24575,'0'5'0,"0"6"0,0 5 0,0 5 0,0 3 0,0 2 0,0 1 0,0 0 0,0 1 0,0-1 0,0 1 0,0-1 0,0-5-8191</inkml:trace>
+  <inkml:trace contextRef="#ctx0" brushRef="#br0" timeOffset="406.42">2673 2646 24575,'0'5'0,"0"5"0,0 6 0,0 5 0,0 3 0,0 2 0,0 2 0,0-1 0,0 1 0,0-1 0,0-4-8191</inkml:trace>
+  <inkml:trace contextRef="#ctx0" brushRef="#br0" timeOffset="-1742.2">2751 0 24575,'0'5'0,"-4"1"0,-2 4 0,0 5 0,2 4 0,1 4 0,1 3 0,0 0 0,2-3-8191</inkml:trace>
+  <inkml:trace contextRef="#ctx0" brushRef="#br0" timeOffset="-841.28">2673 397 24575,'0'5'0,"0"5"0,0 6 0,0 5 0,0 3 0,0 2 0,0 2 0,0-1 0,0 1 0,0-1 0,0 0 0,0 0 0,0-5-8191</inkml:trace>
+  <inkml:trace contextRef="#ctx0" brushRef="#br0" timeOffset="-420.38">2673 954 24575,'0'5'0,"0"5"0,0 6 0,0 5 0,0 3 0,0 2 0,0 1 0,0 1 0,0-1 0,0 1 0,0-1 0,0-4-8191</inkml:trace>
+  <inkml:trace contextRef="#ctx0" brushRef="#br0" timeOffset="1726.58">7699 79 24575,'0'425'-1365,"0"-402"-5461</inkml:trace>
+  <inkml:trace contextRef="#ctx0" brushRef="#br0" timeOffset="2006.18">7725 1085 24575,'0'5'0,"0"5"0,0 6 0,0 5 0,0 3 0,0 2 0,0 2 0,0-1 0,0-4-8191</inkml:trace>
+  <inkml:trace contextRef="#ctx0" brushRef="#br0" timeOffset="2240.17">7725 1984 24575,'0'5'0,"0"6"0,0 5 0,5 0 0,1 2 0,0 3 0,-2 1 0,0 3 0,-2-4-8191</inkml:trace>
+  <inkml:trace contextRef="#ctx0" brushRef="#br0" timeOffset="2457.3">7778 2515 24575,'0'5'0,"0"5"0,0 6 0,0 5 0,0 3 0,0 2 0,0 1 0,0 1 0,0-1 0,0 1 0,0-1 0,0-4-8191</inkml:trace>
+  <inkml:trace contextRef="#ctx0" brushRef="#br0" timeOffset="2642.98">7752 3228 24575,'0'5'0,"0"5"0,0 6 0,0 5 0,0 3 0,-4-2 0,-3-5-8191</inkml:trace>
+  <inkml:trace contextRef="#ctx0" brushRef="#br0" timeOffset="3560.45">5185 185 24575,'0'5'0,"0"6"0,0 5 0,0 5 0,0 3 0,0 2 0,0 1 0,0 1 0,0-1 0,0 0 0,0-4-8191</inkml:trace>
+  <inkml:trace contextRef="#ctx0" brushRef="#br0" timeOffset="3873.37">5159 1032 24575,'0'5'0,"0"5"0,0 6 0,5 1 0,0 1 0,1 2 0,-1 3 0,-2-3-8191</inkml:trace>
+  <inkml:trace contextRef="#ctx0" brushRef="#br0" timeOffset="4137.29">5238 1614 24575,'5'0'0,"1"5"0,0 5 0,-2 6 0,0 5 0,-2 3 0,-1 2 0,-1 2 0,0-1 0,0 1 0,0-5-8191</inkml:trace>
+  <inkml:trace contextRef="#ctx0" brushRef="#br0" timeOffset="4386.5">5106 2487 24575,'0'5'0,"0"6"0,0 5 0,0 4 0,0 4 0,0 3 0,0-5-8191</inkml:trace>
+  <inkml:trace contextRef="#ctx0" brushRef="#br0" timeOffset="4619.7">5185 2937 24575,'0'5'0,"0"5"0,0 6 0,0 1-8191</inkml:trace>
+  <inkml:trace contextRef="#ctx0" brushRef="#br0" timeOffset="10392.42">1481 26 24575,'0'5'0,"0"6"0,0 5 0,-4 0 0,-2 2 0,0 3 0,2 1 0,1 3 0,0 0 0,2 2 0,1-5-8191</inkml:trace>
+  <inkml:trace contextRef="#ctx0" brushRef="#br0" timeOffset="10704.27">1349 767 24575,'0'5'0,"-4"1"0,-3 4 0,2 6 0,0 3 0,2 4 0,1 2 0,0 2 0,2 0 0,-4 0 0,-2 0 0,1 0 0,0 0 0,2 0 0,1 0 0,1-5-8191</inkml:trace>
+  <inkml:trace contextRef="#ctx0" brushRef="#br0" timeOffset="11015.7">1321 1880 24575,'0'5'0,"5"1"0,1 4 0,4 5 0,1 4 0,-2 4 0,2-2 0,-1-1 0,-2 2 0,3-4 0,-2 0 0,3-3 0,-1 0 0,-2 3 0,-2 2 0,-3-2-8191</inkml:trace>
+  <inkml:trace contextRef="#ctx0" brushRef="#br0" timeOffset="11218.7">1456 2566 24575,'0'5'0,"0"6"0,0 5 0,0 5 0,0 3 0,0 2 0,0 1 0,0 1 0,0-1 0,0-4-8191</inkml:trace>
+  <inkml:trace contextRef="#ctx0" brushRef="#br0" timeOffset="11406.67">1456 3122 24575,'0'5'0,"0"6"0,0 5 0,0 4 0,0 4 0,0 3 0,0 0 0,0 0 0,0-4-8191</inkml:trace>
+  <inkml:trace contextRef="#ctx0" brushRef="#br0" timeOffset="12232.8">3943 159 24575,'2'1'0,"0"-1"0,0 1 0,1-1 0,-1 1 0,0 0 0,0 0 0,0 0 0,-1 0 0,1 0 0,0 0 0,0 0 0,-1 1 0,1-1 0,0 1 0,-1-1 0,0 1 0,1 0 0,-1-1 0,0 1 0,0 0 0,0 0 0,0 0 0,0 0 0,0 0 0,0 0 0,0 4 0,2 5 0,0-1 0,-1 1 0,2 20 0,-3 147 75,-3-88-1515,2-68-5386</inkml:trace>
+  <inkml:trace contextRef="#ctx0" brushRef="#br0" timeOffset="12466">3967 1402 24575,'0'5'0,"0"6"0,0 5 0,0 5 0,0 3 0,0 2 0,0 1 0,0 1 0,0-1 0,0 1 0,0-1 0,0-5-8191</inkml:trace>
+  <inkml:trace contextRef="#ctx0" brushRef="#br0" timeOffset="12667.86">3941 2275 24575,'2'95'0,"-5"103"0,-20-66-1365,21-109-5461</inkml:trace>
+  <inkml:trace contextRef="#ctx0" brushRef="#br0" timeOffset="12841.2">3914 3096 24575,'0'5'0,"0"5"0,5 6 0,1 5 0,0 3 0,-2 2 0,4-3 0,0-6-8191</inkml:trace>
+  <inkml:trace contextRef="#ctx0" brushRef="#br0" timeOffset="16916.88">6509 132 24575,'0'5'0,"0"6"0,-4 0 0,-2 4 0,0 4 0,2 2 0,-4-1 0,0-1 0,1 2 0,2 1 0,1 2 0,3 1 0,0 1 0,1 0 0,0 1 0,-4-5 0,-2-1 0,1-4-8191</inkml:trace>
+  <inkml:trace contextRef="#ctx0" brushRef="#br0" timeOffset="17180.42">6350 873 24575,'0'5'0,"0"6"0,0 5 0,0 5 0,0 3 0,0 2 0,0 1 0,0 0 0,0 1 0,0-1 0,0 1 0,0-6-8191</inkml:trace>
+  <inkml:trace contextRef="#ctx0" brushRef="#br0" timeOffset="17412.73">6350 1693 24575,'0'5'0,"0"6"0,0 5 0,0 5 0,0 3 0,0 2 0,0 1 0,0 1 0,0-1 0,0 1 0,0-1 0,0-5-8191</inkml:trace>
+  <inkml:trace contextRef="#ctx0" brushRef="#br0" timeOffset="17614.31">6323 2249 24575,'2'104'0,"-5"112"0,-21-59-1365,22-134-5461</inkml:trace>
+  <inkml:trace contextRef="#ctx0" brushRef="#br0" timeOffset="17739.25">6297 3122 24575,'0'5'0,"0"6"0,0 5 0,0 4 0,0 4 0,0 3 0,0 0 0,0-4-8191</inkml:trace>
+  <inkml:trace contextRef="#ctx0" brushRef="#br0" timeOffset="44549.14">0 2514 24575,'37'0'0,"1"-1"0,1 2 0,-1 1 0,60 12 0,-52-7 0,0-1 0,1-3 0,0-2 0,47-5 0,12 1 0,-75 5 0,58 10 0,-58-7 0,55 3 0,58-10 0,110 4 0,-221 5 0,-29-6 0,0 1 0,1-1 0,-1 0 0,1-1 0,0 1 0,-1-1 0,1 0 0,5 0 0,-8-1 0,-1 0 0,1 1 0,-1-1 0,1 0 0,-1 0 0,0 0 0,1 0 0,-1 0 0,0 0 0,0 0 0,1 0 0,-1 0 0,0-1 0,0 1 0,0-1 0,0 1 0,-1 0 0,1-1 0,0 0 0,-1 1 0,1-1 0,-1 1 0,1-1 0,-1 0 0,0 1 0,0-1 0,1-3 0,2-35 0,-1 0 0,-2 0 0,-7-53 0,1 57 0,-15-55 0,14 64 0,0 0 0,2-1 0,-3-54 0,7 75 0,1 0 0,0-1 0,1 1 0,0 0 0,0 0 0,0-1 0,1 1 0,4-12 0,-4 17 0,0-1 0,0 1 0,0-1 0,0 1 0,0 0 0,1 0 0,-1 0 0,1 0 0,-1 0 0,1 1 0,0-1 0,-1 1 0,1-1 0,0 1 0,0 0 0,0 0 0,0 0 0,0 1 0,0-1 0,0 1 0,1 0 0,5 0 0,3 0 0,0 0 0,0 2 0,0-1 0,0 1 0,0 1 0,-1 0 0,1 1 0,-1 0 0,12 6 0,23 8 0,38 1 0,-39-10 0,-1-2 0,1-2 0,-1-2 0,85-6 0,-29 0 0,-93 3 0,11 1 0,0 0 0,0-2 0,0 0 0,0-1 0,0-1 0,-1-1 0,1 0 0,-1-1 0,17-8 0,-11 3 0,1 0 0,0 2 0,0 1 0,49-8 0,-48 10 0,-1-1 0,46-18 0,-45 14 0,0 1 0,27-4 0,-50 12 0,-1 1 0,0 0 0,1 0 0,-1 0 0,0 0 0,1 0 0,-1 0 0,0 0 0,1 0 0,-1 0 0,0 1 0,1-1 0,-1 1 0,0-1 0,0 1 0,1-1 0,-1 1 0,0 0 0,0-1 0,0 1 0,0 0 0,0 0 0,1 1 0,0 0 0,0 1 0,-1 0 0,1-1 0,-1 1 0,1 0 0,-1 0 0,0 0 0,-1-1 0,1 1 0,0 4 0,1 10 0,-1-1 0,0 1 0,-3 19 0,1-19 0,-2 451 0,3-297 0,0-165 0,0-1 0,1 1 0,-1 0 0,1-1 0,0 1 0,3 8 0,-4-13 0,1 0 0,-1 0 0,0-1 0,1 1 0,-1 0 0,1-1 0,-1 1 0,1 0 0,-1-1 0,1 1 0,-1-1 0,1 1 0,0 0 0,-1-1 0,1 0 0,0 1 0,0-1 0,-1 1 0,1-1 0,0 0 0,1 1 0,-1-1 0,1 0 0,-1-1 0,0 1 0,1 0 0,-1 0 0,1-1 0,-1 1 0,0-1 0,1 1 0,-1-1 0,0 0 0,1 1 0,-1-1 0,0 0 0,0 0 0,2-2 0,4-2 0,-1-1 0,2 1 0,-1 0 0,0 0 0,1 1 0,0 0 0,0 0 0,0 1 0,0 0 0,1 0 0,-1 1 0,1 1 0,0-1 0,0 1 0,12 0 0,9 0 0,-2 1 0,0-1 0,-1-2 0,31-6 0,-12 2 0,0 1 0,1 3 0,-1 2 0,50 5 0,10-2 0,476-2 0,-562-1 0,0-1 0,35-8 0,-33 5 0,-1 2 0,26-2 0,43 4 0,-40 2 0,-1-3 0,80-12 0,-24 2 0,-71 9 0,49-9 0,91-14 0,-4-1 0,-128 20 0,1 2 0,0 2 0,0 2 0,47 5 0,9-2 0,694-2 0,-789 1 0,0-1 0,-1 0 0,1 0 0,-1-1 0,1 1 0,-1-1 0,1 1 0,-1-1 0,1 0 0,-1-1 0,0 1 0,0-1 0,1 1 0,-1-1 0,5-4 0,-5 3 0,0-1 0,-1 0 0,0 1 0,0-1 0,0 0 0,0 0 0,0 0 0,-1 0 0,0 0 0,0-1 0,0 1 0,1-7 0,19-89 0,-13 71 0,-1 0 0,-2 0 0,3-53 0,-12-71 0,7-144 0,-3 294 0,1 0 0,0 0 0,-1 1 0,1-1 0,0 0 0,0 1 0,1-1 0,-1 0 0,0 1 0,1 0 0,0-1 0,-1 1 0,1 0 0,0 0 0,0 0 0,1 0 0,-1 0 0,0 0 0,0 1 0,1-1 0,-1 1 0,1-1 0,0 1 0,-1 0 0,1 0 0,0 0 0,-1 1 0,1-1 0,0 1 0,6-1 0,10-1 0,1 1 0,-1 1 0,33 4 0,-16-1 0,-8-2 0,17 1 0,0-1 0,0-2 0,0-3 0,50-9 0,-50 5 0,1 3 0,0 2 0,-1 2 0,53 5 0,8-2 0,5-4 0,122 5 0,-229-2 0,0-1 0,1 1 0,-1 0 0,0 0 0,0 0 0,0 1 0,0-1 0,0 1 0,0 0 0,0 0 0,-1 1 0,1-1 0,0 1 0,-1 0 0,0 0 0,0 0 0,0 0 0,3 5 0,2 3 0,-2 1 0,1 0 0,-1 1 0,5 18 0,14 28 0,-18-48 0,0 2 0,-1-1 0,0 0 0,-2 1 0,1 0 0,-1 0 0,-1 1 0,0-1 0,-1 1 0,0 21 0,0-6 0,9 46 0,-6-46 0,2 51 0,-8 370 0,1-444 0,0-1 0,1 0 0,-1 1 0,1-1 0,0 0 0,1 0 0,-1 0 0,4 7 0,-5-11 0,1 0 0,-1 1 0,1-1 0,0 0 0,0-1 0,-1 1 0,1 0 0,0 0 0,0 0 0,0 0 0,0-1 0,0 1 0,0 0 0,0-1 0,0 1 0,1-1 0,-1 1 0,0-1 0,0 0 0,0 1 0,0-1 0,1 0 0,-1 0 0,0 0 0,0 0 0,1 0 0,-1 0 0,0 0 0,0 0 0,0 0 0,1-1 0,-1 1 0,0 0 0,0-1 0,0 1 0,0-1 0,0 0 0,0 1 0,1-1 0,-2 0 0,3-1 0,157-79 0,-119 62 0,-29 15 0,0 0 0,0 0 0,0 1 0,1 0 0,-1 1 0,23 0 0,84 4 0,-46 1 0,430-3-1365,-481 0-5461</inkml:trace>
+</inkml:ink>
+</file>
+
+<file path=word/ink/ink2.xml><?xml version="1.0" encoding="utf-8"?>
+<inkml:ink xmlns:inkml="http://www.w3.org/2003/InkML">
+  <inkml:definitions>
+    <inkml:context xml:id="ctx0">
+      <inkml:inkSource xml:id="inkSrc0">
+        <inkml:traceFormat>
+          <inkml:channel name="X" type="integer" min="-2.14748E9" max="2.14748E9" units="cm"/>
+          <inkml:channel name="Y" type="integer" min="-2.14748E9" max="2.14748E9" units="cm"/>
+          <inkml:channel name="F" type="integer" max="32767" units="dev"/>
+        </inkml:traceFormat>
+        <inkml:channelProperties>
+          <inkml:channelProperty channel="X" name="resolution" value="1000" units="1/cm"/>
+          <inkml:channelProperty channel="Y" name="resolution" value="1000" units="1/cm"/>
+          <inkml:channelProperty channel="F" name="resolution" value="0" units="1/dev"/>
+        </inkml:channelProperties>
+      </inkml:inkSource>
+      <inkml:timestamp xml:id="ts0" timeString="2025-09-14T18:06:24.378"/>
+    </inkml:context>
+    <inkml:brush xml:id="br0">
+      <inkml:brushProperty name="width" value="0.035" units="cm"/>
+      <inkml:brushProperty name="height" value="0.035" units="cm"/>
+      <inkml:brushProperty name="color" value="#E71224"/>
+    </inkml:brush>
+  </inkml:definitions>
+  <inkml:trace contextRef="#ctx0" brushRef="#br0">0 907 24575,'1140'0'0,"-1136"1"0,0-1 0,0 1 0,0-1 0,0-1 0,0 1 0,0-1 0,1 1 0,-1-1 0,0 0 0,0 0 0,-1-1 0,1 1 0,0-1 0,0 0 0,-1 0 0,1 0 0,-1-1 0,0 1 0,1-1 0,-1 0 0,0 0 0,-1 0 0,1 0 0,0 0 0,-1-1 0,0 1 0,0-1 0,0 1 0,0-1 0,0 0 0,-1 0 0,0 0 0,0 0 0,0 0 0,0 0 0,0 0 0,-1 0 0,0 0 0,0-7 0,-1-235 0,-3 90 0,2 44 0,5-119 0,-3 228 0,1 0 0,0 1 0,-1-1 0,1 0 0,0 1 0,0-1 0,1 0 0,-1 1 0,1-1 0,-1 1 0,1 0 0,0-1 0,-1 1 0,1 0 0,0 0 0,1 0 0,-1 1 0,0-1 0,0 0 0,1 1 0,-1-1 0,1 1 0,0 0 0,-1 0 0,1 0 0,0 0 0,-1 1 0,1-1 0,0 0 0,5 1 0,12-2 0,0 1 0,0 1 0,31 4 0,-15-1 0,149-4 0,80 4 0,-193 10 0,-53-9 0,1 0 0,28 1 0,105-7 0,64 4 0,-214-1 0,0-1 0,0 1 0,-1 0 0,1-1 0,0 2 0,-1-1 0,1 0 0,0 0 0,-1 1 0,0-1 0,1 1 0,-1 0 0,0 0 0,0 0 0,0 0 0,0 0 0,0 0 0,0 0 0,-1 1 0,1-1 0,-1 1 0,0-1 0,1 1 0,-1 0 0,0-1 0,-1 1 0,1 0 0,0 0 0,-1-1 0,1 7 0,0 10 0,0 1 0,-1 0 0,-4 31 0,2-15 0,1-8 0,0 7 0,-1 0 0,-12 64 0,7-53 0,2 0 0,2 0 0,1 0 0,6 50 0,-1 11 0,-3-103 0,0 0 0,0 1 0,0-1 0,1 0 0,0 1 0,0-1 0,0 0 0,0 0 0,0 0 0,1 0 0,0 0 0,0 0 0,0 0 0,0 0 0,1-1 0,-1 1 0,1-1 0,0 0 0,0 0 0,0 0 0,0 0 0,1 0 0,-1-1 0,1 1 0,0-1 0,0 0 0,-1 0 0,1-1 0,1 1 0,-1-1 0,0 0 0,0 0 0,0 0 0,1 0 0,-1-1 0,0 0 0,6 0 0,283 1 0,-135-4 0,504 3 0,-659 1 0,0-1 0,0 0 0,1 0 0,-1 0 0,0-1 0,0 1 0,0-1 0,1 0 0,-1 0 0,0 0 0,0 0 0,0 0 0,0-1 0,-1 1 0,1-1 0,0 0 0,0 0 0,-1 0 0,0 0 0,1 0 0,2-4 0,-2 1 0,-1 0 0,0-1 0,0 1 0,0-1 0,-1 1 0,1-1 0,-2 0 0,1 0 0,0 1 0,-1-1 0,-1-8 0,-4-626 0,5 636 0,0 1 0,0 0 0,0 0 0,0-1 0,0 1 0,1 0 0,-1 0 0,1-1 0,0 1 0,0 0 0,0 0 0,1 0 0,-1 0 0,1 0 0,0 0 0,-1 1 0,1-1 0,0 1 0,1-1 0,-1 1 0,3-3 0,1 2 0,-1 1 0,0 0 0,1 0 0,-1 0 0,1 0 0,-1 1 0,1 0 0,0 0 0,-1 1 0,1 0 0,9 0 0,704 5 0,-699-3 0,-1 0 0,37 8 0,-35-5 0,0-1 0,27 1 0,-28-5 0,-9 0 0,-1 0 0,1 1 0,0 0 0,-1 1 0,1 0 0,12 4 0,-20-5 0,0 1 0,0-1 0,0 1 0,0 0 0,0 0 0,0 0 0,-1 1 0,1-1 0,-1 1 0,1 0 0,-1-1 0,0 1 0,0 0 0,0 0 0,0 0 0,-1 1 0,1-1 0,-1 0 0,0 0 0,0 1 0,0-1 0,0 1 0,0 4 0,8 46 0,-2-18 0,-1 0 0,0 48 0,-4-63 0,0 1 0,7 30 0,4 39 0,-15 71 0,4 72 0,-2-232 0,0 0 0,-1 0 0,1 0 0,1 0 0,-1-1 0,0 1 0,0 0 0,1 0 0,-1 0 0,1 0 0,-1 0 0,1-1 0,0 1 0,0 0 0,0-1 0,0 1 0,0-1 0,0 1 0,0-1 0,1 1 0,-1-1 0,0 0 0,1 1 0,-1-1 0,1 0 0,0 0 0,-1 0 0,1 0 0,0 0 0,-1-1 0,1 1 0,0-1 0,0 1 0,0-1 0,0 1 0,-1-1 0,1 0 0,0 0 0,0 0 0,0 0 0,0 0 0,0 0 0,0-1 0,0 1 0,-1-1 0,1 1 0,2-2 0,9-3 0,0-1 0,0 0 0,0-1 0,22-16 0,-30 19 0,4 0 0,-1 0 0,0 0 0,1 1 0,-1 0 0,1 1 0,0 0 0,0 0 0,0 1 0,0 0 0,16 1 0,43-8 0,15-14 0,89-19 0,-74 33 0,-70 7 0,1-1 0,33-8 0,-43 6 0,23-6 0,0 1 0,0 3 0,66-3 0,-84 8 0,0-2 0,41-9 0,-18 3 0,-44 8 0,1 1 0,-1-1 0,1-1 0,-1 1 0,0 0 0,1-1 0,-1 0 0,0 0 0,0 0 0,0 0 0,-1 0 0,1-1 0,0 1 0,-1-1 0,1 1 0,-1-1 0,0 0 0,0 0 0,0 0 0,-1-1 0,1 1 0,-1 0 0,1 0 0,0-4 0,3-11 0,-1 0 0,-1 0 0,2-32 0,3-14 0,8-42 0,-1 5 0,-11 76 0,0 0 0,-2 0 0,-2-40 0,1-22 0,0 84 0,-1 1 0,1-1 0,0 0 0,-1 0 0,1 1 0,0-1 0,1 1 0,-1-1 0,0 1 0,1-1 0,0 1 0,-1 0 0,1-1 0,0 1 0,0 0 0,0 0 0,0 0 0,1 1 0,-1-1 0,0 1 0,1-1 0,-1 1 0,1 0 0,-1 0 0,1 0 0,0 0 0,0 0 0,-1 0 0,1 1 0,0-1 0,3 1 0,14-2 0,-1 1 0,0 1 0,33 4 0,-15-1 0,492 0 0,-290-5 0,-233 2 0,-1 0 0,1 1 0,-1-1 0,0 1 0,1 0 0,-1 0 0,0 1 0,0-1 0,0 1 0,0 0 0,0 1 0,0-1 0,0 1 0,-1 0 0,1 0 0,-1 1 0,5 4 0,-5-3 0,0 1 0,0-1 0,0 1 0,-1 0 0,0 0 0,0 0 0,-1 0 0,1 1 0,-2-1 0,1 1 0,-1-1 0,1 1 0,-1 11 0,1 60 0,-2-50 0,1 0 0,2 0 0,6 33 0,-4-27 0,-1 0 0,-1 1 0,-2-1 0,-4 40 0,1-25 0,5 50 0,-3-90 0,1 0 0,1 0 0,0 0 0,0 0 0,0 0 0,1 0 0,1-1 0,6 13 0,-8-18 0,0 1 0,1-1 0,-1 0 0,1 0 0,0 0 0,0-1 0,0 1 0,0-1 0,1 0 0,-1 0 0,1 0 0,-1 0 0,1 0 0,0-1 0,0 1 0,-1-1 0,1 0 0,0-1 0,0 1 0,0 0 0,5-1 0,259 0 0,-110-4 0,176 4 0,-321 1 0,0 1 0,1 0 0,21 6 0,32 5 0,-42-12-1365,-3 0-5461</inkml:trace>
+</inkml:ink>
+</file>
+
 <file path=word/theme/theme1.xml><?xml version="1.0" encoding="utf-8"?>
 <a:theme xmlns:a="http://schemas.openxmlformats.org/drawingml/2006/main" name="Office Theme">
   <a:themeElements>

</xml_diff>

<commit_message>
corrected some questions in lab2
</commit_message>
<xml_diff>
--- a/SC2107/LabHandout/SC2107-Lab2-Handoutv4M.docx
+++ b/SC2107/LabHandout/SC2107-Lab2-Handoutv4M.docx
@@ -1017,18 +1017,18 @@
         <mc:AlternateContent>
           <mc:Choice Requires="wpi">
             <w:drawing>
-              <wp:anchor distT="0" distB="0" distL="114300" distR="114300" simplePos="0" relativeHeight="251692032" behindDoc="0" locked="0" layoutInCell="1" allowOverlap="1" wp14:anchorId="27910F6D" wp14:editId="4E5B9796">
+              <wp:anchor distT="0" distB="0" distL="114300" distR="114300" simplePos="0" relativeHeight="251746304" behindDoc="0" locked="0" layoutInCell="1" allowOverlap="1" wp14:anchorId="44F44693" wp14:editId="486975C5">
                 <wp:simplePos x="0" y="0"/>
                 <wp:positionH relativeFrom="column">
-                  <wp:posOffset>647700</wp:posOffset>
+                  <wp:posOffset>1198245</wp:posOffset>
                 </wp:positionH>
                 <wp:positionV relativeFrom="paragraph">
-                  <wp:posOffset>776605</wp:posOffset>
+                  <wp:posOffset>414020</wp:posOffset>
                 </wp:positionV>
-                <wp:extent cx="3209040" cy="1203450"/>
-                <wp:effectExtent l="38100" t="38100" r="48895" b="34925"/>
+                <wp:extent cx="2708035" cy="1596115"/>
+                <wp:effectExtent l="38100" t="38100" r="0" b="42545"/>
                 <wp:wrapNone/>
-                <wp:docPr id="728980168" name="Ink 61"/>
+                <wp:docPr id="473603752" name="Ink 62"/>
                 <wp:cNvGraphicFramePr/>
                 <a:graphic xmlns:a="http://schemas.openxmlformats.org/drawingml/2006/main">
                   <a:graphicData uri="http://schemas.microsoft.com/office/word/2010/wordprocessingInk">
@@ -1038,7 +1038,7 @@
                       </w14:nvContentPartPr>
                       <w14:xfrm>
                         <a:off x="0" y="0"/>
-                        <a:ext cx="3209040" cy="1203450"/>
+                        <a:ext cx="2708035" cy="1596115"/>
                       </w14:xfrm>
                     </w14:contentPart>
                   </a:graphicData>
@@ -1048,7 +1048,7 @@
           </mc:Choice>
           <mc:Fallback>
             <w:pict>
-              <v:shapetype w14:anchorId="6450D22F" id="_x0000_t75" coordsize="21600,21600" o:spt="75" o:preferrelative="t" path="m@4@5l@4@11@9@11@9@5xe" filled="f" stroked="f">
+              <v:shapetype w14:anchorId="09CD145B" id="_x0000_t75" coordsize="21600,21600" o:spt="75" o:preferrelative="t" path="m@4@5l@4@11@9@11@9@5xe" filled="f" stroked="f">
                 <v:stroke joinstyle="miter"/>
                 <v:formulas>
                   <v:f eqn="if lineDrawn pixelLineWidth 0"/>
@@ -1067,7 +1067,7 @@
                 <v:path o:extrusionok="f" gradientshapeok="t" o:connecttype="rect"/>
                 <o:lock v:ext="edit" aspectratio="t"/>
               </v:shapetype>
-              <v:shape id="Ink 61" o:spid="_x0000_s1026" type="#_x0000_t75" style="position:absolute;margin-left:50.5pt;margin-top:60.65pt;width:253.7pt;height:95.7pt;z-index:251692032;visibility:visible;mso-wrap-style:square;mso-wrap-distance-left:9pt;mso-wrap-distance-top:0;mso-wrap-distance-right:9pt;mso-wrap-distance-bottom:0;mso-position-horizontal:absolute;mso-position-horizontal-relative:text;mso-position-vertical:absolute;mso-position-vertical-relative:text" o:gfxdata="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">
+              <v:shape id="Ink 62" o:spid="_x0000_s1026" type="#_x0000_t75" style="position:absolute;margin-left:93.85pt;margin-top:32.1pt;width:214.25pt;height:126.7pt;z-index:251746304;visibility:visible;mso-wrap-style:square;mso-wrap-distance-left:9pt;mso-wrap-distance-top:0;mso-wrap-distance-right:9pt;mso-wrap-distance-bottom:0;mso-position-horizontal:absolute;mso-position-horizontal-relative:text;mso-position-vertical:absolute;mso-position-vertical-relative:text" o:gfxdata="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">
                 <v:imagedata r:id="rId8" o:title=""/>
               </v:shape>
             </w:pict>
@@ -1084,18 +1084,18 @@
         <mc:AlternateContent>
           <mc:Choice Requires="wpi">
             <w:drawing>
-              <wp:anchor distT="0" distB="0" distL="114300" distR="114300" simplePos="0" relativeHeight="251659264" behindDoc="0" locked="0" layoutInCell="1" allowOverlap="1" wp14:anchorId="14F6F437" wp14:editId="473B701A">
+              <wp:anchor distT="0" distB="0" distL="114300" distR="114300" simplePos="0" relativeHeight="251744256" behindDoc="0" locked="0" layoutInCell="1" allowOverlap="1" wp14:anchorId="62E7A330" wp14:editId="3D6B4D31">
                 <wp:simplePos x="0" y="0"/>
                 <wp:positionH relativeFrom="column">
-                  <wp:posOffset>723765</wp:posOffset>
+                  <wp:posOffset>1216025</wp:posOffset>
                 </wp:positionH>
                 <wp:positionV relativeFrom="paragraph">
-                  <wp:posOffset>431490</wp:posOffset>
+                  <wp:posOffset>1388745</wp:posOffset>
                 </wp:positionV>
-                <wp:extent cx="3065760" cy="383400"/>
-                <wp:effectExtent l="38100" t="38100" r="20955" b="36195"/>
+                <wp:extent cx="635" cy="301625"/>
+                <wp:effectExtent l="38100" t="38100" r="37465" b="41275"/>
                 <wp:wrapNone/>
-                <wp:docPr id="742886871" name="Ink 5"/>
+                <wp:docPr id="152287922" name="Ink 60"/>
                 <wp:cNvGraphicFramePr/>
                 <a:graphic xmlns:a="http://schemas.openxmlformats.org/drawingml/2006/main">
                   <a:graphicData uri="http://schemas.microsoft.com/office/word/2010/wordprocessingInk">
@@ -1105,7 +1105,61 @@
                       </w14:nvContentPartPr>
                       <w14:xfrm>
                         <a:off x="0" y="0"/>
-                        <a:ext cx="3065760" cy="383400"/>
+                        <a:ext cx="635" cy="301625"/>
+                      </w14:xfrm>
+                    </w14:contentPart>
+                  </a:graphicData>
+                </a:graphic>
+                <wp14:sizeRelH relativeFrom="margin">
+                  <wp14:pctWidth>0</wp14:pctWidth>
+                </wp14:sizeRelH>
+                <wp14:sizeRelV relativeFrom="margin">
+                  <wp14:pctHeight>0</wp14:pctHeight>
+                </wp14:sizeRelV>
+              </wp:anchor>
+            </w:drawing>
+          </mc:Choice>
+          <mc:Fallback>
+            <w:pict>
+              <v:shape w14:anchorId="7B3BF65C" id="Ink 60" o:spid="_x0000_s1026" type="#_x0000_t75" style="position:absolute;margin-left:94.9pt;margin-top:108.85pt;width:1.75pt;height:24.7pt;z-index:251744256;visibility:visible;mso-wrap-style:square;mso-width-percent:0;mso-height-percent:0;mso-wrap-distance-left:9pt;mso-wrap-distance-top:0;mso-wrap-distance-right:9pt;mso-wrap-distance-bottom:0;mso-position-horizontal:absolute;mso-position-horizontal-relative:text;mso-position-vertical:absolute;mso-position-vertical-relative:text;mso-width-percent:0;mso-height-percent:0;mso-width-relative:margin;mso-height-relative:margin" o:gfxdata="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">
+                <v:imagedata r:id="rId10" o:title=""/>
+              </v:shape>
+            </w:pict>
+          </mc:Fallback>
+        </mc:AlternateContent>
+      </w:r>
+      <w:r>
+        <w:rPr>
+          <w:rFonts w:ascii="Arial" w:hAnsi="Arial" w:cs="Arial"/>
+          <w:noProof/>
+          <w:sz w:val="20"/>
+          <w:szCs w:val="20"/>
+        </w:rPr>
+        <mc:AlternateContent>
+          <mc:Choice Requires="wpi">
+            <w:drawing>
+              <wp:anchor distT="0" distB="0" distL="114300" distR="114300" simplePos="0" relativeHeight="251742208" behindDoc="0" locked="0" layoutInCell="1" allowOverlap="1" wp14:anchorId="63936CFF" wp14:editId="179F28C5">
+                <wp:simplePos x="0" y="0"/>
+                <wp:positionH relativeFrom="column">
+                  <wp:posOffset>655553</wp:posOffset>
+                </wp:positionH>
+                <wp:positionV relativeFrom="paragraph">
+                  <wp:posOffset>1691169</wp:posOffset>
+                </wp:positionV>
+                <wp:extent cx="552960" cy="44280"/>
+                <wp:effectExtent l="38100" t="38100" r="38100" b="51435"/>
+                <wp:wrapNone/>
+                <wp:docPr id="574926595" name="Ink 57"/>
+                <wp:cNvGraphicFramePr/>
+                <a:graphic xmlns:a="http://schemas.openxmlformats.org/drawingml/2006/main">
+                  <a:graphicData uri="http://schemas.microsoft.com/office/word/2010/wordprocessingInk">
+                    <w14:contentPart bwMode="auto" r:id="rId11">
+                      <w14:nvContentPartPr>
+                        <w14:cNvContentPartPr/>
+                      </w14:nvContentPartPr>
+                      <w14:xfrm>
+                        <a:off x="0" y="0"/>
+                        <a:ext cx="552960" cy="44280"/>
                       </w14:xfrm>
                     </w14:contentPart>
                   </a:graphicData>
@@ -1115,8 +1169,8 @@
           </mc:Choice>
           <mc:Fallback>
             <w:pict>
-              <v:shape w14:anchorId="36FFAD63" id="Ink 5" o:spid="_x0000_s1026" type="#_x0000_t75" style="position:absolute;margin-left:56.5pt;margin-top:33.5pt;width:242.4pt;height:31.2pt;z-index:251659264;visibility:visible;mso-wrap-style:square;mso-wrap-distance-left:9pt;mso-wrap-distance-top:0;mso-wrap-distance-right:9pt;mso-wrap-distance-bottom:0;mso-position-horizontal:absolute;mso-position-horizontal-relative:text;mso-position-vertical:absolute;mso-position-vertical-relative:text" o:gfxdata="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">
-                <v:imagedata r:id="rId10" o:title=""/>
+              <v:shape w14:anchorId="492DE55C" id="Ink 57" o:spid="_x0000_s1026" type="#_x0000_t75" style="position:absolute;margin-left:51.1pt;margin-top:132.65pt;width:44.55pt;height:4.5pt;z-index:251742208;visibility:visible;mso-wrap-style:square;mso-wrap-distance-left:9pt;mso-wrap-distance-top:0;mso-wrap-distance-right:9pt;mso-wrap-distance-bottom:0;mso-position-horizontal:absolute;mso-position-horizontal-relative:text;mso-position-vertical:absolute;mso-position-vertical-relative:text" o:gfxdata="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">
+                <v:imagedata r:id="rId12" o:title=""/>
               </v:shape>
             </w:pict>
           </mc:Fallback>
@@ -1129,8 +1183,56 @@
           <w:sz w:val="20"/>
           <w:szCs w:val="20"/>
         </w:rPr>
+        <mc:AlternateContent>
+          <mc:Choice Requires="wpi">
+            <w:drawing>
+              <wp:anchor distT="0" distB="0" distL="114300" distR="114300" simplePos="0" relativeHeight="251693056" behindDoc="0" locked="0" layoutInCell="1" allowOverlap="1" wp14:anchorId="1F340FD2" wp14:editId="264F4E45">
+                <wp:simplePos x="0" y="0"/>
+                <wp:positionH relativeFrom="column">
+                  <wp:posOffset>638273</wp:posOffset>
+                </wp:positionH>
+                <wp:positionV relativeFrom="paragraph">
+                  <wp:posOffset>316689</wp:posOffset>
+                </wp:positionV>
+                <wp:extent cx="3294360" cy="411120"/>
+                <wp:effectExtent l="38100" t="38100" r="20955" b="46355"/>
+                <wp:wrapNone/>
+                <wp:docPr id="886716574" name="Ink 1"/>
+                <wp:cNvGraphicFramePr/>
+                <a:graphic xmlns:a="http://schemas.openxmlformats.org/drawingml/2006/main">
+                  <a:graphicData uri="http://schemas.microsoft.com/office/word/2010/wordprocessingInk">
+                    <w14:contentPart bwMode="auto" r:id="rId13">
+                      <w14:nvContentPartPr>
+                        <w14:cNvContentPartPr/>
+                      </w14:nvContentPartPr>
+                      <w14:xfrm>
+                        <a:off x="0" y="0"/>
+                        <a:ext cx="3294360" cy="411120"/>
+                      </w14:xfrm>
+                    </w14:contentPart>
+                  </a:graphicData>
+                </a:graphic>
+              </wp:anchor>
+            </w:drawing>
+          </mc:Choice>
+          <mc:Fallback>
+            <w:pict>
+              <v:shape w14:anchorId="0551C9E3" id="Ink 1" o:spid="_x0000_s1026" type="#_x0000_t75" style="position:absolute;margin-left:49.75pt;margin-top:24.45pt;width:260.4pt;height:33.35pt;z-index:251693056;visibility:visible;mso-wrap-style:square;mso-wrap-distance-left:9pt;mso-wrap-distance-top:0;mso-wrap-distance-right:9pt;mso-wrap-distance-bottom:0;mso-position-horizontal:absolute;mso-position-horizontal-relative:text;mso-position-vertical:absolute;mso-position-vertical-relative:text" o:gfxdata="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">
+                <v:imagedata r:id="rId14" o:title=""/>
+              </v:shape>
+            </w:pict>
+          </mc:Fallback>
+        </mc:AlternateContent>
+      </w:r>
+      <w:r>
+        <w:rPr>
+          <w:rFonts w:ascii="Arial" w:hAnsi="Arial" w:cs="Arial"/>
+          <w:noProof/>
+          <w:sz w:val="20"/>
+          <w:szCs w:val="20"/>
+        </w:rPr>
         <w:drawing>
-          <wp:inline distT="0" distB="0" distL="0" distR="0" wp14:anchorId="6A5B4655" wp14:editId="00EF5DEF">
+          <wp:inline distT="0" distB="0" distL="0" distR="0" wp14:anchorId="6A5B4655" wp14:editId="569742D5">
             <wp:extent cx="4730993" cy="2101958"/>
             <wp:effectExtent l="0" t="0" r="0" b="0"/>
             <wp:docPr id="2" name="Picture 2" descr="Shape&#10;&#10;Description automatically generated with medium confidence"/>
@@ -1145,7 +1247,7 @@
                     <pic:cNvPicPr/>
                   </pic:nvPicPr>
                   <pic:blipFill>
-                    <a:blip r:embed="rId11"/>
+                    <a:blip r:embed="rId15"/>
                     <a:stretch>
                       <a:fillRect/>
                     </a:stretch>
@@ -1365,7 +1467,7 @@
                     <pic:cNvPicPr/>
                   </pic:nvPicPr>
                   <pic:blipFill>
-                    <a:blip r:embed="rId12"/>
+                    <a:blip r:embed="rId16"/>
                     <a:stretch>
                       <a:fillRect/>
                     </a:stretch>
@@ -2518,9 +2620,9 @@
       </w:r>
     </w:p>
     <w:sectPr>
-      <w:headerReference w:type="default" r:id="rId13"/>
-      <w:footerReference w:type="default" r:id="rId14"/>
-      <w:footerReference w:type="first" r:id="rId15"/>
+      <w:headerReference w:type="default" r:id="rId17"/>
+      <w:footerReference w:type="default" r:id="rId18"/>
+      <w:footerReference w:type="first" r:id="rId19"/>
       <w:pgSz w:w="11906" w:h="16838"/>
       <w:pgMar w:top="1440" w:right="1440" w:bottom="1440" w:left="1440" w:header="708" w:footer="708" w:gutter="0"/>
       <w:cols w:space="708"/>
@@ -5682,7 +5784,7 @@
           <inkml:channelProperty channel="F" name="resolution" value="0" units="1/dev"/>
         </inkml:channelProperties>
       </inkml:inkSource>
-      <inkml:timestamp xml:id="ts0" timeString="2025-09-14T18:07:09.534"/>
+      <inkml:timestamp xml:id="ts0" timeString="2025-09-21T12:25:20.825"/>
     </inkml:context>
     <inkml:brush xml:id="br0">
       <inkml:brushProperty name="width" value="0.035" units="cm"/>
@@ -5690,36 +5792,50 @@
       <inkml:brushProperty name="color" value="#E71224"/>
     </inkml:brush>
   </inkml:definitions>
-  <inkml:trace contextRef="#ctx0" brushRef="#br0">2645 1799 24575,'0'5'0,"0"6"0,0 5 0,0 5 0,0 3 0,0 2 0,0 1 0,0 0 0,0 1 0,0-1 0,0 1 0,0-1 0,0-5-8191</inkml:trace>
-  <inkml:trace contextRef="#ctx0" brushRef="#br0" timeOffset="406.42">2673 2646 24575,'0'5'0,"0"5"0,0 6 0,0 5 0,0 3 0,0 2 0,0 2 0,0-1 0,0 1 0,0-1 0,0-4-8191</inkml:trace>
-  <inkml:trace contextRef="#ctx0" brushRef="#br0" timeOffset="-1742.2">2751 0 24575,'0'5'0,"-4"1"0,-2 4 0,0 5 0,2 4 0,1 4 0,1 3 0,0 0 0,2-3-8191</inkml:trace>
-  <inkml:trace contextRef="#ctx0" brushRef="#br0" timeOffset="-841.28">2673 397 24575,'0'5'0,"0"5"0,0 6 0,0 5 0,0 3 0,0 2 0,0 2 0,0-1 0,0 1 0,0-1 0,0 0 0,0 0 0,0-5-8191</inkml:trace>
-  <inkml:trace contextRef="#ctx0" brushRef="#br0" timeOffset="-420.38">2673 954 24575,'0'5'0,"0"5"0,0 6 0,0 5 0,0 3 0,0 2 0,0 1 0,0 1 0,0-1 0,0 1 0,0-1 0,0-4-8191</inkml:trace>
-  <inkml:trace contextRef="#ctx0" brushRef="#br0" timeOffset="1726.58">7699 79 24575,'0'425'-1365,"0"-402"-5461</inkml:trace>
-  <inkml:trace contextRef="#ctx0" brushRef="#br0" timeOffset="2006.18">7725 1085 24575,'0'5'0,"0"5"0,0 6 0,0 5 0,0 3 0,0 2 0,0 2 0,0-1 0,0-4-8191</inkml:trace>
-  <inkml:trace contextRef="#ctx0" brushRef="#br0" timeOffset="2240.17">7725 1984 24575,'0'5'0,"0"6"0,0 5 0,5 0 0,1 2 0,0 3 0,-2 1 0,0 3 0,-2-4-8191</inkml:trace>
-  <inkml:trace contextRef="#ctx0" brushRef="#br0" timeOffset="2457.3">7778 2515 24575,'0'5'0,"0"5"0,0 6 0,0 5 0,0 3 0,0 2 0,0 1 0,0 1 0,0-1 0,0 1 0,0-1 0,0-4-8191</inkml:trace>
-  <inkml:trace contextRef="#ctx0" brushRef="#br0" timeOffset="2642.98">7752 3228 24575,'0'5'0,"0"5"0,0 6 0,0 5 0,0 3 0,-4-2 0,-3-5-8191</inkml:trace>
-  <inkml:trace contextRef="#ctx0" brushRef="#br0" timeOffset="3560.45">5185 185 24575,'0'5'0,"0"6"0,0 5 0,0 5 0,0 3 0,0 2 0,0 1 0,0 1 0,0-1 0,0 0 0,0-4-8191</inkml:trace>
-  <inkml:trace contextRef="#ctx0" brushRef="#br0" timeOffset="3873.37">5159 1032 24575,'0'5'0,"0"5"0,0 6 0,5 1 0,0 1 0,1 2 0,-1 3 0,-2-3-8191</inkml:trace>
-  <inkml:trace contextRef="#ctx0" brushRef="#br0" timeOffset="4137.29">5238 1614 24575,'5'0'0,"1"5"0,0 5 0,-2 6 0,0 5 0,-2 3 0,-1 2 0,-1 2 0,0-1 0,0 1 0,0-5-8191</inkml:trace>
-  <inkml:trace contextRef="#ctx0" brushRef="#br0" timeOffset="4386.5">5106 2487 24575,'0'5'0,"0"6"0,0 5 0,0 4 0,0 4 0,0 3 0,0-5-8191</inkml:trace>
-  <inkml:trace contextRef="#ctx0" brushRef="#br0" timeOffset="4619.7">5185 2937 24575,'0'5'0,"0"5"0,0 6 0,0 1-8191</inkml:trace>
-  <inkml:trace contextRef="#ctx0" brushRef="#br0" timeOffset="10392.42">1481 26 24575,'0'5'0,"0"6"0,0 5 0,-4 0 0,-2 2 0,0 3 0,2 1 0,1 3 0,0 0 0,2 2 0,1-5-8191</inkml:trace>
-  <inkml:trace contextRef="#ctx0" brushRef="#br0" timeOffset="10704.27">1349 767 24575,'0'5'0,"-4"1"0,-3 4 0,2 6 0,0 3 0,2 4 0,1 2 0,0 2 0,2 0 0,-4 0 0,-2 0 0,1 0 0,0 0 0,2 0 0,1 0 0,1-5-8191</inkml:trace>
-  <inkml:trace contextRef="#ctx0" brushRef="#br0" timeOffset="11015.7">1321 1880 24575,'0'5'0,"5"1"0,1 4 0,4 5 0,1 4 0,-2 4 0,2-2 0,-1-1 0,-2 2 0,3-4 0,-2 0 0,3-3 0,-1 0 0,-2 3 0,-2 2 0,-3-2-8191</inkml:trace>
-  <inkml:trace contextRef="#ctx0" brushRef="#br0" timeOffset="11218.7">1456 2566 24575,'0'5'0,"0"6"0,0 5 0,0 5 0,0 3 0,0 2 0,0 1 0,0 1 0,0-1 0,0-4-8191</inkml:trace>
-  <inkml:trace contextRef="#ctx0" brushRef="#br0" timeOffset="11406.67">1456 3122 24575,'0'5'0,"0"6"0,0 5 0,0 4 0,0 4 0,0 3 0,0 0 0,0 0 0,0-4-8191</inkml:trace>
-  <inkml:trace contextRef="#ctx0" brushRef="#br0" timeOffset="12232.8">3943 159 24575,'2'1'0,"0"-1"0,0 1 0,1-1 0,-1 1 0,0 0 0,0 0 0,0 0 0,-1 0 0,1 0 0,0 0 0,0 0 0,-1 1 0,1-1 0,0 1 0,-1-1 0,0 1 0,1 0 0,-1-1 0,0 1 0,0 0 0,0 0 0,0 0 0,0 0 0,0 0 0,0 0 0,0 4 0,2 5 0,0-1 0,-1 1 0,2 20 0,-3 147 75,-3-88-1515,2-68-5386</inkml:trace>
-  <inkml:trace contextRef="#ctx0" brushRef="#br0" timeOffset="12466">3967 1402 24575,'0'5'0,"0"6"0,0 5 0,0 5 0,0 3 0,0 2 0,0 1 0,0 1 0,0-1 0,0 1 0,0-1 0,0-5-8191</inkml:trace>
-  <inkml:trace contextRef="#ctx0" brushRef="#br0" timeOffset="12667.86">3941 2275 24575,'2'95'0,"-5"103"0,-20-66-1365,21-109-5461</inkml:trace>
-  <inkml:trace contextRef="#ctx0" brushRef="#br0" timeOffset="12841.2">3914 3096 24575,'0'5'0,"0"5"0,5 6 0,1 5 0,0 3 0,-2 2 0,4-3 0,0-6-8191</inkml:trace>
-  <inkml:trace contextRef="#ctx0" brushRef="#br0" timeOffset="16916.88">6509 132 24575,'0'5'0,"0"6"0,-4 0 0,-2 4 0,0 4 0,2 2 0,-4-1 0,0-1 0,1 2 0,2 1 0,1 2 0,3 1 0,0 1 0,1 0 0,0 1 0,-4-5 0,-2-1 0,1-4-8191</inkml:trace>
-  <inkml:trace contextRef="#ctx0" brushRef="#br0" timeOffset="17180.42">6350 873 24575,'0'5'0,"0"6"0,0 5 0,0 5 0,0 3 0,0 2 0,0 1 0,0 0 0,0 1 0,0-1 0,0 1 0,0-6-8191</inkml:trace>
-  <inkml:trace contextRef="#ctx0" brushRef="#br0" timeOffset="17412.73">6350 1693 24575,'0'5'0,"0"6"0,0 5 0,0 5 0,0 3 0,0 2 0,0 1 0,0 1 0,0-1 0,0 1 0,0-1 0,0-5-8191</inkml:trace>
-  <inkml:trace contextRef="#ctx0" brushRef="#br0" timeOffset="17614.31">6323 2249 24575,'2'104'0,"-5"112"0,-21-59-1365,22-134-5461</inkml:trace>
-  <inkml:trace contextRef="#ctx0" brushRef="#br0" timeOffset="17739.25">6297 3122 24575,'0'5'0,"0"6"0,0 5 0,0 4 0,0 4 0,0 3 0,0 0 0,0-4-8191</inkml:trace>
-  <inkml:trace contextRef="#ctx0" brushRef="#br0" timeOffset="44549.14">0 2514 24575,'37'0'0,"1"-1"0,1 2 0,-1 1 0,60 12 0,-52-7 0,0-1 0,1-3 0,0-2 0,47-5 0,12 1 0,-75 5 0,58 10 0,-58-7 0,55 3 0,58-10 0,110 4 0,-221 5 0,-29-6 0,0 1 0,1-1 0,-1 0 0,1-1 0,0 1 0,-1-1 0,1 0 0,5 0 0,-8-1 0,-1 0 0,1 1 0,-1-1 0,1 0 0,-1 0 0,0 0 0,1 0 0,-1 0 0,0 0 0,0 0 0,1 0 0,-1 0 0,0-1 0,0 1 0,0-1 0,0 1 0,-1 0 0,1-1 0,0 0 0,-1 1 0,1-1 0,-1 1 0,1-1 0,-1 0 0,0 1 0,0-1 0,1-3 0,2-35 0,-1 0 0,-2 0 0,-7-53 0,1 57 0,-15-55 0,14 64 0,0 0 0,2-1 0,-3-54 0,7 75 0,1 0 0,0-1 0,1 1 0,0 0 0,0 0 0,0-1 0,1 1 0,4-12 0,-4 17 0,0-1 0,0 1 0,0-1 0,0 1 0,0 0 0,1 0 0,-1 0 0,1 0 0,-1 0 0,1 1 0,0-1 0,-1 1 0,1-1 0,0 1 0,0 0 0,0 0 0,0 0 0,0 1 0,0-1 0,0 1 0,1 0 0,5 0 0,3 0 0,0 0 0,0 2 0,0-1 0,0 1 0,0 1 0,-1 0 0,1 1 0,-1 0 0,12 6 0,23 8 0,38 1 0,-39-10 0,-1-2 0,1-2 0,-1-2 0,85-6 0,-29 0 0,-93 3 0,11 1 0,0 0 0,0-2 0,0 0 0,0-1 0,0-1 0,-1-1 0,1 0 0,-1-1 0,17-8 0,-11 3 0,1 0 0,0 2 0,0 1 0,49-8 0,-48 10 0,-1-1 0,46-18 0,-45 14 0,0 1 0,27-4 0,-50 12 0,-1 1 0,0 0 0,1 0 0,-1 0 0,0 0 0,1 0 0,-1 0 0,0 0 0,1 0 0,-1 0 0,0 1 0,1-1 0,-1 1 0,0-1 0,0 1 0,1-1 0,-1 1 0,0 0 0,0-1 0,0 1 0,0 0 0,0 0 0,1 1 0,0 0 0,0 1 0,-1 0 0,1-1 0,-1 1 0,1 0 0,-1 0 0,0 0 0,-1-1 0,1 1 0,0 4 0,1 10 0,-1-1 0,0 1 0,-3 19 0,1-19 0,-2 451 0,3-297 0,0-165 0,0-1 0,1 1 0,-1 0 0,1-1 0,0 1 0,3 8 0,-4-13 0,1 0 0,-1 0 0,0-1 0,1 1 0,-1 0 0,1-1 0,-1 1 0,1 0 0,-1-1 0,1 1 0,-1-1 0,1 1 0,0 0 0,-1-1 0,1 0 0,0 1 0,0-1 0,-1 1 0,1-1 0,0 0 0,1 1 0,-1-1 0,1 0 0,-1-1 0,0 1 0,1 0 0,-1 0 0,1-1 0,-1 1 0,0-1 0,1 1 0,-1-1 0,0 0 0,1 1 0,-1-1 0,0 0 0,0 0 0,2-2 0,4-2 0,-1-1 0,2 1 0,-1 0 0,0 0 0,1 1 0,0 0 0,0 0 0,0 1 0,0 0 0,1 0 0,-1 1 0,1 1 0,0-1 0,0 1 0,12 0 0,9 0 0,-2 1 0,0-1 0,-1-2 0,31-6 0,-12 2 0,0 1 0,1 3 0,-1 2 0,50 5 0,10-2 0,476-2 0,-562-1 0,0-1 0,35-8 0,-33 5 0,-1 2 0,26-2 0,43 4 0,-40 2 0,-1-3 0,80-12 0,-24 2 0,-71 9 0,49-9 0,91-14 0,-4-1 0,-128 20 0,1 2 0,0 2 0,0 2 0,47 5 0,9-2 0,694-2 0,-789 1 0,0-1 0,-1 0 0,1 0 0,-1-1 0,1 1 0,-1-1 0,1 1 0,-1-1 0,1 0 0,-1-1 0,0 1 0,0-1 0,1 1 0,-1-1 0,5-4 0,-5 3 0,0-1 0,-1 0 0,0 1 0,0-1 0,0 0 0,0 0 0,0 0 0,-1 0 0,0 0 0,0-1 0,0 1 0,1-7 0,19-89 0,-13 71 0,-1 0 0,-2 0 0,3-53 0,-12-71 0,7-144 0,-3 294 0,1 0 0,0 0 0,-1 1 0,1-1 0,0 0 0,0 1 0,1-1 0,-1 0 0,0 1 0,1 0 0,0-1 0,-1 1 0,1 0 0,0 0 0,0 0 0,1 0 0,-1 0 0,0 0 0,0 1 0,1-1 0,-1 1 0,1-1 0,0 1 0,-1 0 0,1 0 0,0 0 0,-1 1 0,1-1 0,0 1 0,6-1 0,10-1 0,1 1 0,-1 1 0,33 4 0,-16-1 0,-8-2 0,17 1 0,0-1 0,0-2 0,0-3 0,50-9 0,-50 5 0,1 3 0,0 2 0,-1 2 0,53 5 0,8-2 0,5-4 0,122 5 0,-229-2 0,0-1 0,1 1 0,-1 0 0,0 0 0,0 0 0,0 1 0,0-1 0,0 1 0,0 0 0,0 0 0,-1 1 0,1-1 0,0 1 0,-1 0 0,0 0 0,0 0 0,0 0 0,3 5 0,2 3 0,-2 1 0,1 0 0,-1 1 0,5 18 0,14 28 0,-18-48 0,0 2 0,-1-1 0,0 0 0,-2 1 0,1 0 0,-1 0 0,-1 1 0,0-1 0,-1 1 0,0 21 0,0-6 0,9 46 0,-6-46 0,2 51 0,-8 370 0,1-444 0,0-1 0,1 0 0,-1 1 0,1-1 0,0 0 0,1 0 0,-1 0 0,4 7 0,-5-11 0,1 0 0,-1 1 0,1-1 0,0 0 0,0-1 0,-1 1 0,1 0 0,0 0 0,0 0 0,0 0 0,0-1 0,0 1 0,0 0 0,0-1 0,0 1 0,1-1 0,-1 1 0,0-1 0,0 0 0,0 1 0,0-1 0,1 0 0,-1 0 0,0 0 0,0 0 0,1 0 0,-1 0 0,0 0 0,0 0 0,0 0 0,1-1 0,-1 1 0,0 0 0,0-1 0,0 1 0,0-1 0,0 0 0,0 1 0,1-1 0,-2 0 0,3-1 0,157-79 0,-119 62 0,-29 15 0,0 0 0,0 0 0,0 1 0,1 0 0,-1 1 0,23 0 0,84 4 0,-46 1 0,430-3-1365,-481 0-5461</inkml:trace>
+  <inkml:trace contextRef="#ctx0" brushRef="#br0">0 718 24575,'5'0'0,"0"4"0,0 6 0,0 5 0,-2 3 0,-2 4 0,0 2 0,0 0 0,-1 1 0,0 0 0,-1 0 0,1 0 0,0-1 0,0-4-8191</inkml:trace>
+  <inkml:trace contextRef="#ctx0" brushRef="#br0" timeOffset="693.84">26 1293 24575,'0'385'-1365,"0"-365"-5461</inkml:trace>
+  <inkml:trace contextRef="#ctx0" brushRef="#br0" timeOffset="5112.99">26 2013 24575,'1'9'0,"0"-1"0,0 0 0,1 0 0,0 0 0,1 0 0,0-1 0,7 15 0,-5-13 0,-1 0 0,-1 0 0,1 1 0,-1 0 0,1 11 0,5 46-76,-1-9-569,1 79 1,-9-117-6182</inkml:trace>
+  <inkml:trace contextRef="#ctx0" brushRef="#br0" timeOffset="6332.15">73 2829 24575,'0'4'0,"0"5"0,0 6 0,0 4 0,0 3 0,0 1 0,0 2 0,0 0 0,0 0 0,0 0 0,0 0 0,0-1 0,0 0 0,0 0 0,0-4-8191</inkml:trace>
+  <inkml:trace contextRef="#ctx0" brushRef="#br0" timeOffset="6855.19">73 3570 24575,'0'4'0,"0"6"0,0 4 0,0 5 0,0 3 0,0 1 0,0 2 0,0 0 0,0 0 0,0 0 0,-4-5 0,-2-1 0,-3-4 0,-1 0 0,2 1 0,2-3-8191</inkml:trace>
+  <inkml:trace contextRef="#ctx0" brushRef="#br0" timeOffset="7546.94">0 4242 24575,'0'4'0,"0"5"0,0 6 0,0 4 0,0 3 0,0 1 0,0 2 0,0 0 0,0 0 0,0-4-8191</inkml:trace>
+  <inkml:trace contextRef="#ctx0" brushRef="#br0" timeOffset="9657.22">1319 720 24575,'0'-4'0,"0"-5"0,0-6 0,0-4 0,0-3 0,0-1 0,0-2 0,0 0 0,0 0 0,0 0 0,0 1 0,0-1 0,0 1 0,0 0 0,4 4 0,1 2 0,0 3-8191</inkml:trace>
+  <inkml:trace contextRef="#ctx0" brushRef="#br0" timeOffset="10196.32">1367 218 24575,'0'-5'0,"0"-4"0,0-6 0,0-4 0,0-3 0,0-1 0,0-2 0,0 0 0,0 0 0,0 0 0,0 5-8191</inkml:trace>
+  <inkml:trace contextRef="#ctx0" brushRef="#br0" timeOffset="11156.56">1296 1127 24575,'2'109'0,"-5"118"0,0-208 22,-1-1 0,0 1 1,-9 20-1,-1 9-1476,9-28-5372</inkml:trace>
+  <inkml:trace contextRef="#ctx0" brushRef="#br0" timeOffset="11598.18">1224 2205 24575,'0'4'0,"0"6"0,0 4 0,0 5 0,0 3 0,0 1 0,0 2 0,0 0 0,0 0 0,0 0 0,0 0 0,-4-5 0,-2-1 0,1 0 0,-3-4 0,-1 1 0,2-3-8191</inkml:trace>
+  <inkml:trace contextRef="#ctx0" brushRef="#br0" timeOffset="12012.91">1151 3188 24575,'0'4'0,"0"6"0,0 5 0,0 3 0,0 4 0,0 2 0,0 1 0,0 0 0,4-4 0,1-2 0,1 0 0,-2-3-8191</inkml:trace>
+  <inkml:trace contextRef="#ctx0" brushRef="#br0" timeOffset="12413.65">1200 3906 24575,'0'4'0,"0"6"0,0 4 0,0 5 0,0 3 0,0 2 0,0 0 0,0-3-8191</inkml:trace>
+  <inkml:trace contextRef="#ctx0" brushRef="#br0" timeOffset="12723.69">1151 4433 24575,'0'0'-8191</inkml:trace>
+  <inkml:trace contextRef="#ctx0" brushRef="#br0" timeOffset="14776.38">2613 0 24575,'2'77'0,"-4"87"0,-10-99 94,0 13-1553,12-58-5367</inkml:trace>
+  <inkml:trace contextRef="#ctx0" brushRef="#br0" timeOffset="15117.46">2422 1079 24575,'0'4'0,"0"5"0,0 6 0,0 4 0,0 2 0,0 3 0,0 1 0,0-4-8191</inkml:trace>
+  <inkml:trace contextRef="#ctx0" brushRef="#br0" timeOffset="15396.41">2421 1749 24575,'0'4'0,"0"5"0,0 6 0,0 4 0,0 3 0,0 1 0,0 2 0,0 0 0,0 0 0,0 0 0,0-1 0,0 0 0,0 1 0,-4-5 0,-1-2 0,-1 1 0,2-3-8191</inkml:trace>
+  <inkml:trace contextRef="#ctx0" brushRef="#br0" timeOffset="15628.78">2374 2756 24575,'0'4'0,"0"6"0,0 4 0,0 5 0,0 3 0,0 1 0,0 2 0,0 0 0,0 0 0,0-4-8191</inkml:trace>
+  <inkml:trace contextRef="#ctx0" brushRef="#br0" timeOffset="15798.13">2374 3308 24575,'0'4'0,"0"5"0,0 6 0,0 3 0,0 4 0,0 2 0,0-4-8191</inkml:trace>
+  <inkml:trace contextRef="#ctx0" brushRef="#br0" timeOffset="15952.39">2374 3786 24575,'19'50'0,"-13"1"6,-3 1 0,-5 98-1,0-45-1387,2-85-5444</inkml:trace>
+  <inkml:trace contextRef="#ctx0" brushRef="#br0" timeOffset="17122.61">3740 121 24575,'0'4'0,"0"5"0,0 6 0,0 3 0,0 4 0,0-2-8191</inkml:trace>
+  <inkml:trace contextRef="#ctx0" brushRef="#br0" timeOffset="17492.23">3716 1509 24575,'0'4'0,"0"5"0,0 6 0,0 4 0,0 3 0,0 2 0,-4-4 0,-2 0 0,1-1 0,1-2-8191</inkml:trace>
+  <inkml:trace contextRef="#ctx0" brushRef="#br0" timeOffset="18292.94">3691 718 24575,'0'4'0,"0"6"0,0 5 0,0 3 0,0 4 0,0 2 0,0 0 0,0 1 0,0 0 0,0 0 0,0-4-8191</inkml:trace>
+  <inkml:trace contextRef="#ctx0" brushRef="#br0" timeOffset="18879.06">3691 1654 24575,'0'4'0,"0"5"0,0 6 0,0 4 0,0 3 0,0 1 0,0 2 0,0 0 0,0 0 0,0 0 0,0-1 0,0 1 0,0-5-8191</inkml:trace>
+  <inkml:trace contextRef="#ctx0" brushRef="#br0" timeOffset="19202.95">3691 2229 24575,'0'4'0,"0"5"0,0 6 0,0 4 0,0 3 0,0 1 0,0 2 0,0 0 0,0 0 0,0 0 0,0-1 0,0-3-8191</inkml:trace>
+  <inkml:trace contextRef="#ctx0" brushRef="#br0" timeOffset="19387.3">3667 2756 24575,'0'4'0,"0"6"0,0 4 0,0 5 0,0 3 0,0 1 0,0 2 0,0 0 0,0-4-8191</inkml:trace>
+  <inkml:trace contextRef="#ctx0" brushRef="#br0" timeOffset="19573.27">3667 3211 24575,'0'4'0,"0"5"0,0 6 0,0 3 0,0 4 0,0 2 0,0 1 0,0-1 0,0 1 0,0 0 0,0-4-8191</inkml:trace>
+  <inkml:trace contextRef="#ctx0" brushRef="#br0" timeOffset="19818.94">3667 3620 24575,'0'4'0,"0"6"0,4 0 0,2 4 0,-1 2 0,-1 3 0,-1 3 0,-1 1 0,-1 1 0,-1 1 0,0-5-8191</inkml:trace>
+  <inkml:trace contextRef="#ctx0" brushRef="#br0" timeOffset="19911.3">3691 3905 24575,'0'0'-8191</inkml:trace>
+  <inkml:trace contextRef="#ctx0" brushRef="#br0" timeOffset="20850.33">5010 143 24575,'0'4'0,"0"6"0,0 5 0,0 3 0,0 4 0,0 2 0,0 0 0,0 1 0,0 0 0,0 0 0,0 0 0,0-5-8191</inkml:trace>
+  <inkml:trace contextRef="#ctx0" brushRef="#br0" timeOffset="21050.48">4962 791 24575,'0'4'0,"0"5"0,0 5 0,-4 1 0,-2 1 0,1 3 0,1 1 0,1 2 0,-3-2 0,0-6-8191</inkml:trace>
+  <inkml:trace contextRef="#ctx0" brushRef="#br0" timeOffset="27553.81">4866 1820 24575,'0'4'0,"0"6"0,4 1 0,1 2 0,1 4 0,-2 2 0,-1 3 0,-1 1 0,-1 1 0,-1 0 0,0 1 0,0 0 0,0-5-8191</inkml:trace>
+  <inkml:trace contextRef="#ctx0" brushRef="#br0" timeOffset="27817.4">4866 2492 24575,'0'5'0,"0"4"0,0 6 0,0 4 0,0 2 0,0 3 0,0 0 0,0-3-8191</inkml:trace>
+  <inkml:trace contextRef="#ctx0" brushRef="#br0" timeOffset="28048.97">4842 3116 24575,'0'4'0,"0"5"0,-4 2 0,-1 2 0,0 4 0,1 2 0,1 3 0,1 1 0,1-3-8191</inkml:trace>
+  <inkml:trace contextRef="#ctx0" brushRef="#br0" timeOffset="28187.65">4818 3522 24575,'0'4'0,"0"6"0,4 0 0,1 4 0,0 2 0,3 0 0,0 0 0,-1 2 0,-2-2-8191</inkml:trace>
+  <inkml:trace contextRef="#ctx0" brushRef="#br0" timeOffset="28357.03">4866 3833 24575,'0'4'0,"0"5"0,0 6 0,0 4 0,0 2 0,0 3 0,0 0 0,0 1 0,0 0 0,0 0 0,0-4-8191</inkml:trace>
+  <inkml:trace contextRef="#ctx0" brushRef="#br0" timeOffset="29374.3">6184 1031 24575,'0'4'0,"0"5"0,0 6 0,0 4 0,0 3 0,0-3-8191</inkml:trace>
+  <inkml:trace contextRef="#ctx0" brushRef="#br0" timeOffset="30390.88">6232 3283 24575,'4'0'0,"2"4"0,-1 6 0,-1 5 0,-1 3 0,-1 4 0,-1 2 0,-1 0 0,0-3-8191</inkml:trace>
+  <inkml:trace contextRef="#ctx0" brushRef="#br0" timeOffset="30561.01">6303 3739 24575,'0'4'0,"0"5"0,0 6 0,0 4 0,0 2 0,0 3 0,0-3-8191</inkml:trace>
+  <inkml:trace contextRef="#ctx0" brushRef="#br0" timeOffset="30730.15">6303 4098 24575,'0'4'0,"4"1"0,1 5 0,0 3 0,-1 5 0,-1 3 0,-1 2 0,-1-3-8191</inkml:trace>
+  <inkml:trace contextRef="#ctx0" brushRef="#br0" timeOffset="29621.01">6039 1725 24575,'0'4'0,"0"6"0,0 5 0,0 4 0,0 3 0,0 1 0,0 2 0,0 0 0,0 0 0,-4-4 0,-1-2 0,-1 0 0,2-3-8191</inkml:trace>
+  <inkml:trace contextRef="#ctx0" brushRef="#br0" timeOffset="31576.46">6135 2060 24575,'0'-4'0,"0"-5"0,0-6 0,0-4 0,0-3 0,0-1 0,0 2-8191</inkml:trace>
+  <inkml:trace contextRef="#ctx0" brushRef="#br0" timeOffset="30158.82">6135 2732 24575,'0'0'-8191</inkml:trace>
+  <inkml:trace contextRef="#ctx0" brushRef="#br0" timeOffset="31191.94">6087 2900 24575,'0'-4'0,"0"-6"0,0-4 0,0-5 0,0-3 0,0-2 0,0 0 0,0-1 0,0 0 0,0 0 0,4 4 0,2 2 0,-1 0 0,-1-1 0,-1 4-8191</inkml:trace>
+  <inkml:trace contextRef="#ctx0" brushRef="#br0" timeOffset="65622.34">73 2732 24575,'14'1'0,"-1"1"0,1 0 0,-1 1 0,1 0 0,-1 1 0,0 0 0,0 1 0,12 7 0,37 13 0,26-1 0,-53-15 0,55 20 0,-75-23 0,1-1 0,1-1 0,-1-1 0,0 0 0,34 1 0,-7-3 0,48-7 0,-80 4 0,1-1 0,-1 0 0,-1 0 0,1-1 0,0 0 0,18-12 0,-19 11 0,0-1 0,1 1 0,0 1 0,0 0 0,0 0 0,0 1 0,12-1 0,-18 3 0,11-1 0,2 0 0,-1 1 0,0 0 0,0 2 0,0 0 0,0 1 0,0 1 0,23 6 0,-35-6 0,0 0 0,0 1 0,-1 0 0,1-1 0,-1 2 0,0-1 0,-1 0 0,1 1 0,0 0 0,-1 0 0,0 0 0,-1 0 0,1 0 0,-1 1 0,3 8 0,0 1 0,-1 0 0,0 1 0,-1-1 0,1 26 0,-2 385 0,-4-204 0,1-219 0,1 0 0,0 0 0,0 0 0,0 0 0,1 0 0,-1 0 0,1-1 0,-1 1 0,1 0 0,0 0 0,0 0 0,0-1 0,1 1 0,-1-1 0,1 1 0,-1-1 0,1 1 0,0-1 0,0 0 0,0 0 0,3 3 0,0-2 0,0-1 0,0 0 0,0-1 0,0 1 0,0-1 0,0 0 0,1 0 0,-1 0 0,0-1 0,0 0 0,8 0 0,5 0 0,1 0 0,-1-1 0,1-1 0,-1-1 0,0-1 0,0 0 0,0-1 0,25-12 0,-32 13 0,0 1 0,1-1 0,-1 2 0,1-1 0,16 0 0,-16 2 0,-1 0 0,0-1 0,1 0 0,-1-1 0,0 0 0,11-6 0,-7 1 0,0 1 0,0 0 0,0 1 0,1 1 0,0 0 0,0 2 0,1-1 0,-1 2 0,33-1 0,37 5 0,92-3 0,-107-10 0,-49 6 0,1 2 0,29-2 0,-45 6 0,0-1 0,0-1 0,0 1 0,1-1 0,-1 0 0,0-1 0,12-3 0,-17 3 0,0 1 0,1-1 0,-1 0 0,0 0 0,0 1 0,0-1 0,-1 0 0,1-1 0,0 1 0,-1 0 0,0 0 0,1-1 0,-1 1 0,0-1 0,0 1 0,0-1 0,0 1 0,-1-1 0,1 0 0,-1 1 0,0-1 0,1 0 0,-2-4 0,1-234 0,-4 94 0,3 54 0,3-101 0,-2 192 0,1-1 0,-1 1 0,1-1 0,0 1 0,0-1 0,0 1 0,0 0 0,0-1 0,1 1 0,-1 0 0,1 0 0,-1 0 0,1 0 0,0 0 0,0 0 0,-1 0 0,1 1 0,1-1 0,-1 1 0,0-1 0,0 1 0,0 0 0,1 0 0,-1 0 0,1 0 0,-1 1 0,1-1 0,-1 0 0,1 1 0,4-1 0,11 0 0,0 0 0,0 1 0,28 4 0,-13-2 0,59 11 0,-69-8 0,0-2 0,31 2 0,37-6 0,-34 0 0,0 1 0,98 15 0,22 10 0,-146-20 0,0-1 0,0-2 0,0-1 0,38-4 0,64 4 0,-128-1 0,0 1 0,-1-1 0,1 1 0,0 1 0,-1-1 0,1 1 0,-1-1 0,0 1 0,1 1 0,-1-1 0,0 0 0,0 1 0,0 0 0,-1 0 0,1 0 0,-1 1 0,1-1 0,-1 1 0,0 0 0,0 0 0,-1 0 0,1 0 0,-1 0 0,2 5 0,2 7 0,-1 0 0,-1 0 0,0 1 0,-2 0 0,2 22 0,-1-27 0,-1-1 0,1 1 0,1 0 0,0-1 0,1 0 0,8 16 0,-7-17 0,0 1 0,-1 1 0,-1-1 0,0 1 0,-1 0 0,4 18 0,-5 196 0,-4-117 0,2-102 0,-1 0 0,0 0 0,0-1 0,0 1 0,-1 0 0,-5 9 0,-2 14 0,9-29 0,0 0 0,1-1 0,-1 1 0,0 0 0,1 0 0,-1-1 0,1 1 0,-1-1 0,1 1 0,-1 0 0,1-1 0,0 1 0,-1-1 0,1 1 0,0-1 0,-1 0 0,1 1 0,0-1 0,-1 0 0,1 1 0,0-1 0,0 0 0,-1 0 0,1 0 0,0 1 0,0-1 0,0 0 0,-1 0 0,1 0 0,0-1 0,0 1 0,0 0 0,1 0 0,36-1 0,-33 1 0,615-4 0,-371 5 0,-244-1 0,1 0 0,-1 0 0,0-1 0,1 1 0,-1-1 0,0 0 0,0-1 0,0 0 0,0 1 0,8-5 0,-10 4 0,-1 0 0,1 0 0,-1 0 0,0 0 0,0-1 0,0 1 0,0 0 0,0-1 0,0 0 0,-1 1 0,1-1 0,-1 0 0,0 0 0,0 0 0,0 0 0,0 0 0,0 0 0,-1 0 0,1-5 0,8-63 0,-3 27 0,1-58 0,-8-355 0,1 454 0,0 0 0,0 1 0,0-1 0,0 0 0,0 0 0,1 0 0,-1 0 0,1 0 0,0 0 0,0 0 0,0 1 0,0-1 0,0 0 0,1 1 0,-1-1 0,1 1 0,0-1 0,0 1 0,0 0 0,0 0 0,3-3 0,-1 3 0,1 0 0,0 0 0,0 0 0,0 0 0,0 1 0,0 0 0,0 0 0,0 0 0,0 1 0,1 0 0,7 0 0,23 2 0,58 11 0,-59-7 0,67 3 0,-25-11 0,86 3 0,-99 11 0,-46-8 0,-1-1 0,28 3 0,58 5 0,-71-5 0,49 0 0,69 7 0,12-1 0,-112-13 0,67 2 0,-89 7 0,-28-8 0,1 0 0,-1 1 0,1-1 0,-1 1 0,1-1 0,-1 1 0,0-1 0,1 1 0,-1-1 0,0 1 0,1-1 0,-1 1 0,0-1 0,0 1 0,0 0 0,1-1 0,-1 1 0,0-1 0,0 1 0,0 0 0,0-1 0,0 1 0,0 0 0,0-1 0,-1 2 0,0 2 0,-2 1 0,1 0 0,0-1 0,-1 0 0,0 1 0,0-1 0,-6 6 0,-16 25 0,20-13 0,1 0 0,1 0 0,2 0 0,0 0 0,0 1 0,6 32 0,-2 18 0,-2-47 0,2 1 0,0-1 0,2 0 0,1 0 0,10 26 0,-11-35 0,-1 2 0,-1 1 0,-1-1 0,0 1 0,-2-1 0,-1 27 0,1 41 0,0-84 0,1 1 0,0-1 0,1 0 0,-1 1 0,0-1 0,1 0 0,-1 0 0,1 0 0,0 0 0,0-1 0,1 1 0,-1 0 0,0-1 0,1 0 0,-1 1 0,1-1 0,0 0 0,0 0 0,0-1 0,0 1 0,0 0 0,0-1 0,0 0 0,1 0 0,-1 0 0,0 0 0,1 0 0,3-1 0,15 4 0,-1-1 0,0-2 0,27 0 0,-41-1 0,34 2 0,50 8 0,-50-5 0,51 2 0,-40-7 0,-14 1 0,0-1 0,0-2 0,69-13 0,131-58 0,-212 68-18,0 1-1,0 2 0,1 1 0,43 3 1,-15-1-1254,-34 0-5554</inkml:trace>
 </inkml:ink>
 </file>
 
@@ -5739,7 +5855,7 @@
           <inkml:channelProperty channel="F" name="resolution" value="0" units="1/dev"/>
         </inkml:channelProperties>
       </inkml:inkSource>
-      <inkml:timestamp xml:id="ts0" timeString="2025-09-14T18:06:24.378"/>
+      <inkml:timestamp xml:id="ts0" timeString="2025-09-21T12:26:07.727"/>
     </inkml:context>
     <inkml:brush xml:id="br0">
       <inkml:brushProperty name="width" value="0.035" units="cm"/>
@@ -5747,7 +5863,63 @@
       <inkml:brushProperty name="color" value="#E71224"/>
     </inkml:brush>
   </inkml:definitions>
-  <inkml:trace contextRef="#ctx0" brushRef="#br0">0 907 24575,'1140'0'0,"-1136"1"0,0-1 0,0 1 0,0-1 0,0-1 0,0 1 0,0-1 0,1 1 0,-1-1 0,0 0 0,0 0 0,-1-1 0,1 1 0,0-1 0,0 0 0,-1 0 0,1 0 0,-1-1 0,0 1 0,1-1 0,-1 0 0,0 0 0,-1 0 0,1 0 0,0 0 0,-1-1 0,0 1 0,0-1 0,0 1 0,0-1 0,0 0 0,-1 0 0,0 0 0,0 0 0,0 0 0,0 0 0,0 0 0,-1 0 0,0 0 0,0-7 0,-1-235 0,-3 90 0,2 44 0,5-119 0,-3 228 0,1 0 0,0 1 0,-1-1 0,1 0 0,0 1 0,0-1 0,1 0 0,-1 1 0,1-1 0,-1 1 0,1 0 0,0-1 0,-1 1 0,1 0 0,0 0 0,1 0 0,-1 1 0,0-1 0,0 0 0,1 1 0,-1-1 0,1 1 0,0 0 0,-1 0 0,1 0 0,0 0 0,-1 1 0,1-1 0,0 0 0,5 1 0,12-2 0,0 1 0,0 1 0,31 4 0,-15-1 0,149-4 0,80 4 0,-193 10 0,-53-9 0,1 0 0,28 1 0,105-7 0,64 4 0,-214-1 0,0-1 0,0 1 0,-1 0 0,1-1 0,0 2 0,-1-1 0,1 0 0,0 0 0,-1 1 0,0-1 0,1 1 0,-1 0 0,0 0 0,0 0 0,0 0 0,0 0 0,0 0 0,0 0 0,-1 1 0,1-1 0,-1 1 0,0-1 0,1 1 0,-1 0 0,0-1 0,-1 1 0,1 0 0,0 0 0,-1-1 0,1 7 0,0 10 0,0 1 0,-1 0 0,-4 31 0,2-15 0,1-8 0,0 7 0,-1 0 0,-12 64 0,7-53 0,2 0 0,2 0 0,1 0 0,6 50 0,-1 11 0,-3-103 0,0 0 0,0 1 0,0-1 0,1 0 0,0 1 0,0-1 0,0 0 0,0 0 0,0 0 0,1 0 0,0 0 0,0 0 0,0 0 0,0 0 0,1-1 0,-1 1 0,1-1 0,0 0 0,0 0 0,0 0 0,0 0 0,1 0 0,-1-1 0,1 1 0,0-1 0,0 0 0,-1 0 0,1-1 0,1 1 0,-1-1 0,0 0 0,0 0 0,0 0 0,1 0 0,-1-1 0,0 0 0,6 0 0,283 1 0,-135-4 0,504 3 0,-659 1 0,0-1 0,0 0 0,1 0 0,-1 0 0,0-1 0,0 1 0,0-1 0,1 0 0,-1 0 0,0 0 0,0 0 0,0 0 0,0-1 0,-1 1 0,1-1 0,0 0 0,0 0 0,-1 0 0,0 0 0,1 0 0,2-4 0,-2 1 0,-1 0 0,0-1 0,0 1 0,0-1 0,-1 1 0,1-1 0,-2 0 0,1 0 0,0 1 0,-1-1 0,-1-8 0,-4-626 0,5 636 0,0 1 0,0 0 0,0 0 0,0-1 0,0 1 0,1 0 0,-1 0 0,1-1 0,0 1 0,0 0 0,0 0 0,1 0 0,-1 0 0,1 0 0,0 0 0,-1 1 0,1-1 0,0 1 0,1-1 0,-1 1 0,3-3 0,1 2 0,-1 1 0,0 0 0,1 0 0,-1 0 0,1 0 0,-1 1 0,1 0 0,0 0 0,-1 1 0,1 0 0,9 0 0,704 5 0,-699-3 0,-1 0 0,37 8 0,-35-5 0,0-1 0,27 1 0,-28-5 0,-9 0 0,-1 0 0,1 1 0,0 0 0,-1 1 0,1 0 0,12 4 0,-20-5 0,0 1 0,0-1 0,0 1 0,0 0 0,0 0 0,0 0 0,-1 1 0,1-1 0,-1 1 0,1 0 0,-1-1 0,0 1 0,0 0 0,0 0 0,0 0 0,-1 1 0,1-1 0,-1 0 0,0 0 0,0 1 0,0-1 0,0 1 0,0 4 0,8 46 0,-2-18 0,-1 0 0,0 48 0,-4-63 0,0 1 0,7 30 0,4 39 0,-15 71 0,4 72 0,-2-232 0,0 0 0,-1 0 0,1 0 0,1 0 0,-1-1 0,0 1 0,0 0 0,1 0 0,-1 0 0,1 0 0,-1 0 0,1-1 0,0 1 0,0 0 0,0-1 0,0 1 0,0-1 0,0 1 0,0-1 0,1 1 0,-1-1 0,0 0 0,1 1 0,-1-1 0,1 0 0,0 0 0,-1 0 0,1 0 0,0 0 0,-1-1 0,1 1 0,0-1 0,0 1 0,0-1 0,0 1 0,-1-1 0,1 0 0,0 0 0,0 0 0,0 0 0,0 0 0,0 0 0,0-1 0,0 1 0,-1-1 0,1 1 0,2-2 0,9-3 0,0-1 0,0 0 0,0-1 0,22-16 0,-30 19 0,4 0 0,-1 0 0,0 0 0,1 1 0,-1 0 0,1 1 0,0 0 0,0 0 0,0 1 0,0 0 0,16 1 0,43-8 0,15-14 0,89-19 0,-74 33 0,-70 7 0,1-1 0,33-8 0,-43 6 0,23-6 0,0 1 0,0 3 0,66-3 0,-84 8 0,0-2 0,41-9 0,-18 3 0,-44 8 0,1 1 0,-1-1 0,1-1 0,-1 1 0,0 0 0,1-1 0,-1 0 0,0 0 0,0 0 0,0 0 0,-1 0 0,1-1 0,0 1 0,-1-1 0,1 1 0,-1-1 0,0 0 0,0 0 0,0 0 0,-1-1 0,1 1 0,-1 0 0,1 0 0,0-4 0,3-11 0,-1 0 0,-1 0 0,2-32 0,3-14 0,8-42 0,-1 5 0,-11 76 0,0 0 0,-2 0 0,-2-40 0,1-22 0,0 84 0,-1 1 0,1-1 0,0 0 0,-1 0 0,1 1 0,0-1 0,1 1 0,-1-1 0,0 1 0,1-1 0,0 1 0,-1 0 0,1-1 0,0 1 0,0 0 0,0 0 0,0 0 0,1 1 0,-1-1 0,0 1 0,1-1 0,-1 1 0,1 0 0,-1 0 0,1 0 0,0 0 0,0 0 0,-1 0 0,1 1 0,0-1 0,3 1 0,14-2 0,-1 1 0,0 1 0,33 4 0,-15-1 0,492 0 0,-290-5 0,-233 2 0,-1 0 0,1 1 0,-1-1 0,0 1 0,1 0 0,-1 0 0,0 1 0,0-1 0,0 1 0,0 0 0,0 1 0,0-1 0,0 1 0,-1 0 0,1 0 0,-1 1 0,5 4 0,-5-3 0,0 1 0,0-1 0,0 1 0,-1 0 0,0 0 0,0 0 0,-1 0 0,1 1 0,-2-1 0,1 1 0,-1-1 0,1 1 0,-1 11 0,1 60 0,-2-50 0,1 0 0,2 0 0,6 33 0,-4-27 0,-1 0 0,-1 1 0,-2-1 0,-4 40 0,1-25 0,5 50 0,-3-90 0,1 0 0,1 0 0,0 0 0,0 0 0,0 0 0,1 0 0,1-1 0,6 13 0,-8-18 0,0 1 0,1-1 0,-1 0 0,1 0 0,0 0 0,0-1 0,0 1 0,0-1 0,1 0 0,-1 0 0,1 0 0,-1 0 0,1 0 0,0-1 0,0 1 0,-1-1 0,1 0 0,0-1 0,0 1 0,0 0 0,5-1 0,259 0 0,-110-4 0,176 4 0,-321 1 0,0 1 0,1 0 0,21 6 0,32 5 0,-42-12-1365,-3 0-5461</inkml:trace>
+  <inkml:trace contextRef="#ctx0" brushRef="#br0">0 839 23955,'0'-838'0</inkml:trace>
+</inkml:ink>
+</file>
+
+<file path=word/ink/ink3.xml><?xml version="1.0" encoding="utf-8"?>
+<inkml:ink xmlns:inkml="http://www.w3.org/2003/InkML">
+  <inkml:definitions>
+    <inkml:context xml:id="ctx0">
+      <inkml:inkSource xml:id="inkSrc0">
+        <inkml:traceFormat>
+          <inkml:channel name="X" type="integer" min="-2.14748E9" max="2.14748E9" units="cm"/>
+          <inkml:channel name="Y" type="integer" min="-2.14748E9" max="2.14748E9" units="cm"/>
+          <inkml:channel name="F" type="integer" max="32767" units="dev"/>
+        </inkml:traceFormat>
+        <inkml:channelProperties>
+          <inkml:channelProperty channel="X" name="resolution" value="1000" units="1/cm"/>
+          <inkml:channelProperty channel="Y" name="resolution" value="1000" units="1/cm"/>
+          <inkml:channelProperty channel="F" name="resolution" value="0" units="1/dev"/>
+        </inkml:channelProperties>
+      </inkml:inkSource>
+      <inkml:timestamp xml:id="ts0" timeString="2025-09-21T12:26:01.646"/>
+    </inkml:context>
+    <inkml:brush xml:id="br0">
+      <inkml:brushProperty name="width" value="0.035" units="cm"/>
+      <inkml:brushProperty name="height" value="0.035" units="cm"/>
+      <inkml:brushProperty name="color" value="#E71224"/>
+    </inkml:brush>
+  </inkml:definitions>
+  <inkml:trace contextRef="#ctx0" brushRef="#br0">1 96 24575,'53'0'0,"0"4"0,62 11 0,-93-12 0,0-1 0,0 0 0,0-2 0,1 0 0,-1-2 0,0 0 0,0-2 0,-1 0 0,1-1 0,32-13 0,-38 13 0,1 1 0,0 0 0,0 1 0,0 1 0,29 1 0,-23 0 0,0-1 0,35-6 0,-17 1 0,1 3 0,0 1 0,0 2 0,45 4 0,9 0 0,-20-2 0,87-3 0,-42-20 0,-109 20-273,0 1 0,0-1 0,0-1 0,19-6 0,-15 1-6553</inkml:trace>
+</inkml:ink>
+</file>
+
+<file path=word/ink/ink4.xml><?xml version="1.0" encoding="utf-8"?>
+<inkml:ink xmlns:inkml="http://www.w3.org/2003/InkML">
+  <inkml:definitions>
+    <inkml:context xml:id="ctx0">
+      <inkml:inkSource xml:id="inkSrc0">
+        <inkml:traceFormat>
+          <inkml:channel name="X" type="integer" min="-2.14748E9" max="2.14748E9" units="cm"/>
+          <inkml:channel name="Y" type="integer" min="-2.14748E9" max="2.14748E9" units="cm"/>
+          <inkml:channel name="F" type="integer" max="32767" units="dev"/>
+        </inkml:traceFormat>
+        <inkml:channelProperties>
+          <inkml:channelProperty channel="X" name="resolution" value="1000" units="1/cm"/>
+          <inkml:channelProperty channel="Y" name="resolution" value="1000" units="1/cm"/>
+          <inkml:channelProperty channel="F" name="resolution" value="0" units="1/dev"/>
+        </inkml:channelProperties>
+      </inkml:inkSource>
+      <inkml:timestamp xml:id="ts0" timeString="2025-09-21T12:24:35.586"/>
+    </inkml:context>
+    <inkml:brush xml:id="br0">
+      <inkml:brushProperty name="width" value="0.035" units="cm"/>
+      <inkml:brushProperty name="height" value="0.035" units="cm"/>
+      <inkml:brushProperty name="color" value="#E71224"/>
+    </inkml:brush>
+  </inkml:definitions>
+  <inkml:trace contextRef="#ctx0" brushRef="#br0">1 798 24575,'5'4'0,"0"0"0,0 0 0,1-1 0,-1 1 0,1-1 0,0-1 0,0 1 0,0-1 0,10 2 0,59 10 0,-7-9 0,-44-5 0,1 2 0,0 1 0,-1 1 0,32 9 0,-24-2 0,1-1 0,1-2 0,-1-1 0,1-2 0,60 2 0,-68-6 0,0 2 0,-1 1 0,45 12 0,-42-9 0,-1-1 0,1-1 0,30 1 0,47 5 0,-73-6 0,47 2 0,28-5 0,169-6 0,-274 4 0,1-1 0,0 1 0,-1-1 0,1 0 0,-1 0 0,1-1 0,-1 1 0,0 0 0,1-1 0,-1 1 0,0-1 0,0 0 0,0 0 0,0 0 0,0 0 0,0 0 0,-1 0 0,1 0 0,-1-1 0,0 1 0,1 0 0,-1-1 0,0 0 0,0 1 0,0-4 0,4-10 0,-2 0 0,0 0 0,2-19 0,-4 19 0,5-15 0,14-48 0,-13 57 0,-1 0 0,-1-1 0,-1 0 0,1-36 0,-5 31 0,0 0 0,2 0 0,9-43 0,14-72 0,-21 119 0,-1 0 0,-1 0 0,-2-44 0,1-22 0,-1 88 0,0 0 0,0-1 0,1 1 0,-1 0 0,1 0 0,0 0 0,-1 0 0,1 0 0,0 0 0,0 0 0,1 0 0,-1 0 0,0 0 0,0 0 0,1 0 0,0 1 0,-1-1 0,1 1 0,0-1 0,-1 1 0,1 0 0,4-3 0,-1 2 0,0 1 0,0-1 0,0 1 0,1-1 0,-1 2 0,0-1 0,1 0 0,-1 1 0,8 1 0,4 0 0,-1 2 0,1 0 0,-1 0 0,0 2 0,24 9 0,-24-8 0,1-1 0,0 0 0,1-2 0,-1 0 0,1 0 0,-1-2 0,33-1 0,-25 0 0,0 1 0,47 7 0,-35-2 0,1-2 0,-1-1 0,52-3 0,45 3 0,-69 8 0,14 1 0,12 0 0,-67-7 0,1-1 0,26 0 0,-31-4 0,10 0 0,-1 1 0,0 1 0,41 8 0,-42-5 0,1-1 0,-1-2 0,41-1 0,-41-2 0,0 2 0,0 1 0,46 8 0,-34-3 0,0-2 0,0-2 0,1-2 0,51-4 0,5 0 0,-51 2 0,0-2 0,59-12 0,-50 9 0,0 2 0,101 6 0,-44 1 0,-20-5 0,103 4 0,-115 10 0,-51-7 0,54 3 0,492-9 0,-556 2 0,-1 1 0,31 7 0,33 3 0,647-10 0,-356-4 0,-353 1 0,13 1 0,0 1 0,-1 1 0,51 10 0,-51-7 0,1-1 0,-1-2 0,1 0 0,42-6 0,-29 2 0,53 5 0,-28 9 0,-50-8 0,0 0 0,33 0 0,85 8 0,11 0 0,-117-13 0,-20 0 0,-1 0 0,1 1 0,-1 1 0,0 0 0,19 4 0,-28-4 0,1 0 0,-1 1 0,0-1 0,1 1 0,-1 0 0,0 0 0,0 0 0,0 0 0,0 0 0,-1 1 0,1-1 0,-1 1 0,1 0 0,-1 0 0,0 0 0,0 0 0,0 0 0,0 0 0,-1 0 0,1 1 0,-1-1 0,0 0 0,1 6 0,8 40 0,-1 0 0,-3 2 0,-3-1 0,-2 66 0,-3-7 0,5 141 0,-3-246 0,1-1 0,-1 1 0,1-1 0,0 0 0,1 1 0,-1-1 0,1 0 0,-1 0 0,1 0 0,0 0 0,0 0 0,0 0 0,1 0 0,-1-1 0,0 1 0,1-1 0,0 1 0,0-1 0,0 0 0,0 0 0,0-1 0,0 1 0,5 1 0,9 4 0,0-2 0,1 0 0,28 4 0,9 3 0,-23-5 0,1-1 0,-1-2 0,1-1 0,0-2 0,59-5 0,-1 1 0,-8 5 0,-49 1 0,-1-2 0,1-2 0,0-1 0,0-1 0,48-12 0,-66 10 0,3-2 0,1 1 0,0 1 0,0 1 0,0 1 0,33-1 0,-29 2 0,-1 0 0,26-6 0,-25 4 0,47-3 0,1 7-1365,-51 0-5461</inkml:trace>
 </inkml:ink>
 </file>
 

</xml_diff>